<commit_message>
worked on draft, final changes in code
</commit_message>
<xml_diff>
--- a/manuscript/Entwurf_Bericht.docx
+++ b/manuscript/Entwurf_Bericht.docx
@@ -842,16 +842,7 @@
           <w:szCs w:val="22"/>
         </w:rPr>
         <w:lastRenderedPageBreak/>
-        <w:t xml:space="preserve">seperation of </w:t>
-      </w:r>
-      <w:r>
-        <w:rPr>
-          <w:rFonts w:ascii="Lucida Sans Unicode" w:hAnsi="Lucida Sans Unicode" w:cs="Lucida Sans Unicode"/>
-          <w:color w:val="000000" w:themeColor="text1"/>
-          <w:sz w:val="22"/>
-          <w:szCs w:val="22"/>
-        </w:rPr>
-        <w:t xml:space="preserve">of a person’s identity into </w:t>
+        <w:t xml:space="preserve">seperation of of a person’s identity into </w:t>
       </w:r>
       <w:r>
         <w:rPr>
@@ -1339,15 +1330,7 @@
           <w:sz w:val="22"/>
           <w:szCs w:val="22"/>
         </w:rPr>
-        <w:t>i</w:t>
-      </w:r>
-      <w:r>
-        <w:rPr>
-          <w:rFonts w:ascii="Lucida Sans Unicode" w:hAnsi="Lucida Sans Unicode" w:cs="Lucida Sans Unicode"/>
-          <w:sz w:val="22"/>
-          <w:szCs w:val="22"/>
-        </w:rPr>
-        <w:t xml:space="preserve">nvisibility (B) </w:t>
+        <w:t xml:space="preserve">invisibility (B) </w:t>
       </w:r>
       <w:r>
         <w:rPr>
@@ -1570,16 +1553,7 @@
           <w:sz w:val="22"/>
           <w:szCs w:val="22"/>
         </w:rPr>
-        <w:t xml:space="preserve">r. Personality variables constitute an important group (Suler, 2004). As a representative expample with special relevance to our model, we incorporated the Measure of Online Disinhibition. </w:t>
-      </w:r>
-      <w:r>
-        <w:rPr>
-          <w:rFonts w:ascii="Lucida Sans Unicode" w:hAnsi="Lucida Sans Unicode" w:cs="Lucida Sans Unicode"/>
-          <w:color w:val="000000" w:themeColor="text1"/>
-          <w:sz w:val="22"/>
-          <w:szCs w:val="22"/>
-        </w:rPr>
-        <w:t>This instrument allows “assessing self-perceptions of psychological and behavioral change in the online as compared to the offline environment” (</w:t>
+        <w:t>r. Personality variables constitute an important group (Suler, 2004). As a representative expample with special relevance to our model, we incorporated the Measure of Online Disinhibition. This instrument allows “assessing self-perceptions of psychological and behavioral change in the online as compared to the offline environment” (</w:t>
       </w:r>
       <w:r>
         <w:rPr>
@@ -1606,16 +1580,7 @@
           <w:sz w:val="22"/>
           <w:szCs w:val="22"/>
         </w:rPr>
-        <w:t>).</w:t>
-      </w:r>
-      <w:r>
-        <w:rPr>
-          <w:rFonts w:ascii="Lucida Sans Unicode" w:hAnsi="Lucida Sans Unicode" w:cs="Lucida Sans Unicode"/>
-          <w:color w:val="000000" w:themeColor="text1"/>
-          <w:sz w:val="22"/>
-          <w:szCs w:val="22"/>
-        </w:rPr>
-        <w:t xml:space="preserve"> Our illustration of differences in disinhibited behavior in online contexts with higher vs. lower anonymity and invisibility therefore includes a trait Online Disinihibition. </w:t>
+        <w:t xml:space="preserve">). Our illustration of differences in disinhibited behavior in online contexts with higher vs. lower anonymity and invisibility therefore includes a trait Online Disinihibition. </w:t>
       </w:r>
     </w:p>
     <w:p>
@@ -1859,7 +1824,11 @@
           <w:szCs w:val="22"/>
         </w:rPr>
       </w:pPr>
-      <w:r>
+    </w:p>
+    <w:p>
+      <w:pPr>
+        <w:spacing w:line="360" w:lineRule="auto"/>
+        <w:jc w:val="center"/>
         <w:rPr>
           <w:rFonts w:ascii="Lucida Sans Unicode" w:hAnsi="Lucida Sans Unicode" w:cs="Lucida Sans Unicode"/>
           <w:b/>
@@ -1867,9 +1836,12 @@
           <w:sz w:val="22"/>
           <w:szCs w:val="22"/>
         </w:rPr>
-        <w:t xml:space="preserve">Bening Disinhibition in </w:t>
-      </w:r>
-      <w:r>
+      </w:pPr>
+    </w:p>
+    <w:p>
+      <w:pPr>
+        <w:spacing w:line="360" w:lineRule="auto"/>
+        <w:jc w:val="center"/>
         <w:rPr>
           <w:rFonts w:ascii="Lucida Sans Unicode" w:hAnsi="Lucida Sans Unicode" w:cs="Lucida Sans Unicode"/>
           <w:b/>
@@ -1877,8 +1849,7 @@
           <w:sz w:val="22"/>
           <w:szCs w:val="22"/>
         </w:rPr>
-        <w:t>F</w:t>
-      </w:r>
+      </w:pPr>
       <w:r>
         <w:rPr>
           <w:rFonts w:ascii="Lucida Sans Unicode" w:hAnsi="Lucida Sans Unicode" w:cs="Lucida Sans Unicode"/>
@@ -1887,7 +1858,8 @@
           <w:sz w:val="22"/>
           <w:szCs w:val="22"/>
         </w:rPr>
-        <w:t>orm of Self-Disclosure</w:t>
+        <w:lastRenderedPageBreak/>
+        <w:t xml:space="preserve">Bening Disinhibition in </w:t>
       </w:r>
       <w:r>
         <w:rPr>
@@ -1897,6 +1869,26 @@
           <w:sz w:val="22"/>
           <w:szCs w:val="22"/>
         </w:rPr>
+        <w:t>F</w:t>
+      </w:r>
+      <w:r>
+        <w:rPr>
+          <w:rFonts w:ascii="Lucida Sans Unicode" w:hAnsi="Lucida Sans Unicode" w:cs="Lucida Sans Unicode"/>
+          <w:b/>
+          <w:bCs/>
+          <w:sz w:val="22"/>
+          <w:szCs w:val="22"/>
+        </w:rPr>
+        <w:t>orm of Self-Disclosure</w:t>
+      </w:r>
+      <w:r>
+        <w:rPr>
+          <w:rFonts w:ascii="Lucida Sans Unicode" w:hAnsi="Lucida Sans Unicode" w:cs="Lucida Sans Unicode"/>
+          <w:b/>
+          <w:bCs/>
+          <w:sz w:val="22"/>
+          <w:szCs w:val="22"/>
+        </w:rPr>
         <w:t>: Strength of Evidence</w:t>
       </w:r>
     </w:p>
@@ -1916,7 +1908,6 @@
           <w:sz w:val="22"/>
           <w:szCs w:val="22"/>
         </w:rPr>
-        <w:lastRenderedPageBreak/>
         <w:t xml:space="preserve">In 2019, Clark-Gordon et al conducted a meta-analysis (k =14) on the phenomenon of amplified self-disclosure as a result of higher anonymity. While invisibility was not explicitly conceptualized as separate predictor, </w:t>
       </w:r>
       <w:r>
@@ -2049,23 +2040,7 @@
           <w:sz w:val="22"/>
           <w:szCs w:val="22"/>
         </w:rPr>
-        <w:t>) of anonymity (</w:t>
-      </w:r>
-      <w:r>
-        <w:rPr>
-          <w:rFonts w:ascii="Lucida Sans Unicode" w:hAnsi="Lucida Sans Unicode" w:cs="Lucida Sans Unicode"/>
-          <w:sz w:val="22"/>
-          <w:szCs w:val="22"/>
-        </w:rPr>
-        <w:t>6 studies manipulating visual anonymity, 8 studies manipulating discursive anonymity</w:t>
-      </w:r>
-      <w:r>
-        <w:rPr>
-          <w:rFonts w:ascii="Lucida Sans Unicode" w:hAnsi="Lucida Sans Unicode" w:cs="Lucida Sans Unicode"/>
-          <w:sz w:val="22"/>
-          <w:szCs w:val="22"/>
-        </w:rPr>
-        <w:t>) on self-disclosure. Further, the conzeptualization of visual vs. discursive anonymity did not lead to statistically significant differences, which is in line with our theoretical assumptions</w:t>
+        <w:t>) of anonymity (6 studies manipulating visual anonymity, 8 studies manipulating discursive anonymity) on self-disclosure. Further, the conzeptualization of visual vs. discursive anonymity did not lead to statistically significant differences, which is in line with our theoretical assumptions</w:t>
       </w:r>
       <w:r>
         <w:rPr>
@@ -2129,7 +2104,10 @@
           <w:szCs w:val="22"/>
         </w:rPr>
       </w:pPr>
-      <w:r>
+    </w:p>
+    <w:p>
+      <w:pPr>
+        <w:spacing w:line="360" w:lineRule="auto"/>
         <w:rPr>
           <w:rFonts w:ascii="Lucida Sans Unicode" w:hAnsi="Lucida Sans Unicode" w:cs="Lucida Sans Unicode"/>
           <w:b/>
@@ -2137,102 +2115,123 @@
           <w:sz w:val="22"/>
           <w:szCs w:val="22"/>
         </w:rPr>
-        <w:t>UTOS Dimensions</w:t>
-      </w:r>
+      </w:pPr>
     </w:p>
     <w:p>
       <w:pPr>
         <w:spacing w:line="360" w:lineRule="auto"/>
-        <w:ind w:firstLine="709"/>
-        <w:rPr>
-          <w:rFonts w:ascii="Lucida Sans Unicode" w:hAnsi="Lucida Sans Unicode" w:cs="Lucida Sans Unicode"/>
-          <w:color w:val="000000" w:themeColor="text1"/>
-          <w:sz w:val="22"/>
-          <w:szCs w:val="22"/>
-        </w:rPr>
-      </w:pPr>
-      <w:r>
-        <w:rPr>
-          <w:rFonts w:ascii="Lucida Sans Unicode" w:hAnsi="Lucida Sans Unicode" w:cs="Lucida Sans Unicode"/>
-          <w:color w:val="000000" w:themeColor="text1"/>
-          <w:sz w:val="22"/>
-          <w:szCs w:val="22"/>
-        </w:rPr>
-        <w:t>In order to conduct a comprehensive evaluation of the phenomenon</w:t>
-      </w:r>
-      <w:r>
-        <w:rPr>
-          <w:rFonts w:ascii="Lucida Sans Unicode" w:hAnsi="Lucida Sans Unicode" w:cs="Lucida Sans Unicode"/>
-          <w:color w:val="000000" w:themeColor="text1"/>
-          <w:sz w:val="22"/>
-          <w:szCs w:val="22"/>
-        </w:rPr>
-        <w:t>’</w:t>
-      </w:r>
-      <w:r>
-        <w:rPr>
-          <w:rFonts w:ascii="Lucida Sans Unicode" w:hAnsi="Lucida Sans Unicode" w:cs="Lucida Sans Unicode"/>
-          <w:color w:val="000000" w:themeColor="text1"/>
-          <w:sz w:val="22"/>
-          <w:szCs w:val="22"/>
-        </w:rPr>
-        <w:t>s robustness, variabilty across UTOS dimensions (</w:t>
-      </w:r>
-      <w:r>
-        <w:rPr>
-          <w:rFonts w:ascii="Lucida Sans Unicode" w:hAnsi="Lucida Sans Unicode" w:cs="Lucida Sans Unicode"/>
-          <w:color w:val="000000" w:themeColor="text1"/>
-          <w:sz w:val="22"/>
-          <w:szCs w:val="22"/>
-        </w:rPr>
-        <w:t>Findley et al., 2021</w:t>
-      </w:r>
-      <w:r>
-        <w:rPr>
-          <w:rFonts w:ascii="Lucida Sans Unicode" w:hAnsi="Lucida Sans Unicode" w:cs="Lucida Sans Unicode"/>
-          <w:color w:val="000000" w:themeColor="text1"/>
-          <w:sz w:val="22"/>
-          <w:szCs w:val="22"/>
-        </w:rPr>
-        <w:t xml:space="preserve">) </w:t>
-      </w:r>
-      <w:r>
-        <w:rPr>
-          <w:rFonts w:ascii="Lucida Sans Unicode" w:hAnsi="Lucida Sans Unicode" w:cs="Lucida Sans Unicode"/>
-          <w:color w:val="000000" w:themeColor="text1"/>
-          <w:sz w:val="22"/>
-          <w:szCs w:val="22"/>
-        </w:rPr>
-        <w:t xml:space="preserve">is </w:t>
-      </w:r>
-      <w:r>
-        <w:rPr>
-          <w:rFonts w:ascii="Lucida Sans Unicode" w:hAnsi="Lucida Sans Unicode" w:cs="Lucida Sans Unicode"/>
-          <w:color w:val="000000" w:themeColor="text1"/>
-          <w:sz w:val="22"/>
-          <w:szCs w:val="22"/>
-        </w:rPr>
-        <w:t xml:space="preserve">examined </w:t>
+        <w:rPr>
+          <w:rFonts w:ascii="Lucida Sans Unicode" w:hAnsi="Lucida Sans Unicode" w:cs="Lucida Sans Unicode"/>
+          <w:b/>
+          <w:bCs/>
+          <w:sz w:val="22"/>
+          <w:szCs w:val="22"/>
+        </w:rPr>
+      </w:pPr>
+      <w:r>
+        <w:rPr>
+          <w:rFonts w:ascii="Lucida Sans Unicode" w:hAnsi="Lucida Sans Unicode" w:cs="Lucida Sans Unicode"/>
+          <w:b/>
+          <w:bCs/>
+          <w:sz w:val="22"/>
+          <w:szCs w:val="22"/>
+        </w:rPr>
+        <w:lastRenderedPageBreak/>
+        <w:t>UTOS Dimensions</w:t>
       </w:r>
     </w:p>
     <w:p>
       <w:pPr>
         <w:spacing w:line="360" w:lineRule="auto"/>
-        <w:rPr>
-          <w:rFonts w:ascii="Lucida Sans Unicode" w:hAnsi="Lucida Sans Unicode" w:cs="Lucida Sans Unicode"/>
-          <w:color w:val="000000" w:themeColor="text1"/>
-          <w:sz w:val="22"/>
-          <w:szCs w:val="22"/>
-        </w:rPr>
-      </w:pPr>
-      <w:r>
-        <w:rPr>
-          <w:rFonts w:ascii="Lucida Sans Unicode" w:hAnsi="Lucida Sans Unicode" w:cs="Lucida Sans Unicode"/>
-          <w:color w:val="000000" w:themeColor="text1"/>
-          <w:sz w:val="22"/>
-          <w:szCs w:val="22"/>
-        </w:rPr>
-        <w:lastRenderedPageBreak/>
+        <w:ind w:firstLine="709"/>
+        <w:rPr>
+          <w:rFonts w:ascii="Lucida Sans Unicode" w:hAnsi="Lucida Sans Unicode" w:cs="Lucida Sans Unicode"/>
+          <w:color w:val="000000" w:themeColor="text1"/>
+          <w:sz w:val="22"/>
+          <w:szCs w:val="22"/>
+        </w:rPr>
+      </w:pPr>
+      <w:r>
+        <w:rPr>
+          <w:rFonts w:ascii="Lucida Sans Unicode" w:hAnsi="Lucida Sans Unicode" w:cs="Lucida Sans Unicode"/>
+          <w:color w:val="000000" w:themeColor="text1"/>
+          <w:sz w:val="22"/>
+          <w:szCs w:val="22"/>
+        </w:rPr>
+        <w:t>In order to conduct a comprehensive evaluation of the phenomenon</w:t>
+      </w:r>
+      <w:r>
+        <w:rPr>
+          <w:rFonts w:ascii="Lucida Sans Unicode" w:hAnsi="Lucida Sans Unicode" w:cs="Lucida Sans Unicode"/>
+          <w:color w:val="000000" w:themeColor="text1"/>
+          <w:sz w:val="22"/>
+          <w:szCs w:val="22"/>
+        </w:rPr>
+        <w:t>’</w:t>
+      </w:r>
+      <w:r>
+        <w:rPr>
+          <w:rFonts w:ascii="Lucida Sans Unicode" w:hAnsi="Lucida Sans Unicode" w:cs="Lucida Sans Unicode"/>
+          <w:color w:val="000000" w:themeColor="text1"/>
+          <w:sz w:val="22"/>
+          <w:szCs w:val="22"/>
+        </w:rPr>
+        <w:t>s robustness, variabilty across UTOS dimensions (</w:t>
+      </w:r>
+      <w:r>
+        <w:rPr>
+          <w:rFonts w:ascii="Lucida Sans Unicode" w:hAnsi="Lucida Sans Unicode" w:cs="Lucida Sans Unicode"/>
+          <w:color w:val="000000" w:themeColor="text1"/>
+          <w:sz w:val="22"/>
+          <w:szCs w:val="22"/>
+        </w:rPr>
+        <w:t>Findley et al., 2021</w:t>
+      </w:r>
+      <w:r>
+        <w:rPr>
+          <w:rFonts w:ascii="Lucida Sans Unicode" w:hAnsi="Lucida Sans Unicode" w:cs="Lucida Sans Unicode"/>
+          <w:color w:val="000000" w:themeColor="text1"/>
+          <w:sz w:val="22"/>
+          <w:szCs w:val="22"/>
+        </w:rPr>
+        <w:t xml:space="preserve">) </w:t>
+      </w:r>
+      <w:r>
+        <w:rPr>
+          <w:rFonts w:ascii="Lucida Sans Unicode" w:hAnsi="Lucida Sans Unicode" w:cs="Lucida Sans Unicode"/>
+          <w:color w:val="000000" w:themeColor="text1"/>
+          <w:sz w:val="22"/>
+          <w:szCs w:val="22"/>
+        </w:rPr>
+        <w:t xml:space="preserve">is </w:t>
+      </w:r>
+      <w:r>
+        <w:rPr>
+          <w:rFonts w:ascii="Lucida Sans Unicode" w:hAnsi="Lucida Sans Unicode" w:cs="Lucida Sans Unicode"/>
+          <w:color w:val="000000" w:themeColor="text1"/>
+          <w:sz w:val="22"/>
+          <w:szCs w:val="22"/>
+        </w:rPr>
+        <w:t xml:space="preserve">examined </w:t>
+      </w:r>
+    </w:p>
+    <w:p>
+      <w:pPr>
+        <w:spacing w:line="360" w:lineRule="auto"/>
+        <w:rPr>
+          <w:rFonts w:ascii="Lucida Sans Unicode" w:hAnsi="Lucida Sans Unicode" w:cs="Lucida Sans Unicode"/>
+          <w:color w:val="000000" w:themeColor="text1"/>
+          <w:sz w:val="22"/>
+          <w:szCs w:val="22"/>
+        </w:rPr>
+      </w:pPr>
+      <w:r>
+        <w:rPr>
+          <w:rFonts w:ascii="Lucida Sans Unicode" w:hAnsi="Lucida Sans Unicode" w:cs="Lucida Sans Unicode"/>
+          <w:color w:val="000000" w:themeColor="text1"/>
+          <w:sz w:val="22"/>
+          <w:szCs w:val="22"/>
+        </w:rPr>
         <w:t xml:space="preserve">below. </w:t>
       </w:r>
     </w:p>
@@ -2677,7 +2676,17 @@
           <w:sz w:val="22"/>
           <w:szCs w:val="22"/>
         </w:rPr>
-        <w:t>(no, low or high degree of self-disclosure) (Lapidot-Lefler &amp; Barak, 2015). Another option is a textual analysis where prespecified expressions (e.g. “I think”) are counted. Their sum serves as indicator for the person’s tendency to self-disclose. In addition to or instead of these, self-reports on self-disclosing behavior are used (Clark-Gordon et al., 2019).</w:t>
+        <w:t xml:space="preserve">(no, low or high degree of self-disclosure) (Lapidot-Lefler &amp; Barak, 2015). Another option is a textual analysis where prespecified expressions (e.g. “I think”) are counted. Their sum serves as </w:t>
+      </w:r>
+      <w:r>
+        <w:rPr>
+          <w:rFonts w:ascii="Lucida Sans Unicode" w:hAnsi="Lucida Sans Unicode" w:cs="Lucida Sans Unicode"/>
+          <w:color w:val="000000" w:themeColor="text1"/>
+          <w:sz w:val="22"/>
+          <w:szCs w:val="22"/>
+        </w:rPr>
+        <w:lastRenderedPageBreak/>
+        <w:t>indicator for the person’s tendency to self-disclose. In addition to or instead of these, self-reports on self-disclosing behavior are used (Clark-Gordon et al., 2019).</w:t>
       </w:r>
     </w:p>
     <w:p>
@@ -2726,7 +2735,6 @@
           <w:sz w:val="22"/>
           <w:szCs w:val="22"/>
         </w:rPr>
-        <w:lastRenderedPageBreak/>
         <w:t>Reported settings included simulated scenarios in laboratories where participants communicated via chat with other subjects (either based on a given prompt or informally), as well as the administration of short online surveys and subsequent analysis of texts that participants had published on their private profiles.</w:t>
       </w:r>
     </w:p>
@@ -2871,7 +2879,7 @@
           <w:lang w:eastAsia="de-DE"/>
           <w14:ligatures w14:val="none"/>
         </w:rPr>
-        <w:t xml:space="preserve">All R scripts and </w:t>
+        <w:t xml:space="preserve">All R scripts and additional materials created during </w:t>
       </w:r>
       <w:r>
         <w:rPr>
@@ -2883,7 +2891,7 @@
           <w:lang w:eastAsia="de-DE"/>
           <w14:ligatures w14:val="none"/>
         </w:rPr>
-        <w:t>additional</w:t>
+        <w:t>the</w:t>
       </w:r>
       <w:r>
         <w:rPr>
@@ -2895,31 +2903,7 @@
           <w:lang w:eastAsia="de-DE"/>
           <w14:ligatures w14:val="none"/>
         </w:rPr>
-        <w:t xml:space="preserve"> materials created during our collaborative and individual work can be found in the following</w:t>
-      </w:r>
-      <w:r>
-        <w:rPr>
-          <w:rFonts w:ascii="Lucida Sans Unicode" w:eastAsia="Times New Roman" w:hAnsi="Lucida Sans Unicode" w:cs="Lucida Sans Unicode"/>
-          <w:color w:val="000000"/>
-          <w:kern w:val="0"/>
-          <w:sz w:val="22"/>
-          <w:szCs w:val="22"/>
-          <w:lang w:eastAsia="de-DE"/>
-          <w14:ligatures w14:val="none"/>
-        </w:rPr>
-        <w:t xml:space="preserve"> public</w:t>
-      </w:r>
-      <w:r>
-        <w:rPr>
-          <w:rFonts w:ascii="Lucida Sans Unicode" w:eastAsia="Times New Roman" w:hAnsi="Lucida Sans Unicode" w:cs="Lucida Sans Unicode"/>
-          <w:color w:val="000000"/>
-          <w:kern w:val="0"/>
-          <w:sz w:val="22"/>
-          <w:szCs w:val="22"/>
-          <w:lang w:eastAsia="de-DE"/>
-          <w14:ligatures w14:val="none"/>
-        </w:rPr>
-        <w:t xml:space="preserve"> Git repository: </w:t>
+        <w:t xml:space="preserve"> collaborative and individual work can be found in the following public Git repository: </w:t>
       </w:r>
     </w:p>
     <w:p>
@@ -2959,31 +2943,7 @@
             <w:lang w:eastAsia="de-DE"/>
             <w14:ligatures w14:val="none"/>
           </w:rPr>
-          <w:t>https://github.com/a</w:t>
-        </w:r>
-        <w:r>
-          <w:rPr>
-            <w:rStyle w:val="Hyperlink"/>
-            <w:rFonts w:ascii="Lucida Sans Unicode" w:eastAsia="Times New Roman" w:hAnsi="Lucida Sans Unicode" w:cs="Lucida Sans Unicode"/>
-            <w:kern w:val="0"/>
-            <w:sz w:val="22"/>
-            <w:szCs w:val="22"/>
-            <w:lang w:eastAsia="de-DE"/>
-            <w14:ligatures w14:val="none"/>
-          </w:rPr>
-          <w:t>m</w:t>
-        </w:r>
-        <w:r>
-          <w:rPr>
-            <w:rStyle w:val="Hyperlink"/>
-            <w:rFonts w:ascii="Lucida Sans Unicode" w:eastAsia="Times New Roman" w:hAnsi="Lucida Sans Unicode" w:cs="Lucida Sans Unicode"/>
-            <w:kern w:val="0"/>
-            <w:sz w:val="22"/>
-            <w:szCs w:val="22"/>
-            <w:lang w:eastAsia="de-DE"/>
-            <w14:ligatures w14:val="none"/>
-          </w:rPr>
-          <w:t>elieschlieben/FOMO_Eigenleistung</w:t>
+          <w:t>https://github.com/amelieschlieben/FOMO_Eigenleistung</w:t>
         </w:r>
       </w:hyperlink>
     </w:p>
@@ -3049,7 +3009,17 @@
           <w:sz w:val="22"/>
           <w:szCs w:val="22"/>
         </w:rPr>
-        <w:t xml:space="preserve"> of our model were necessary for</w:t>
+        <w:t xml:space="preserve"> of our model </w:t>
+      </w:r>
+      <w:r>
+        <w:rPr>
+          <w:rFonts w:ascii="Lucida Sans Unicode" w:hAnsi="Lucida Sans Unicode" w:cs="Lucida Sans Unicode"/>
+          <w:color w:val="000000" w:themeColor="text1"/>
+          <w:sz w:val="22"/>
+          <w:szCs w:val="22"/>
+        </w:rPr>
+        <w:lastRenderedPageBreak/>
+        <w:t>were necessary for</w:t>
       </w:r>
       <w:r>
         <w:rPr>
@@ -3085,7 +3055,7 @@
           <w:sz w:val="22"/>
           <w:szCs w:val="22"/>
         </w:rPr>
-        <w:t xml:space="preserve">concepts that were reduced to single metrics in order to build the formal model. </w:t>
+        <w:t xml:space="preserve">concepts that were reduced to metrics in order to build the formal model. </w:t>
       </w:r>
     </w:p>
     <w:p>
@@ -3093,17 +3063,6 @@
         <w:spacing w:line="360" w:lineRule="auto"/>
         <w:rPr>
           <w:rFonts w:ascii="Lucida Sans Unicode" w:hAnsi="Lucida Sans Unicode" w:cs="Lucida Sans Unicode"/>
-          <w:color w:val="000000" w:themeColor="text1"/>
-          <w:sz w:val="22"/>
-          <w:szCs w:val="22"/>
-        </w:rPr>
-      </w:pPr>
-    </w:p>
-    <w:p>
-      <w:pPr>
-        <w:spacing w:line="360" w:lineRule="auto"/>
-        <w:rPr>
-          <w:rFonts w:ascii="Lucida Sans Unicode" w:hAnsi="Lucida Sans Unicode" w:cs="Lucida Sans Unicode"/>
           <w:b/>
           <w:bCs/>
           <w:color w:val="000000" w:themeColor="text1"/>
@@ -3120,7 +3079,6 @@
           <w:sz w:val="22"/>
           <w:szCs w:val="22"/>
         </w:rPr>
-        <w:lastRenderedPageBreak/>
         <w:t>Table 1</w:t>
       </w:r>
     </w:p>
@@ -3501,13 +3459,6 @@
                 <w:szCs w:val="20"/>
               </w:rPr>
               <w:br/>
-            </w:r>
-            <w:r>
-              <w:rPr>
-                <w:rFonts w:ascii="Lucida Sans Unicode" w:hAnsi="Lucida Sans Unicode" w:cs="Lucida Sans Unicode"/>
-                <w:sz w:val="20"/>
-                <w:szCs w:val="20"/>
-              </w:rPr>
               <w:t>1 = Full anonymity where the user remains unknowable during the interaction</w:t>
             </w:r>
           </w:p>
@@ -3715,13 +3666,6 @@
                 <w:szCs w:val="20"/>
               </w:rPr>
               <w:br/>
-            </w:r>
-            <w:r>
-              <w:rPr>
-                <w:rFonts w:ascii="Lucida Sans Unicode" w:hAnsi="Lucida Sans Unicode" w:cs="Lucida Sans Unicode"/>
-                <w:sz w:val="20"/>
-                <w:szCs w:val="20"/>
-              </w:rPr>
               <w:t>1 = feeling like ‘those online behaviors “aren’t me at all.”’ (Suler, 2004)</w:t>
             </w:r>
           </w:p>
@@ -3874,13 +3818,6 @@
                 <w:szCs w:val="20"/>
               </w:rPr>
               <w:br/>
-            </w:r>
-            <w:r>
-              <w:rPr>
-                <w:rFonts w:ascii="Lucida Sans Unicode" w:hAnsi="Lucida Sans Unicode" w:cs="Lucida Sans Unicode"/>
-                <w:sz w:val="20"/>
-                <w:szCs w:val="20"/>
-              </w:rPr>
               <w:t>1 = maximal feeling of responsibility for one’s actions</w:t>
             </w:r>
           </w:p>
@@ -4020,13 +3957,6 @@
                 <w:szCs w:val="20"/>
               </w:rPr>
               <w:br/>
-            </w:r>
-            <w:r>
-              <w:rPr>
-                <w:rFonts w:ascii="Lucida Sans Unicode" w:hAnsi="Lucida Sans Unicode" w:cs="Lucida Sans Unicode"/>
-                <w:sz w:val="20"/>
-                <w:szCs w:val="20"/>
-              </w:rPr>
               <w:t>1 = audio, video and nonverbal feedback, maximal nonverbal, paraverbal and verbal cues</w:t>
             </w:r>
           </w:p>
@@ -4325,13 +4255,6 @@
                 <w:szCs w:val="20"/>
               </w:rPr>
               <w:br/>
-            </w:r>
-            <w:r>
-              <w:rPr>
-                <w:rFonts w:ascii="Lucida Sans Unicode" w:hAnsi="Lucida Sans Unicode" w:cs="Lucida Sans Unicode"/>
-                <w:sz w:val="20"/>
-                <w:szCs w:val="20"/>
-              </w:rPr>
               <w:t>1 = no fear of expressing oneself</w:t>
             </w:r>
           </w:p>
@@ -4359,6 +4282,7 @@
                 <w:sz w:val="22"/>
                 <w:szCs w:val="22"/>
               </w:rPr>
+              <w:lastRenderedPageBreak/>
               <w:t>Measure of Online Disinhibition</w:t>
             </w:r>
           </w:p>
@@ -4466,13 +4390,6 @@
                 <w:szCs w:val="20"/>
               </w:rPr>
               <w:br/>
-            </w:r>
-            <w:r>
-              <w:rPr>
-                <w:rFonts w:ascii="Lucida Sans Unicode" w:hAnsi="Lucida Sans Unicode" w:cs="Lucida Sans Unicode"/>
-                <w:sz w:val="20"/>
-                <w:szCs w:val="20"/>
-              </w:rPr>
               <w:t>1 = strongly disagree</w:t>
             </w:r>
             <w:r>
@@ -4525,7 +4442,6 @@
                 <w:sz w:val="22"/>
                 <w:szCs w:val="22"/>
               </w:rPr>
-              <w:lastRenderedPageBreak/>
               <w:t>State Disinhibition</w:t>
             </w:r>
           </w:p>
@@ -4990,6 +4906,20 @@
         </w:rPr>
         <w:t>:</w:t>
       </w:r>
+    </w:p>
+    <w:p>
+      <w:pPr>
+        <w:spacing w:before="100" w:beforeAutospacing="1" w:after="100" w:afterAutospacing="1" w:line="360" w:lineRule="auto"/>
+        <w:rPr>
+          <w:rFonts w:ascii="Lucida Sans Unicode" w:eastAsia="Times New Roman" w:hAnsi="Lucida Sans Unicode" w:cs="Lucida Sans Unicode"/>
+          <w:color w:val="000000" w:themeColor="text1"/>
+          <w:kern w:val="0"/>
+          <w:sz w:val="22"/>
+          <w:szCs w:val="22"/>
+          <w:lang w:eastAsia="de-DE"/>
+          <w14:ligatures w14:val="none"/>
+        </w:rPr>
+      </w:pPr>
       <w:r>
         <w:rPr>
           <w:rFonts w:ascii="Cambria Math" w:eastAsia="Times New Roman" w:hAnsi="Cambria Math" w:cs="Lucida Sans Unicode"/>
@@ -5278,6 +5208,7 @@
           <w:lang w:eastAsia="de-DE"/>
           <w14:ligatures w14:val="none"/>
         </w:rPr>
+        <w:lastRenderedPageBreak/>
         <w:br/>
       </w:r>
       <w:r>
@@ -5592,7 +5523,7 @@
           <w:lang w:val="de-DE" w:eastAsia="de-DE"/>
           <w14:ligatures w14:val="none"/>
         </w:rPr>
-        <w:t xml:space="preserve"> lead to identity </w:t>
+        <w:t xml:space="preserve"> lead to identity compartmentalization, as well as a very high level of anonymity does not have any further</w:t>
       </w:r>
       <w:r>
         <w:rPr>
@@ -5604,8 +5535,7 @@
           <w:lang w:val="de-DE" w:eastAsia="de-DE"/>
           <w14:ligatures w14:val="none"/>
         </w:rPr>
-        <w:lastRenderedPageBreak/>
-        <w:t>compartmentalization, as well as a very high level of anonymity does not have any further</w:t>
+        <w:t xml:space="preserve"> </w:t>
       </w:r>
       <w:r>
         <w:rPr>
@@ -5617,9 +5547,12 @@
           <w:lang w:val="de-DE" w:eastAsia="de-DE"/>
           <w14:ligatures w14:val="none"/>
         </w:rPr>
-        <w:t xml:space="preserve"> </w:t>
-      </w:r>
-      <w:r>
+        <w:t>noticable effect on compartmentalization.</w:t>
+      </w:r>
+    </w:p>
+    <w:p>
+      <w:pPr>
+        <w:spacing w:before="100" w:beforeAutospacing="1" w:after="100" w:afterAutospacing="1" w:line="360" w:lineRule="auto"/>
         <w:rPr>
           <w:rFonts w:ascii="Lucida Sans Unicode" w:eastAsia="Times New Roman" w:hAnsi="Lucida Sans Unicode" w:cs="Lucida Sans Unicode"/>
           <w:color w:val="000000" w:themeColor="text1"/>
@@ -5629,7 +5562,54 @@
           <w:lang w:val="de-DE" w:eastAsia="de-DE"/>
           <w14:ligatures w14:val="none"/>
         </w:rPr>
-        <w:t>noticable effect on compartmentalization.</w:t>
+      </w:pPr>
+      <w:r>
+        <w:rPr>
+          <w:rFonts w:ascii="Lucida Sans Unicode" w:eastAsia="Times New Roman" w:hAnsi="Lucida Sans Unicode" w:cs="Lucida Sans Unicode"/>
+          <w:color w:val="000000" w:themeColor="text1"/>
+          <w:kern w:val="0"/>
+          <w:sz w:val="22"/>
+          <w:szCs w:val="22"/>
+          <w:lang w:val="de-DE" w:eastAsia="de-DE"/>
+          <w14:ligatures w14:val="none"/>
+        </w:rPr>
+        <w:t>The outcome of the IC-function</w:t>
+      </w:r>
+      <w:r>
+        <w:rPr>
+          <w:rFonts w:ascii="Lucida Sans Unicode" w:eastAsia="Times New Roman" w:hAnsi="Lucida Sans Unicode" w:cs="Lucida Sans Unicode"/>
+          <w:color w:val="000000" w:themeColor="text1"/>
+          <w:kern w:val="0"/>
+          <w:sz w:val="22"/>
+          <w:szCs w:val="22"/>
+          <w:lang w:val="de-DE" w:eastAsia="de-DE"/>
+          <w14:ligatures w14:val="none"/>
+        </w:rPr>
+        <w:t xml:space="preserve"> in turn</w:t>
+      </w:r>
+      <w:r>
+        <w:rPr>
+          <w:rFonts w:ascii="Lucida Sans Unicode" w:eastAsia="Times New Roman" w:hAnsi="Lucida Sans Unicode" w:cs="Lucida Sans Unicode"/>
+          <w:color w:val="000000" w:themeColor="text1"/>
+          <w:kern w:val="0"/>
+          <w:sz w:val="22"/>
+          <w:szCs w:val="22"/>
+          <w:lang w:val="de-DE" w:eastAsia="de-DE"/>
+          <w14:ligatures w14:val="none"/>
+        </w:rPr>
+        <w:t xml:space="preserve"> dictates the </w:t>
+      </w:r>
+      <w:r>
+        <w:rPr>
+          <w:rFonts w:ascii="Lucida Sans Unicode" w:eastAsia="Times New Roman" w:hAnsi="Lucida Sans Unicode" w:cs="Lucida Sans Unicode"/>
+          <w:color w:val="000000" w:themeColor="text1"/>
+          <w:kern w:val="0"/>
+          <w:sz w:val="22"/>
+          <w:szCs w:val="22"/>
+          <w:lang w:val="de-DE" w:eastAsia="de-DE"/>
+          <w14:ligatures w14:val="none"/>
+        </w:rPr>
+        <w:t>felt responsibility (A3):</w:t>
       </w:r>
     </w:p>
     <w:p>
@@ -5656,13 +5636,13 @@
           <w14:ligatures w14:val="none"/>
         </w:rPr>
         <w:drawing>
-          <wp:anchor distT="180340" distB="360045" distL="180340" distR="180340" simplePos="0" relativeHeight="251659264" behindDoc="0" locked="0" layoutInCell="1" allowOverlap="1" wp14:anchorId="6088DAFB" wp14:editId="479D714B">
+          <wp:anchor distT="180340" distB="360045" distL="180340" distR="180340" simplePos="0" relativeHeight="251659264" behindDoc="0" locked="0" layoutInCell="1" allowOverlap="1" wp14:anchorId="6088DAFB" wp14:editId="4CDBC320">
             <wp:simplePos x="0" y="0"/>
             <wp:positionH relativeFrom="column">
-              <wp:posOffset>-32385</wp:posOffset>
+              <wp:posOffset>120650</wp:posOffset>
             </wp:positionH>
             <wp:positionV relativeFrom="paragraph">
-              <wp:posOffset>958759</wp:posOffset>
+              <wp:posOffset>903605</wp:posOffset>
             </wp:positionV>
             <wp:extent cx="2862000" cy="1875600"/>
             <wp:effectExtent l="0" t="0" r="0" b="4445"/>
@@ -5732,13 +5712,13 @@
         <mc:AlternateContent>
           <mc:Choice Requires="wps">
             <w:drawing>
-              <wp:anchor distT="0" distB="0" distL="114300" distR="114300" simplePos="0" relativeHeight="251662336" behindDoc="0" locked="0" layoutInCell="1" allowOverlap="1" wp14:anchorId="2F837DC2" wp14:editId="79A0CAA0">
+              <wp:anchor distT="0" distB="0" distL="114300" distR="114300" simplePos="0" relativeHeight="251662336" behindDoc="0" locked="0" layoutInCell="1" allowOverlap="1" wp14:anchorId="2F837DC2" wp14:editId="121FEBC6">
                 <wp:simplePos x="0" y="0"/>
                 <wp:positionH relativeFrom="column">
-                  <wp:posOffset>-67310</wp:posOffset>
+                  <wp:posOffset>-153670</wp:posOffset>
                 </wp:positionH>
                 <wp:positionV relativeFrom="paragraph">
-                  <wp:posOffset>2942590</wp:posOffset>
+                  <wp:posOffset>2866390</wp:posOffset>
                 </wp:positionV>
                 <wp:extent cx="2982595" cy="467995"/>
                 <wp:effectExtent l="0" t="0" r="1905" b="1905"/>
@@ -5783,17 +5763,7 @@
                                 <w:sz w:val="15"/>
                                 <w:szCs w:val="15"/>
                               </w:rPr>
-                              <w:t xml:space="preserve">Figure </w:t>
-                            </w:r>
-                            <w:r>
-                              <w:rPr>
-                                <w:rFonts w:ascii="Lucida Sans Unicode" w:hAnsi="Lucida Sans Unicode" w:cs="Lucida Sans Unicode"/>
-                                <w:b/>
-                                <w:bCs/>
-                                <w:sz w:val="15"/>
-                                <w:szCs w:val="15"/>
-                              </w:rPr>
-                              <w:t>3</w:t>
+                              <w:t>Figure 3</w:t>
                             </w:r>
                             <w:r>
                               <w:rPr>
@@ -5811,31 +5781,7 @@
                                 <w:sz w:val="15"/>
                                 <w:szCs w:val="15"/>
                               </w:rPr>
-                              <w:t xml:space="preserve">Effect of </w:t>
-                            </w:r>
-                            <w:r>
-                              <w:rPr>
-                                <w:rFonts w:ascii="Lucida Sans Unicode" w:hAnsi="Lucida Sans Unicode" w:cs="Lucida Sans Unicode"/>
-                                <w:sz w:val="15"/>
-                                <w:szCs w:val="15"/>
-                              </w:rPr>
-                              <w:t>identity compartmentalization</w:t>
-                            </w:r>
-                            <w:r>
-                              <w:rPr>
-                                <w:rFonts w:ascii="Lucida Sans Unicode" w:hAnsi="Lucida Sans Unicode" w:cs="Lucida Sans Unicode"/>
-                                <w:sz w:val="15"/>
-                                <w:szCs w:val="15"/>
-                              </w:rPr>
-                              <w:t xml:space="preserve"> on </w:t>
-                            </w:r>
-                            <w:r>
-                              <w:rPr>
-                                <w:rFonts w:ascii="Lucida Sans Unicode" w:hAnsi="Lucida Sans Unicode" w:cs="Lucida Sans Unicode"/>
-                                <w:sz w:val="15"/>
-                                <w:szCs w:val="15"/>
-                              </w:rPr>
-                              <w:t>felt responsibility</w:t>
+                              <w:t>Effect of identity compartmentalization on felt responsibility</w:t>
                             </w:r>
                           </w:p>
                         </w:txbxContent>
@@ -5860,7 +5806,7 @@
           </mc:Choice>
           <mc:Fallback>
             <w:pict>
-              <v:shape w14:anchorId="2F837DC2" id="_x0000_s1028" type="#_x0000_t202" style="position:absolute;margin-left:-5.3pt;margin-top:231.7pt;width:234.85pt;height:36.85pt;z-index:251662336;visibility:visible;mso-wrap-style:square;mso-width-percent:0;mso-height-percent:0;mso-wrap-distance-left:9pt;mso-wrap-distance-top:0;mso-wrap-distance-right:9pt;mso-wrap-distance-bottom:0;mso-position-horizontal:absolute;mso-position-horizontal-relative:text;mso-position-vertical:absolute;mso-position-vertical-relative:text;mso-width-percent:0;mso-height-percent:0;mso-width-relative:margin;mso-height-relative:margin;v-text-anchor:top" o:gfxdata="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" fillcolor="white [3201]" stroked="f" strokeweight=".5pt">
+              <v:shape w14:anchorId="2F837DC2" id="_x0000_s1028" type="#_x0000_t202" style="position:absolute;margin-left:-12.1pt;margin-top:225.7pt;width:234.85pt;height:36.85pt;z-index:251662336;visibility:visible;mso-wrap-style:square;mso-width-percent:0;mso-height-percent:0;mso-wrap-distance-left:9pt;mso-wrap-distance-top:0;mso-wrap-distance-right:9pt;mso-wrap-distance-bottom:0;mso-position-horizontal:absolute;mso-position-horizontal-relative:text;mso-position-vertical:absolute;mso-position-vertical-relative:text;mso-width-percent:0;mso-height-percent:0;mso-width-relative:margin;mso-height-relative:margin;v-text-anchor:top" o:gfxdata="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" fillcolor="white [3201]" stroked="f" strokeweight=".5pt">
                 <v:textbox>
                   <w:txbxContent>
                     <w:p>
@@ -5880,17 +5826,7 @@
                           <w:sz w:val="15"/>
                           <w:szCs w:val="15"/>
                         </w:rPr>
-                        <w:t xml:space="preserve">Figure </w:t>
-                      </w:r>
-                      <w:r>
-                        <w:rPr>
-                          <w:rFonts w:ascii="Lucida Sans Unicode" w:hAnsi="Lucida Sans Unicode" w:cs="Lucida Sans Unicode"/>
-                          <w:b/>
-                          <w:bCs/>
-                          <w:sz w:val="15"/>
-                          <w:szCs w:val="15"/>
-                        </w:rPr>
-                        <w:t>3</w:t>
+                        <w:t>Figure 3</w:t>
                       </w:r>
                       <w:r>
                         <w:rPr>
@@ -5908,31 +5844,7 @@
                           <w:sz w:val="15"/>
                           <w:szCs w:val="15"/>
                         </w:rPr>
-                        <w:t xml:space="preserve">Effect of </w:t>
-                      </w:r>
-                      <w:r>
-                        <w:rPr>
-                          <w:rFonts w:ascii="Lucida Sans Unicode" w:hAnsi="Lucida Sans Unicode" w:cs="Lucida Sans Unicode"/>
-                          <w:sz w:val="15"/>
-                          <w:szCs w:val="15"/>
-                        </w:rPr>
-                        <w:t>identity compartmentalization</w:t>
-                      </w:r>
-                      <w:r>
-                        <w:rPr>
-                          <w:rFonts w:ascii="Lucida Sans Unicode" w:hAnsi="Lucida Sans Unicode" w:cs="Lucida Sans Unicode"/>
-                          <w:sz w:val="15"/>
-                          <w:szCs w:val="15"/>
-                        </w:rPr>
-                        <w:t xml:space="preserve"> on </w:t>
-                      </w:r>
-                      <w:r>
-                        <w:rPr>
-                          <w:rFonts w:ascii="Lucida Sans Unicode" w:hAnsi="Lucida Sans Unicode" w:cs="Lucida Sans Unicode"/>
-                          <w:sz w:val="15"/>
-                          <w:szCs w:val="15"/>
-                        </w:rPr>
-                        <w:t>felt responsibility</w:t>
+                        <w:t>Effect of identity compartmentalization on felt responsibility</w:t>
                       </w:r>
                     </w:p>
                   </w:txbxContent>
@@ -5944,55 +5856,8 @@
       </w:r>
       <w:r>
         <w:rPr>
-          <w:rFonts w:ascii="Lucida Sans Unicode" w:eastAsia="Times New Roman" w:hAnsi="Lucida Sans Unicode" w:cs="Lucida Sans Unicode"/>
-          <w:color w:val="000000" w:themeColor="text1"/>
-          <w:kern w:val="0"/>
-          <w:sz w:val="22"/>
-          <w:szCs w:val="22"/>
-          <w:lang w:val="de-DE" w:eastAsia="de-DE"/>
-          <w14:ligatures w14:val="none"/>
-        </w:rPr>
-        <w:t>The outcome of the IC-function</w:t>
-      </w:r>
-      <w:r>
-        <w:rPr>
-          <w:rFonts w:ascii="Lucida Sans Unicode" w:eastAsia="Times New Roman" w:hAnsi="Lucida Sans Unicode" w:cs="Lucida Sans Unicode"/>
-          <w:color w:val="000000" w:themeColor="text1"/>
-          <w:kern w:val="0"/>
-          <w:sz w:val="22"/>
-          <w:szCs w:val="22"/>
-          <w:lang w:val="de-DE" w:eastAsia="de-DE"/>
-          <w14:ligatures w14:val="none"/>
-        </w:rPr>
-        <w:t xml:space="preserve"> in turn</w:t>
-      </w:r>
-      <w:r>
-        <w:rPr>
-          <w:rFonts w:ascii="Lucida Sans Unicode" w:eastAsia="Times New Roman" w:hAnsi="Lucida Sans Unicode" w:cs="Lucida Sans Unicode"/>
-          <w:color w:val="000000" w:themeColor="text1"/>
-          <w:kern w:val="0"/>
-          <w:sz w:val="22"/>
-          <w:szCs w:val="22"/>
-          <w:lang w:val="de-DE" w:eastAsia="de-DE"/>
-          <w14:ligatures w14:val="none"/>
-        </w:rPr>
-        <w:t xml:space="preserve"> dictates the </w:t>
-      </w:r>
-      <w:r>
-        <w:rPr>
-          <w:rFonts w:ascii="Lucida Sans Unicode" w:eastAsia="Times New Roman" w:hAnsi="Lucida Sans Unicode" w:cs="Lucida Sans Unicode"/>
-          <w:color w:val="000000" w:themeColor="text1"/>
-          <w:kern w:val="0"/>
-          <w:sz w:val="22"/>
-          <w:szCs w:val="22"/>
-          <w:lang w:val="de-DE" w:eastAsia="de-DE"/>
-          <w14:ligatures w14:val="none"/>
-        </w:rPr>
-        <w:t>felt responsibility (A3):</w:t>
-      </w:r>
-      <w:r>
-        <w:rPr>
-          <w:rFonts w:ascii="Lucida Sans Unicode" w:eastAsia="Times New Roman" w:hAnsi="Lucida Sans Unicode" w:cs="Lucida Sans Unicode"/>
+          <w:rFonts w:ascii="Cambria Math" w:eastAsia="Times New Roman" w:hAnsi="Cambria Math" w:cs="Lucida Sans Unicode"/>
+          <w:i/>
           <w:color w:val="000000" w:themeColor="text1"/>
           <w:kern w:val="0"/>
           <w:sz w:val="22"/>
@@ -6137,19 +6002,6 @@
           <m:r>
             <w:rPr>
               <w:rFonts w:ascii="Cambria Math" w:eastAsia="Times New Roman" w:hAnsi="Cambria Math" w:cs="Lucida Sans Unicode"/>
-              <w:i/>
-              <w:color w:val="000000" w:themeColor="text1"/>
-              <w:kern w:val="0"/>
-              <w:sz w:val="22"/>
-              <w:szCs w:val="22"/>
-              <w:lang w:val="de-DE" w:eastAsia="de-DE"/>
-              <w14:ligatures w14:val="none"/>
-            </w:rPr>
-            <w:br/>
-          </m:r>
-          <m:r>
-            <w:rPr>
-              <w:rFonts w:ascii="Lucida Sans Unicode" w:eastAsia="Times New Roman" w:hAnsi="Lucida Sans Unicode" w:cs="Lucida Sans Unicode"/>
               <w:color w:val="000000" w:themeColor="text1"/>
               <w:kern w:val="0"/>
               <w:sz w:val="22"/>
@@ -6164,6 +6016,18 @@
       <w:r>
         <w:rPr>
           <w:rFonts w:ascii="Lucida Sans Unicode" w:eastAsia="Times New Roman" w:hAnsi="Lucida Sans Unicode" w:cs="Lucida Sans Unicode"/>
+          <w:color w:val="000000" w:themeColor="text1"/>
+          <w:kern w:val="0"/>
+          <w:sz w:val="22"/>
+          <w:szCs w:val="22"/>
+          <w:lang w:val="de-DE" w:eastAsia="de-DE"/>
+          <w14:ligatures w14:val="none"/>
+        </w:rPr>
+        <w:br/>
+      </w:r>
+      <w:r>
+        <w:rPr>
+          <w:rFonts w:ascii="Lucida Sans Unicode" w:eastAsia="Times New Roman" w:hAnsi="Lucida Sans Unicode" w:cs="Lucida Sans Unicode"/>
           <w:i/>
           <w:iCs/>
           <w:color w:val="000000" w:themeColor="text1"/>
@@ -6245,7 +6109,31 @@
           <w:lang w:val="de-DE" w:eastAsia="de-DE"/>
           <w14:ligatures w14:val="none"/>
         </w:rPr>
-        <w:t xml:space="preserve">As observable in Figure 3, the higher identity compartmentalization, the lower </w:t>
+        <w:t>As observable in Figure 3, the higher identity compart</w:t>
+      </w:r>
+      <w:r>
+        <w:rPr>
+          <w:rFonts w:ascii="Lucida Sans Unicode" w:eastAsia="Times New Roman" w:hAnsi="Lucida Sans Unicode" w:cs="Lucida Sans Unicode"/>
+          <w:color w:val="000000" w:themeColor="text1"/>
+          <w:kern w:val="0"/>
+          <w:sz w:val="22"/>
+          <w:szCs w:val="22"/>
+          <w:lang w:val="de-DE" w:eastAsia="de-DE"/>
+          <w14:ligatures w14:val="none"/>
+        </w:rPr>
+        <w:t>-</w:t>
+      </w:r>
+      <w:r>
+        <w:rPr>
+          <w:rFonts w:ascii="Lucida Sans Unicode" w:eastAsia="Times New Roman" w:hAnsi="Lucida Sans Unicode" w:cs="Lucida Sans Unicode"/>
+          <w:color w:val="000000" w:themeColor="text1"/>
+          <w:kern w:val="0"/>
+          <w:sz w:val="22"/>
+          <w:szCs w:val="22"/>
+          <w:lang w:val="de-DE" w:eastAsia="de-DE"/>
+          <w14:ligatures w14:val="none"/>
+        </w:rPr>
+        <w:t xml:space="preserve">mentalization, the lower </w:t>
       </w:r>
       <w:r>
         <w:rPr>
@@ -6377,6 +6265,7 @@
           <w:lang w:val="de-DE" w:eastAsia="de-DE"/>
           <w14:ligatures w14:val="none"/>
         </w:rPr>
+        <w:lastRenderedPageBreak/>
         <w:t>This concern then causes the person’s courage to express oneself (B3): The higher the concern, the lower the courage</w:t>
       </w:r>
       <w:r>
@@ -6435,9 +6324,11 @@
             <m:t>CE= -CAI+1</m:t>
           </m:r>
           <m:r>
+            <m:rPr>
+              <m:sty m:val="p"/>
+            </m:rPr>
             <w:rPr>
               <w:rFonts w:ascii="Lucida Sans Unicode" w:eastAsia="Times New Roman" w:hAnsi="Lucida Sans Unicode" w:cs="Lucida Sans Unicode"/>
-              <w:iCs/>
               <w:color w:val="000000" w:themeColor="text1"/>
               <w:kern w:val="0"/>
               <w:sz w:val="22"/>
@@ -6473,7 +6364,6 @@
           <w:szCs w:val="22"/>
           <w:lang w:val="de-DE" w:eastAsia="de-DE"/>
         </w:rPr>
-        <w:lastRenderedPageBreak/>
         <mc:AlternateContent>
           <mc:Choice Requires="wps">
             <w:drawing>
@@ -6963,7 +6853,86 @@
     <w:p>
       <w:pPr>
         <w:spacing w:before="100" w:beforeAutospacing="1" w:after="100" w:afterAutospacing="1" w:line="360" w:lineRule="auto"/>
-        <w:jc w:val="center"/>
+        <w:rPr>
+          <w:rFonts w:ascii="Cambria Math" w:eastAsia="Times New Roman" w:hAnsi="Cambria Math" w:cs="Lucida Sans Unicode"/>
+          <w:i/>
+          <w:color w:val="000000" w:themeColor="text1"/>
+          <w:kern w:val="0"/>
+          <w:sz w:val="22"/>
+          <w:szCs w:val="22"/>
+          <w:lang w:val="de-DE" w:eastAsia="de-DE"/>
+          <w14:ligatures w14:val="none"/>
+        </w:rPr>
+      </w:pPr>
+      <w:r>
+        <w:rPr>
+          <w:rFonts w:ascii="Lucida Sans Unicode" w:eastAsia="Times New Roman" w:hAnsi="Lucida Sans Unicode" w:cs="Lucida Sans Unicode"/>
+          <w:iCs/>
+          <w:color w:val="000000" w:themeColor="text1"/>
+          <w:kern w:val="0"/>
+          <w:sz w:val="22"/>
+          <w:szCs w:val="22"/>
+          <w:lang w:val="de-DE" w:eastAsia="de-DE"/>
+          <w14:ligatures w14:val="none"/>
+        </w:rPr>
+        <w:br/>
+      </w:r>
+      <w:r>
+        <w:rPr>
+          <w:rFonts w:ascii="Lucida Sans Unicode" w:eastAsia="Times New Roman" w:hAnsi="Lucida Sans Unicode" w:cs="Lucida Sans Unicode"/>
+          <w:iCs/>
+          <w:color w:val="000000" w:themeColor="text1"/>
+          <w:kern w:val="0"/>
+          <w:sz w:val="22"/>
+          <w:szCs w:val="22"/>
+          <w:lang w:val="de-DE" w:eastAsia="de-DE"/>
+          <w14:ligatures w14:val="none"/>
+        </w:rPr>
+        <w:t>State Disinhibition (D) finally results from the interplay of felt responsibility (A3),courage to express oneself (B3) and trait online disinhibition</w:t>
+      </w:r>
+      <w:r>
+        <w:rPr>
+          <w:rFonts w:ascii="Lucida Sans Unicode" w:eastAsia="Times New Roman" w:hAnsi="Lucida Sans Unicode" w:cs="Lucida Sans Unicode"/>
+          <w:iCs/>
+          <w:color w:val="000000" w:themeColor="text1"/>
+          <w:kern w:val="0"/>
+          <w:sz w:val="22"/>
+          <w:szCs w:val="22"/>
+          <w:lang w:val="de-DE" w:eastAsia="de-DE"/>
+          <w14:ligatures w14:val="none"/>
+        </w:rPr>
+        <w:t xml:space="preserve"> (MOD, </w:t>
+      </w:r>
+      <w:r>
+        <w:rPr>
+          <w:rFonts w:ascii="Lucida Sans Unicode" w:eastAsia="Times New Roman" w:hAnsi="Lucida Sans Unicode" w:cs="Lucida Sans Unicode"/>
+          <w:iCs/>
+          <w:color w:val="000000" w:themeColor="text1"/>
+          <w:kern w:val="0"/>
+          <w:sz w:val="22"/>
+          <w:szCs w:val="22"/>
+          <w:lang w:val="de-DE" w:eastAsia="de-DE"/>
+          <w14:ligatures w14:val="none"/>
+        </w:rPr>
+        <w:t>C). The mathematical relationship assumed incorporates main effects for theses predictors as well as an interaction term of felt responsibility and courage to express oneself</w:t>
+      </w:r>
+      <w:r>
+        <w:rPr>
+          <w:rFonts w:ascii="Lucida Sans Unicode" w:eastAsia="Times New Roman" w:hAnsi="Lucida Sans Unicode" w:cs="Lucida Sans Unicode"/>
+          <w:iCs/>
+          <w:color w:val="000000" w:themeColor="text1"/>
+          <w:kern w:val="0"/>
+          <w:sz w:val="22"/>
+          <w:szCs w:val="22"/>
+          <w:lang w:val="de-DE" w:eastAsia="de-DE"/>
+          <w14:ligatures w14:val="none"/>
+        </w:rPr>
+        <w:t>:</w:t>
+      </w:r>
+    </w:p>
+    <w:p>
+      <w:pPr>
+        <w:spacing w:before="100" w:beforeAutospacing="1" w:after="100" w:afterAutospacing="1" w:line="360" w:lineRule="auto"/>
         <w:rPr>
           <w:rFonts w:ascii="Cambria Math" w:eastAsia="Times New Roman" w:hAnsi="Cambria Math" w:cs="Lucida Sans Unicode"/>
           <w:i/>
@@ -6976,6 +6945,129 @@
           <w14:ligatures w14:val="none"/>
         </w:rPr>
       </w:pPr>
+      <m:oMathPara>
+        <m:oMath>
+          <m:r>
+            <w:rPr>
+              <w:rFonts w:ascii="Cambria Math" w:eastAsia="Times New Roman" w:hAnsi="Cambria Math" w:cs="Lucida Sans Unicode"/>
+              <w:color w:val="000000" w:themeColor="text1"/>
+              <w:kern w:val="0"/>
+              <w:sz w:val="22"/>
+              <w:szCs w:val="22"/>
+              <w:lang w:val="de-DE" w:eastAsia="de-DE"/>
+              <w14:ligatures w14:val="none"/>
+            </w:rPr>
+            <m:t>StateDis=0.2*MOD-0.3*FR+0.2*CE-0.1*FR*CE</m:t>
+          </m:r>
+        </m:oMath>
+      </m:oMathPara>
+    </w:p>
+    <w:p>
+      <w:pPr>
+        <w:spacing w:before="100" w:beforeAutospacing="1" w:after="100" w:afterAutospacing="1" w:line="360" w:lineRule="auto"/>
+        <w:jc w:val="center"/>
+        <w:rPr>
+          <w:rFonts w:ascii="Lucida Sans Unicode" w:eastAsia="Times New Roman" w:hAnsi="Lucida Sans Unicode" w:cs="Lucida Sans Unicode"/>
+          <w:iCs/>
+          <w:color w:val="000000" w:themeColor="text1"/>
+          <w:kern w:val="0"/>
+          <w:sz w:val="22"/>
+          <w:szCs w:val="22"/>
+          <w:lang w:val="de-DE" w:eastAsia="de-DE"/>
+          <w14:ligatures w14:val="none"/>
+        </w:rPr>
+      </w:pPr>
+      <w:r>
+        <w:rPr>
+          <w:rFonts w:ascii="Lucida Sans Unicode" w:eastAsia="Times New Roman" w:hAnsi="Lucida Sans Unicode" w:cs="Lucida Sans Unicode"/>
+          <w:iCs/>
+          <w:color w:val="EE0000"/>
+          <w:kern w:val="0"/>
+          <w:sz w:val="22"/>
+          <w:szCs w:val="22"/>
+          <w:lang w:val="de-DE" w:eastAsia="de-DE"/>
+          <w14:ligatures w14:val="none"/>
+        </w:rPr>
+        <w:drawing>
+          <wp:anchor distT="107950" distB="180340" distL="180340" distR="180340" simplePos="0" relativeHeight="251673600" behindDoc="0" locked="0" layoutInCell="1" allowOverlap="1" wp14:anchorId="4D428FE2" wp14:editId="5FE9B412">
+            <wp:simplePos x="0" y="0"/>
+            <wp:positionH relativeFrom="column">
+              <wp:posOffset>584466</wp:posOffset>
+            </wp:positionH>
+            <wp:positionV relativeFrom="paragraph">
+              <wp:posOffset>-123497</wp:posOffset>
+            </wp:positionV>
+            <wp:extent cx="4507200" cy="2674800"/>
+            <wp:effectExtent l="0" t="0" r="1905" b="5080"/>
+            <wp:wrapSquare wrapText="bothSides"/>
+            <wp:docPr id="1846413415" name="Grafik 1"/>
+            <wp:cNvGraphicFramePr>
+              <a:graphicFrameLocks xmlns:a="http://schemas.openxmlformats.org/drawingml/2006/main" noChangeAspect="1"/>
+            </wp:cNvGraphicFramePr>
+            <a:graphic xmlns:a="http://schemas.openxmlformats.org/drawingml/2006/main">
+              <a:graphicData uri="http://schemas.openxmlformats.org/drawingml/2006/picture">
+                <pic:pic xmlns:pic="http://schemas.openxmlformats.org/drawingml/2006/picture">
+                  <pic:nvPicPr>
+                    <pic:cNvPr id="1846413415" name=""/>
+                    <pic:cNvPicPr/>
+                  </pic:nvPicPr>
+                  <pic:blipFill rotWithShape="1">
+                    <a:blip r:embed="rId15" cstate="print">
+                      <a:extLst>
+                        <a:ext uri="{28A0092B-C50C-407E-A947-70E740481C1C}">
+                          <a14:useLocalDpi xmlns:a14="http://schemas.microsoft.com/office/drawing/2010/main" val="0"/>
+                        </a:ext>
+                      </a:extLst>
+                    </a:blip>
+                    <a:srcRect t="6178" b="1"/>
+                    <a:stretch>
+                      <a:fillRect/>
+                    </a:stretch>
+                  </pic:blipFill>
+                  <pic:spPr bwMode="auto">
+                    <a:xfrm>
+                      <a:off x="0" y="0"/>
+                      <a:ext cx="4507200" cy="2674800"/>
+                    </a:xfrm>
+                    <a:prstGeom prst="rect">
+                      <a:avLst/>
+                    </a:prstGeom>
+                    <a:ln>
+                      <a:noFill/>
+                    </a:ln>
+                    <a:extLst>
+                      <a:ext uri="{53640926-AAD7-44D8-BBD7-CCE9431645EC}">
+                        <a14:shadowObscured xmlns:a14="http://schemas.microsoft.com/office/drawing/2010/main"/>
+                      </a:ext>
+                    </a:extLst>
+                  </pic:spPr>
+                </pic:pic>
+              </a:graphicData>
+            </a:graphic>
+            <wp14:sizeRelH relativeFrom="margin">
+              <wp14:pctWidth>0</wp14:pctWidth>
+            </wp14:sizeRelH>
+            <wp14:sizeRelV relativeFrom="margin">
+              <wp14:pctHeight>0</wp14:pctHeight>
+            </wp14:sizeRelV>
+          </wp:anchor>
+        </w:drawing>
+      </w:r>
+    </w:p>
+    <w:p>
+      <w:pPr>
+        <w:spacing w:before="100" w:beforeAutospacing="1" w:after="100" w:afterAutospacing="1" w:line="360" w:lineRule="auto"/>
+        <w:rPr>
+          <w:rFonts w:ascii="Lucida Sans Unicode" w:eastAsia="Times New Roman" w:hAnsi="Lucida Sans Unicode" w:cs="Lucida Sans Unicode"/>
+          <w:iCs/>
+          <w:color w:val="000000" w:themeColor="text1"/>
+          <w:kern w:val="0"/>
+          <w:sz w:val="22"/>
+          <w:szCs w:val="22"/>
+          <w:lang w:val="de-DE" w:eastAsia="de-DE"/>
+          <w14:ligatures w14:val="none"/>
+        </w:rPr>
+      </w:pPr>
       <w:r>
         <w:rPr>
           <w:rFonts w:ascii="Lucida Sans Unicode" w:eastAsia="Times New Roman" w:hAnsi="Lucida Sans Unicode" w:cs="Lucida Sans Unicode"/>
@@ -6988,15 +7080,15 @@
         <mc:AlternateContent>
           <mc:Choice Requires="wps">
             <w:drawing>
-              <wp:anchor distT="0" distB="0" distL="114300" distR="114300" simplePos="0" relativeHeight="251675648" behindDoc="0" locked="0" layoutInCell="1" allowOverlap="1" wp14:anchorId="4E0A95F7" wp14:editId="1B91C79D">
+              <wp:anchor distT="0" distB="0" distL="114300" distR="114300" simplePos="0" relativeHeight="251675648" behindDoc="0" locked="0" layoutInCell="1" allowOverlap="1" wp14:anchorId="4E0A95F7" wp14:editId="0777AFDF">
                 <wp:simplePos x="0" y="0"/>
                 <wp:positionH relativeFrom="column">
-                  <wp:posOffset>450215</wp:posOffset>
+                  <wp:posOffset>589915</wp:posOffset>
                 </wp:positionH>
                 <wp:positionV relativeFrom="paragraph">
-                  <wp:posOffset>5627832</wp:posOffset>
+                  <wp:posOffset>2282825</wp:posOffset>
                 </wp:positionV>
-                <wp:extent cx="3699163" cy="415636"/>
+                <wp:extent cx="3698875" cy="415290"/>
                 <wp:effectExtent l="0" t="0" r="0" b="3810"/>
                 <wp:wrapNone/>
                 <wp:docPr id="158281654" name="Textfeld 2"/>
@@ -7008,7 +7100,7 @@
                       <wps:spPr>
                         <a:xfrm>
                           <a:off x="0" y="0"/>
-                          <a:ext cx="3699163" cy="415636"/>
+                          <a:ext cx="3698875" cy="415290"/>
                         </a:xfrm>
                         <a:prstGeom prst="rect">
                           <a:avLst/>
@@ -7092,7 +7184,7 @@
           </mc:Choice>
           <mc:Fallback>
             <w:pict>
-              <v:shape w14:anchorId="4E0A95F7" id="_x0000_s1031" type="#_x0000_t202" style="position:absolute;left:0;text-align:left;margin-left:35.45pt;margin-top:443.15pt;width:291.25pt;height:32.75pt;z-index:251675648;visibility:visible;mso-wrap-style:square;mso-width-percent:0;mso-height-percent:0;mso-wrap-distance-left:9pt;mso-wrap-distance-top:0;mso-wrap-distance-right:9pt;mso-wrap-distance-bottom:0;mso-position-horizontal:absolute;mso-position-horizontal-relative:text;mso-position-vertical:absolute;mso-position-vertical-relative:text;mso-width-percent:0;mso-height-percent:0;mso-width-relative:margin;mso-height-relative:margin;v-text-anchor:top" o:gfxdata="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" fillcolor="white [3201]" stroked="f" strokeweight=".5pt">
+              <v:shape w14:anchorId="4E0A95F7" id="_x0000_s1031" type="#_x0000_t202" style="position:absolute;margin-left:46.45pt;margin-top:179.75pt;width:291.25pt;height:32.7pt;z-index:251675648;visibility:visible;mso-wrap-style:square;mso-width-percent:0;mso-height-percent:0;mso-wrap-distance-left:9pt;mso-wrap-distance-top:0;mso-wrap-distance-right:9pt;mso-wrap-distance-bottom:0;mso-position-horizontal:absolute;mso-position-horizontal-relative:text;mso-position-vertical:absolute;mso-position-vertical-relative:text;mso-width-percent:0;mso-height-percent:0;mso-width-relative:margin;mso-height-relative:margin;v-text-anchor:top" o:gfxdata="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" fillcolor="white [3201]" stroked="f" strokeweight=".5pt">
                 <v:textbox>
                   <w:txbxContent>
                     <w:p>
@@ -7150,194 +7242,6 @@
           </mc:Fallback>
         </mc:AlternateContent>
       </w:r>
-      <w:r>
-        <w:rPr>
-          <w:rFonts w:ascii="Lucida Sans Unicode" w:eastAsia="Times New Roman" w:hAnsi="Lucida Sans Unicode" w:cs="Lucida Sans Unicode"/>
-          <w:iCs/>
-          <w:color w:val="EE0000"/>
-          <w:kern w:val="0"/>
-          <w:sz w:val="22"/>
-          <w:szCs w:val="22"/>
-          <w:lang w:val="de-DE" w:eastAsia="de-DE"/>
-          <w14:ligatures w14:val="none"/>
-        </w:rPr>
-        <w:drawing>
-          <wp:anchor distT="180340" distB="180340" distL="180340" distR="180340" simplePos="0" relativeHeight="251673600" behindDoc="0" locked="0" layoutInCell="1" allowOverlap="1" wp14:anchorId="4D428FE2" wp14:editId="5E88C2D9">
-            <wp:simplePos x="0" y="0"/>
-            <wp:positionH relativeFrom="column">
-              <wp:posOffset>353060</wp:posOffset>
-            </wp:positionH>
-            <wp:positionV relativeFrom="paragraph">
-              <wp:posOffset>2357928</wp:posOffset>
-            </wp:positionV>
-            <wp:extent cx="5346065" cy="3173730"/>
-            <wp:effectExtent l="0" t="0" r="635" b="1270"/>
-            <wp:wrapSquare wrapText="bothSides"/>
-            <wp:docPr id="1846413415" name="Grafik 1"/>
-            <wp:cNvGraphicFramePr>
-              <a:graphicFrameLocks xmlns:a="http://schemas.openxmlformats.org/drawingml/2006/main" noChangeAspect="1"/>
-            </wp:cNvGraphicFramePr>
-            <a:graphic xmlns:a="http://schemas.openxmlformats.org/drawingml/2006/main">
-              <a:graphicData uri="http://schemas.openxmlformats.org/drawingml/2006/picture">
-                <pic:pic xmlns:pic="http://schemas.openxmlformats.org/drawingml/2006/picture">
-                  <pic:nvPicPr>
-                    <pic:cNvPr id="1846413415" name=""/>
-                    <pic:cNvPicPr/>
-                  </pic:nvPicPr>
-                  <pic:blipFill rotWithShape="1">
-                    <a:blip r:embed="rId15" cstate="print">
-                      <a:extLst>
-                        <a:ext uri="{28A0092B-C50C-407E-A947-70E740481C1C}">
-                          <a14:useLocalDpi xmlns:a14="http://schemas.microsoft.com/office/drawing/2010/main" val="0"/>
-                        </a:ext>
-                      </a:extLst>
-                    </a:blip>
-                    <a:srcRect t="6178" b="1"/>
-                    <a:stretch>
-                      <a:fillRect/>
-                    </a:stretch>
-                  </pic:blipFill>
-                  <pic:spPr bwMode="auto">
-                    <a:xfrm>
-                      <a:off x="0" y="0"/>
-                      <a:ext cx="5346065" cy="3173730"/>
-                    </a:xfrm>
-                    <a:prstGeom prst="rect">
-                      <a:avLst/>
-                    </a:prstGeom>
-                    <a:ln>
-                      <a:noFill/>
-                    </a:ln>
-                    <a:extLst>
-                      <a:ext uri="{53640926-AAD7-44D8-BBD7-CCE9431645EC}">
-                        <a14:shadowObscured xmlns:a14="http://schemas.microsoft.com/office/drawing/2010/main"/>
-                      </a:ext>
-                    </a:extLst>
-                  </pic:spPr>
-                </pic:pic>
-              </a:graphicData>
-            </a:graphic>
-            <wp14:sizeRelH relativeFrom="margin">
-              <wp14:pctWidth>0</wp14:pctWidth>
-            </wp14:sizeRelH>
-            <wp14:sizeRelV relativeFrom="margin">
-              <wp14:pctHeight>0</wp14:pctHeight>
-            </wp14:sizeRelV>
-          </wp:anchor>
-        </w:drawing>
-      </w:r>
-      <w:r>
-        <w:rPr>
-          <w:rFonts w:ascii="Lucida Sans Unicode" w:eastAsia="Times New Roman" w:hAnsi="Lucida Sans Unicode" w:cs="Lucida Sans Unicode"/>
-          <w:iCs/>
-          <w:color w:val="000000" w:themeColor="text1"/>
-          <w:kern w:val="0"/>
-          <w:sz w:val="22"/>
-          <w:szCs w:val="22"/>
-          <w:lang w:val="de-DE" w:eastAsia="de-DE"/>
-          <w14:ligatures w14:val="none"/>
-        </w:rPr>
-        <w:br/>
-      </w:r>
-      <w:r>
-        <w:rPr>
-          <w:rFonts w:ascii="Lucida Sans Unicode" w:eastAsia="Times New Roman" w:hAnsi="Lucida Sans Unicode" w:cs="Lucida Sans Unicode"/>
-          <w:iCs/>
-          <w:color w:val="000000" w:themeColor="text1"/>
-          <w:kern w:val="0"/>
-          <w:sz w:val="22"/>
-          <w:szCs w:val="22"/>
-          <w:lang w:val="de-DE" w:eastAsia="de-DE"/>
-          <w14:ligatures w14:val="none"/>
-        </w:rPr>
-        <w:t>State Disinhibition (D) finally results from the interplay of felt responsibility (A3), courage to express oneself (B3) and trait online disinhibition</w:t>
-      </w:r>
-      <w:r>
-        <w:rPr>
-          <w:rFonts w:ascii="Lucida Sans Unicode" w:eastAsia="Times New Roman" w:hAnsi="Lucida Sans Unicode" w:cs="Lucida Sans Unicode"/>
-          <w:iCs/>
-          <w:color w:val="000000" w:themeColor="text1"/>
-          <w:kern w:val="0"/>
-          <w:sz w:val="22"/>
-          <w:szCs w:val="22"/>
-          <w:lang w:val="de-DE" w:eastAsia="de-DE"/>
-          <w14:ligatures w14:val="none"/>
-        </w:rPr>
-        <w:t xml:space="preserve"> (MOD, </w:t>
-      </w:r>
-      <w:r>
-        <w:rPr>
-          <w:rFonts w:ascii="Lucida Sans Unicode" w:eastAsia="Times New Roman" w:hAnsi="Lucida Sans Unicode" w:cs="Lucida Sans Unicode"/>
-          <w:iCs/>
-          <w:color w:val="000000" w:themeColor="text1"/>
-          <w:kern w:val="0"/>
-          <w:sz w:val="22"/>
-          <w:szCs w:val="22"/>
-          <w:lang w:val="de-DE" w:eastAsia="de-DE"/>
-          <w14:ligatures w14:val="none"/>
-        </w:rPr>
-        <w:t>C). The mathematical relationship assumed incorporates main effects for theses predictors as well as an interaction term of felt responsibility and courage to express oneself</w:t>
-      </w:r>
-      <w:r>
-        <w:rPr>
-          <w:rFonts w:ascii="Lucida Sans Unicode" w:eastAsia="Times New Roman" w:hAnsi="Lucida Sans Unicode" w:cs="Lucida Sans Unicode"/>
-          <w:iCs/>
-          <w:color w:val="000000" w:themeColor="text1"/>
-          <w:kern w:val="0"/>
-          <w:sz w:val="22"/>
-          <w:szCs w:val="22"/>
-          <w:lang w:val="de-DE" w:eastAsia="de-DE"/>
-          <w14:ligatures w14:val="none"/>
-        </w:rPr>
-        <w:t>:</w:t>
-      </w:r>
-    </w:p>
-    <w:p>
-      <w:pPr>
-        <w:spacing w:before="100" w:beforeAutospacing="1" w:after="100" w:afterAutospacing="1" w:line="360" w:lineRule="auto"/>
-        <w:jc w:val="center"/>
-        <w:rPr>
-          <w:rFonts w:ascii="Lucida Sans Unicode" w:eastAsia="Times New Roman" w:hAnsi="Lucida Sans Unicode" w:cs="Lucida Sans Unicode"/>
-          <w:iCs/>
-          <w:color w:val="000000" w:themeColor="text1"/>
-          <w:kern w:val="0"/>
-          <w:sz w:val="22"/>
-          <w:szCs w:val="22"/>
-          <w:lang w:val="de-DE" w:eastAsia="de-DE"/>
-          <w14:ligatures w14:val="none"/>
-        </w:rPr>
-      </w:pPr>
-      <m:oMathPara>
-        <m:oMath>
-          <m:r>
-            <w:rPr>
-              <w:rFonts w:ascii="Cambria Math" w:eastAsia="Times New Roman" w:hAnsi="Cambria Math" w:cs="Lucida Sans Unicode"/>
-              <w:color w:val="000000" w:themeColor="text1"/>
-              <w:kern w:val="0"/>
-              <w:sz w:val="22"/>
-              <w:szCs w:val="22"/>
-              <w:lang w:val="de-DE" w:eastAsia="de-DE"/>
-              <w14:ligatures w14:val="none"/>
-            </w:rPr>
-            <m:t>StateDis=0.2*MOD-0.3*FR+0.2*CE-0.1*FR*CE</m:t>
-          </m:r>
-        </m:oMath>
-      </m:oMathPara>
-    </w:p>
-    <w:p>
-      <w:pPr>
-        <w:spacing w:before="100" w:beforeAutospacing="1" w:after="100" w:afterAutospacing="1" w:line="360" w:lineRule="auto"/>
-        <w:rPr>
-          <w:rFonts w:ascii="Lucida Sans Unicode" w:eastAsia="Times New Roman" w:hAnsi="Lucida Sans Unicode" w:cs="Lucida Sans Unicode"/>
-          <w:iCs/>
-          <w:color w:val="000000" w:themeColor="text1"/>
-          <w:kern w:val="0"/>
-          <w:sz w:val="22"/>
-          <w:szCs w:val="22"/>
-          <w:lang w:val="de-DE" w:eastAsia="de-DE"/>
-          <w14:ligatures w14:val="none"/>
-        </w:rPr>
-      </w:pPr>
     </w:p>
     <w:p>
       <w:pPr>
@@ -7366,7 +7270,7 @@
         <mc:AlternateContent>
           <mc:Choice Requires="wps">
             <w:drawing>
-              <wp:anchor distT="0" distB="0" distL="114300" distR="114300" simplePos="0" relativeHeight="251677696" behindDoc="0" locked="0" layoutInCell="1" allowOverlap="1" wp14:anchorId="0546F22B" wp14:editId="22BD2C1D">
+              <wp:anchor distT="0" distB="0" distL="114300" distR="114300" simplePos="0" relativeHeight="251677696" behindDoc="0" locked="0" layoutInCell="1" allowOverlap="1" wp14:anchorId="0546F22B" wp14:editId="0D650525">
                 <wp:simplePos x="0" y="0"/>
                 <wp:positionH relativeFrom="column">
                   <wp:posOffset>-89293</wp:posOffset>
@@ -7540,7 +7444,7 @@
           <w14:ligatures w14:val="none"/>
         </w:rPr>
         <w:drawing>
-          <wp:anchor distT="180340" distB="180340" distL="180340" distR="180340" simplePos="0" relativeHeight="251672576" behindDoc="0" locked="0" layoutInCell="1" allowOverlap="1" wp14:anchorId="6F249956" wp14:editId="6BC546B7">
+          <wp:anchor distT="180340" distB="180340" distL="180340" distR="180340" simplePos="0" relativeHeight="251672576" behindDoc="0" locked="0" layoutInCell="1" allowOverlap="1" wp14:anchorId="6F249956" wp14:editId="4C3D4DBB">
             <wp:simplePos x="0" y="0"/>
             <wp:positionH relativeFrom="column">
               <wp:posOffset>-89064</wp:posOffset>
@@ -7549,7 +7453,7 @@
               <wp:posOffset>1503709</wp:posOffset>
             </wp:positionV>
             <wp:extent cx="5509260" cy="3250565"/>
-            <wp:effectExtent l="0" t="0" r="2540" b="635"/>
+            <wp:effectExtent l="0" t="0" r="0" b="0"/>
             <wp:wrapSquare wrapText="bothSides"/>
             <wp:docPr id="1530333469" name="Grafik 1"/>
             <wp:cNvGraphicFramePr>
@@ -7615,20 +7519,7 @@
           <w:lang w:val="de-DE" w:eastAsia="de-DE"/>
           <w14:ligatures w14:val="none"/>
         </w:rPr>
-        <w:t>Now, noise is added and the produced score</w:t>
-      </w:r>
-      <w:r>
-        <w:rPr>
-          <w:rFonts w:ascii="Lucida Sans Unicode" w:eastAsia="Times New Roman" w:hAnsi="Lucida Sans Unicode" w:cs="Lucida Sans Unicode"/>
-          <w:iCs/>
-          <w:color w:val="000000" w:themeColor="text1"/>
-          <w:kern w:val="0"/>
-          <w:sz w:val="22"/>
-          <w:szCs w:val="22"/>
-          <w:lang w:val="de-DE" w:eastAsia="de-DE"/>
-          <w14:ligatures w14:val="none"/>
-        </w:rPr>
-        <w:t xml:space="preserve"> is divided into intervals to determine the resulting categorial level of self-disclosure (E). Values in the range [0; 0.4] equates to „no self-disclosure“ in the expert rating, [0.4; 0.6] corresponds to „low self-disclosure“ and [0.6; 1] represents „high self-disclosure“.</w:t>
+        <w:t>Now, noise is added and the produced score is divided into intervals to determine the resulting categorial level of self-disclosure (E). Values in the range [0; 0.4] equates to „no self-disclosure“ in the expert rating, [0.4; 0.6] corresponds to „low self-disclosure“ and [0.6; 1] represents „high self-disclosure“.</w:t>
       </w:r>
     </w:p>
     <w:p>
@@ -7686,13 +7577,13 @@
           <w:szCs w:val="22"/>
         </w:rPr>
         <w:drawing>
-          <wp:anchor distT="180340" distB="0" distL="252095" distR="252095" simplePos="0" relativeHeight="251678720" behindDoc="0" locked="0" layoutInCell="1" allowOverlap="1" wp14:anchorId="4534E3E4" wp14:editId="10637D26">
+          <wp:anchor distT="180340" distB="0" distL="252095" distR="252095" simplePos="0" relativeHeight="251678720" behindDoc="0" locked="0" layoutInCell="1" allowOverlap="1" wp14:anchorId="4534E3E4" wp14:editId="627C59D9">
             <wp:simplePos x="0" y="0"/>
             <wp:positionH relativeFrom="column">
-              <wp:posOffset>-82550</wp:posOffset>
+              <wp:posOffset>-214897</wp:posOffset>
             </wp:positionH>
             <wp:positionV relativeFrom="paragraph">
-              <wp:posOffset>428625</wp:posOffset>
+              <wp:posOffset>488783</wp:posOffset>
             </wp:positionV>
             <wp:extent cx="3200400" cy="2095200"/>
             <wp:effectExtent l="0" t="0" r="0" b="635"/>
@@ -7767,75 +7658,239 @@
         <w:spacing w:line="360" w:lineRule="auto"/>
         <w:rPr>
           <w:rFonts w:ascii="Lucida Sans Unicode" w:hAnsi="Lucida Sans Unicode" w:cs="Lucida Sans Unicode"/>
-          <w:color w:val="EE0000"/>
-          <w:sz w:val="22"/>
-          <w:szCs w:val="22"/>
-        </w:rPr>
-      </w:pPr>
-      <w:r>
-        <w:rPr>
-          <w:rFonts w:ascii="Lucida Sans Unicode" w:hAnsi="Lucida Sans Unicode" w:cs="Lucida Sans Unicode"/>
-          <w:sz w:val="22"/>
-          <w:szCs w:val="22"/>
-        </w:rPr>
-        <w:t xml:space="preserve">A </w:t>
-      </w:r>
-      <w:r>
-        <w:rPr>
-          <w:rFonts w:ascii="Lucida Sans Unicode" w:hAnsi="Lucida Sans Unicode" w:cs="Lucida Sans Unicode"/>
-          <w:sz w:val="22"/>
-          <w:szCs w:val="22"/>
-        </w:rPr>
-        <w:t xml:space="preserve">sample of n = 400 observations was </w:t>
-      </w:r>
-      <w:r>
-        <w:rPr>
-          <w:rFonts w:ascii="Lucida Sans Unicode" w:hAnsi="Lucida Sans Unicode" w:cs="Lucida Sans Unicode"/>
-          <w:sz w:val="22"/>
-          <w:szCs w:val="22"/>
-        </w:rPr>
-        <w:t>simulated</w:t>
-      </w:r>
-      <w:r>
-        <w:rPr>
-          <w:rFonts w:ascii="Lucida Sans Unicode" w:hAnsi="Lucida Sans Unicode" w:cs="Lucida Sans Unicode"/>
-          <w:sz w:val="22"/>
-          <w:szCs w:val="22"/>
-        </w:rPr>
-        <w:t xml:space="preserve"> and tested against prespecified hypotheses.</w:t>
-      </w:r>
-      <w:r>
-        <w:rPr>
-          <w:rFonts w:ascii="Lucida Sans Unicode" w:hAnsi="Lucida Sans Unicode" w:cs="Lucida Sans Unicode"/>
-          <w:sz w:val="22"/>
-          <w:szCs w:val="22"/>
-        </w:rPr>
-        <w:t xml:space="preserve"> </w:t>
-      </w:r>
-      <w:r>
-        <w:rPr>
-          <w:rFonts w:ascii="Lucida Sans Unicode" w:hAnsi="Lucida Sans Unicode" w:cs="Lucida Sans Unicode"/>
-          <w:sz w:val="22"/>
-          <w:szCs w:val="22"/>
-        </w:rPr>
-        <w:t xml:space="preserve">The </w:t>
-      </w:r>
-      <w:r>
-        <w:rPr>
-          <w:rFonts w:ascii="Lucida Sans Unicode" w:hAnsi="Lucida Sans Unicode" w:cs="Lucida Sans Unicode"/>
-          <w:sz w:val="22"/>
-          <w:szCs w:val="22"/>
-        </w:rPr>
-        <w:t xml:space="preserve">results of the simulation can be observed in </w:t>
-      </w:r>
-      <w:r>
-        <w:rPr>
-          <w:rFonts w:ascii="Lucida Sans Unicode" w:hAnsi="Lucida Sans Unicode" w:cs="Lucida Sans Unicode"/>
-          <w:color w:val="EE0000"/>
-          <w:sz w:val="22"/>
-          <w:szCs w:val="22"/>
-        </w:rPr>
-        <w:t xml:space="preserve">Figures 8 and 9. </w:t>
+          <w:color w:val="000000" w:themeColor="text1"/>
+          <w:sz w:val="22"/>
+          <w:szCs w:val="22"/>
+        </w:rPr>
+      </w:pPr>
+      <w:r>
+        <w:rPr>
+          <w:rFonts w:ascii="Lucida Sans Unicode" w:eastAsia="Times New Roman" w:hAnsi="Lucida Sans Unicode" w:cs="Lucida Sans Unicode"/>
+          <w:color w:val="000000" w:themeColor="text1"/>
+          <w:kern w:val="0"/>
+          <w:sz w:val="22"/>
+          <w:szCs w:val="22"/>
+          <w:lang w:val="de-DE" w:eastAsia="de-DE"/>
+        </w:rPr>
+        <mc:AlternateContent>
+          <mc:Choice Requires="wps">
+            <w:drawing>
+              <wp:anchor distT="0" distB="0" distL="114300" distR="114300" simplePos="0" relativeHeight="251681792" behindDoc="0" locked="0" layoutInCell="1" allowOverlap="1" wp14:anchorId="5CE6EF78" wp14:editId="6CAC7087">
+                <wp:simplePos x="0" y="0"/>
+                <wp:positionH relativeFrom="column">
+                  <wp:posOffset>-334478</wp:posOffset>
+                </wp:positionH>
+                <wp:positionV relativeFrom="paragraph">
+                  <wp:posOffset>2155825</wp:posOffset>
+                </wp:positionV>
+                <wp:extent cx="3389971" cy="577516"/>
+                <wp:effectExtent l="0" t="0" r="1270" b="0"/>
+                <wp:wrapNone/>
+                <wp:docPr id="530824872" name="Textfeld 2"/>
+                <wp:cNvGraphicFramePr/>
+                <a:graphic xmlns:a="http://schemas.openxmlformats.org/drawingml/2006/main">
+                  <a:graphicData uri="http://schemas.microsoft.com/office/word/2010/wordprocessingShape">
+                    <wps:wsp>
+                      <wps:cNvSpPr txBox="1"/>
+                      <wps:spPr>
+                        <a:xfrm>
+                          <a:off x="0" y="0"/>
+                          <a:ext cx="3389971" cy="577516"/>
+                        </a:xfrm>
+                        <a:prstGeom prst="rect">
+                          <a:avLst/>
+                        </a:prstGeom>
+                        <a:solidFill>
+                          <a:schemeClr val="lt1"/>
+                        </a:solidFill>
+                        <a:ln w="6350">
+                          <a:noFill/>
+                        </a:ln>
+                      </wps:spPr>
+                      <wps:txbx>
+                        <w:txbxContent>
+                          <w:p>
+                            <w:pPr>
+                              <w:spacing w:line="240" w:lineRule="auto"/>
+                              <w:rPr>
+                                <w:rFonts w:ascii="Lucida Sans Unicode" w:hAnsi="Lucida Sans Unicode" w:cs="Lucida Sans Unicode"/>
+                                <w:sz w:val="15"/>
+                                <w:szCs w:val="15"/>
+                              </w:rPr>
+                            </w:pPr>
+                            <w:r>
+                              <w:rPr>
+                                <w:rFonts w:ascii="Lucida Sans Unicode" w:hAnsi="Lucida Sans Unicode" w:cs="Lucida Sans Unicode"/>
+                                <w:b/>
+                                <w:bCs/>
+                                <w:sz w:val="15"/>
+                                <w:szCs w:val="15"/>
+                              </w:rPr>
+                              <w:t xml:space="preserve">Figure </w:t>
+                            </w:r>
+                            <w:r>
+                              <w:rPr>
+                                <w:rFonts w:ascii="Lucida Sans Unicode" w:hAnsi="Lucida Sans Unicode" w:cs="Lucida Sans Unicode"/>
+                                <w:b/>
+                                <w:bCs/>
+                                <w:sz w:val="15"/>
+                                <w:szCs w:val="15"/>
+                              </w:rPr>
+                              <w:t>8</w:t>
+                            </w:r>
+                            <w:r>
+                              <w:rPr>
+                                <w:rFonts w:ascii="Lucida Sans Unicode" w:hAnsi="Lucida Sans Unicode" w:cs="Lucida Sans Unicode"/>
+                                <w:i/>
+                                <w:iCs/>
+                                <w:sz w:val="15"/>
+                                <w:szCs w:val="15"/>
+                              </w:rPr>
+                              <w:br/>
+                            </w:r>
+                            <w:r>
+                              <w:rPr>
+                                <w:rFonts w:ascii="Lucida Sans Unicode" w:hAnsi="Lucida Sans Unicode" w:cs="Lucida Sans Unicode"/>
+                                <w:sz w:val="15"/>
+                                <w:szCs w:val="15"/>
+                              </w:rPr>
+                              <w:t xml:space="preserve">results (n=400) for state disinhibition based on simulated values for anonymity, interpersonal cues, MOD and </w:t>
+                            </w:r>
+                            <w:r>
+                              <w:rPr>
+                                <w:rFonts w:ascii="Lucida Sans Unicode" w:hAnsi="Lucida Sans Unicode" w:cs="Lucida Sans Unicode"/>
+                                <w:i/>
+                                <w:iCs/>
+                                <w:sz w:val="15"/>
+                                <w:szCs w:val="15"/>
+                              </w:rPr>
+                              <w:t>baseresp</w:t>
+                            </w:r>
+                          </w:p>
+                        </w:txbxContent>
+                      </wps:txbx>
+                      <wps:bodyPr rot="0" spcFirstLastPara="0" vertOverflow="overflow" horzOverflow="overflow" vert="horz" wrap="square" lIns="91440" tIns="45720" rIns="91440" bIns="45720" numCol="1" spcCol="0" rtlCol="0" fromWordArt="0" anchor="t" anchorCtr="0" forceAA="0" compatLnSpc="1">
+                        <a:prstTxWarp prst="textNoShape">
+                          <a:avLst/>
+                        </a:prstTxWarp>
+                        <a:noAutofit/>
+                      </wps:bodyPr>
+                    </wps:wsp>
+                  </a:graphicData>
+                </a:graphic>
+                <wp14:sizeRelH relativeFrom="margin">
+                  <wp14:pctWidth>0</wp14:pctWidth>
+                </wp14:sizeRelH>
+                <wp14:sizeRelV relativeFrom="margin">
+                  <wp14:pctHeight>0</wp14:pctHeight>
+                </wp14:sizeRelV>
+              </wp:anchor>
+            </w:drawing>
+          </mc:Choice>
+          <mc:Fallback>
+            <w:pict>
+              <v:shape w14:anchorId="5CE6EF78" id="_x0000_s1033" type="#_x0000_t202" style="position:absolute;margin-left:-26.35pt;margin-top:169.75pt;width:266.95pt;height:45.45pt;z-index:251681792;visibility:visible;mso-wrap-style:square;mso-width-percent:0;mso-height-percent:0;mso-wrap-distance-left:9pt;mso-wrap-distance-top:0;mso-wrap-distance-right:9pt;mso-wrap-distance-bottom:0;mso-position-horizontal:absolute;mso-position-horizontal-relative:text;mso-position-vertical:absolute;mso-position-vertical-relative:text;mso-width-percent:0;mso-height-percent:0;mso-width-relative:margin;mso-height-relative:margin;v-text-anchor:top" o:gfxdata="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" fillcolor="white [3201]" stroked="f" strokeweight=".5pt">
+                <v:textbox>
+                  <w:txbxContent>
+                    <w:p>
+                      <w:pPr>
+                        <w:spacing w:line="240" w:lineRule="auto"/>
+                        <w:rPr>
+                          <w:rFonts w:ascii="Lucida Sans Unicode" w:hAnsi="Lucida Sans Unicode" w:cs="Lucida Sans Unicode"/>
+                          <w:sz w:val="15"/>
+                          <w:szCs w:val="15"/>
+                        </w:rPr>
+                      </w:pPr>
+                      <w:r>
+                        <w:rPr>
+                          <w:rFonts w:ascii="Lucida Sans Unicode" w:hAnsi="Lucida Sans Unicode" w:cs="Lucida Sans Unicode"/>
+                          <w:b/>
+                          <w:bCs/>
+                          <w:sz w:val="15"/>
+                          <w:szCs w:val="15"/>
+                        </w:rPr>
+                        <w:t xml:space="preserve">Figure </w:t>
+                      </w:r>
+                      <w:r>
+                        <w:rPr>
+                          <w:rFonts w:ascii="Lucida Sans Unicode" w:hAnsi="Lucida Sans Unicode" w:cs="Lucida Sans Unicode"/>
+                          <w:b/>
+                          <w:bCs/>
+                          <w:sz w:val="15"/>
+                          <w:szCs w:val="15"/>
+                        </w:rPr>
+                        <w:t>8</w:t>
+                      </w:r>
+                      <w:r>
+                        <w:rPr>
+                          <w:rFonts w:ascii="Lucida Sans Unicode" w:hAnsi="Lucida Sans Unicode" w:cs="Lucida Sans Unicode"/>
+                          <w:i/>
+                          <w:iCs/>
+                          <w:sz w:val="15"/>
+                          <w:szCs w:val="15"/>
+                        </w:rPr>
+                        <w:br/>
+                      </w:r>
+                      <w:r>
+                        <w:rPr>
+                          <w:rFonts w:ascii="Lucida Sans Unicode" w:hAnsi="Lucida Sans Unicode" w:cs="Lucida Sans Unicode"/>
+                          <w:sz w:val="15"/>
+                          <w:szCs w:val="15"/>
+                        </w:rPr>
+                        <w:t xml:space="preserve">results (n=400) for state disinhibition based on simulated values for anonymity, interpersonal cues, MOD and </w:t>
+                      </w:r>
+                      <w:r>
+                        <w:rPr>
+                          <w:rFonts w:ascii="Lucida Sans Unicode" w:hAnsi="Lucida Sans Unicode" w:cs="Lucida Sans Unicode"/>
+                          <w:i/>
+                          <w:iCs/>
+                          <w:sz w:val="15"/>
+                          <w:szCs w:val="15"/>
+                        </w:rPr>
+                        <w:t>baseresp</w:t>
+                      </w:r>
+                    </w:p>
+                  </w:txbxContent>
+                </v:textbox>
+              </v:shape>
+            </w:pict>
+          </mc:Fallback>
+        </mc:AlternateContent>
+      </w:r>
+      <w:r>
+        <w:rPr>
+          <w:rFonts w:ascii="Lucida Sans Unicode" w:hAnsi="Lucida Sans Unicode" w:cs="Lucida Sans Unicode"/>
+          <w:sz w:val="22"/>
+          <w:szCs w:val="22"/>
+        </w:rPr>
+        <w:t xml:space="preserve">Values (n =400) for anonymity, interpersonal cues, MOD (from beta(4, 4)) and </w:t>
+      </w:r>
+      <w:r>
+        <w:rPr>
+          <w:rFonts w:ascii="Lucida Sans Unicode" w:hAnsi="Lucida Sans Unicode" w:cs="Lucida Sans Unicode"/>
+          <w:i/>
+          <w:iCs/>
+          <w:sz w:val="22"/>
+          <w:szCs w:val="22"/>
+        </w:rPr>
+        <w:t>baseresp</w:t>
+      </w:r>
+      <w:r>
+        <w:rPr>
+          <w:rFonts w:ascii="Lucida Sans Unicode" w:hAnsi="Lucida Sans Unicode" w:cs="Lucida Sans Unicode"/>
+          <w:sz w:val="22"/>
+          <w:szCs w:val="22"/>
+        </w:rPr>
+        <w:t xml:space="preserve"> (from beta (4, 1.5)) were simulated and tested a</w:t>
+      </w:r>
+      <w:r>
+        <w:rPr>
+          <w:rFonts w:ascii="Lucida Sans Unicode" w:hAnsi="Lucida Sans Unicode" w:cs="Lucida Sans Unicode"/>
+          <w:color w:val="000000" w:themeColor="text1"/>
+          <w:sz w:val="22"/>
+          <w:szCs w:val="22"/>
+        </w:rPr>
+        <w:t>gainst prespecified hypotheses. The results of the simulation are shown in Figures 8 and 9.</w:t>
       </w:r>
     </w:p>
     <w:p>
@@ -7843,19 +7898,12 @@
         <w:spacing w:line="360" w:lineRule="auto"/>
         <w:rPr>
           <w:rFonts w:ascii="Lucida Sans Unicode" w:hAnsi="Lucida Sans Unicode" w:cs="Lucida Sans Unicode"/>
-          <w:sz w:val="22"/>
-          <w:szCs w:val="22"/>
-        </w:rPr>
-      </w:pPr>
-      <w:r>
-        <w:rPr>
-          <w:rFonts w:ascii="Lucida Sans Unicode" w:hAnsi="Lucida Sans Unicode" w:cs="Lucida Sans Unicode"/>
-          <w:color w:val="EE0000"/>
-          <w:sz w:val="22"/>
-          <w:szCs w:val="22"/>
-        </w:rPr>
-        <w:t>Daten für MOD und baseresp simuliert aus beta-Verteilungen?</w:t>
-      </w:r>
+          <w:b/>
+          <w:bCs/>
+          <w:sz w:val="22"/>
+          <w:szCs w:val="22"/>
+        </w:rPr>
+      </w:pPr>
     </w:p>
     <w:p>
       <w:pPr>
@@ -7868,22 +7916,7 @@
           <w:szCs w:val="22"/>
         </w:rPr>
       </w:pPr>
-    </w:p>
-    <w:p>
-      <w:pPr>
-        <w:spacing w:line="360" w:lineRule="auto"/>
-        <w:rPr>
-          <w:rFonts w:ascii="Lucida Sans Unicode" w:hAnsi="Lucida Sans Unicode" w:cs="Lucida Sans Unicode"/>
-          <w:b/>
-          <w:bCs/>
-          <w:sz w:val="22"/>
-          <w:szCs w:val="22"/>
-        </w:rPr>
-      </w:pPr>
-    </w:p>
-    <w:p>
-      <w:pPr>
-        <w:spacing w:line="360" w:lineRule="auto"/>
+      <w:r>
         <w:rPr>
           <w:rFonts w:ascii="Lucida Sans Unicode" w:hAnsi="Lucida Sans Unicode" w:cs="Lucida Sans Unicode"/>
           <w:b/>
@@ -7893,28 +7926,18 @@
           <w:sz w:val="22"/>
           <w:szCs w:val="22"/>
         </w:rPr>
-      </w:pPr>
-      <w:r>
-        <w:rPr>
-          <w:rFonts w:ascii="Lucida Sans Unicode" w:hAnsi="Lucida Sans Unicode" w:cs="Lucida Sans Unicode"/>
-          <w:b/>
-          <w:bCs/>
-          <w:i/>
-          <w:iCs/>
-          <w:sz w:val="22"/>
-          <w:szCs w:val="22"/>
-        </w:rPr>
+        <w:lastRenderedPageBreak/>
         <w:drawing>
-          <wp:anchor distT="0" distB="0" distL="114300" distR="114300" simplePos="0" relativeHeight="251679744" behindDoc="0" locked="0" layoutInCell="1" allowOverlap="1" wp14:anchorId="4C22A0C7" wp14:editId="075CDBA8">
+          <wp:anchor distT="0" distB="0" distL="114300" distR="114300" simplePos="0" relativeHeight="251679744" behindDoc="0" locked="0" layoutInCell="1" allowOverlap="1" wp14:anchorId="4C22A0C7" wp14:editId="733B3DF5">
             <wp:simplePos x="0" y="0"/>
             <wp:positionH relativeFrom="column">
-              <wp:posOffset>-3175</wp:posOffset>
+              <wp:posOffset>459105</wp:posOffset>
             </wp:positionH>
             <wp:positionV relativeFrom="paragraph">
-              <wp:posOffset>0</wp:posOffset>
+              <wp:posOffset>134</wp:posOffset>
             </wp:positionV>
-            <wp:extent cx="3843655" cy="2501900"/>
-            <wp:effectExtent l="0" t="0" r="4445" b="0"/>
+            <wp:extent cx="4535805" cy="2952115"/>
+            <wp:effectExtent l="0" t="0" r="0" b="0"/>
             <wp:wrapSquare wrapText="bothSides"/>
             <wp:docPr id="79189741" name="Grafik 1"/>
             <wp:cNvGraphicFramePr>
@@ -7942,7 +7965,7 @@
                   <pic:spPr>
                     <a:xfrm>
                       <a:off x="0" y="0"/>
-                      <a:ext cx="3843655" cy="2501900"/>
+                      <a:ext cx="4535805" cy="2952115"/>
                     </a:xfrm>
                     <a:prstGeom prst="rect">
                       <a:avLst/>
@@ -8044,6 +8067,264 @@
           <w:szCs w:val="22"/>
         </w:rPr>
       </w:pPr>
+      <w:r>
+        <w:rPr>
+          <w:rFonts w:ascii="Lucida Sans Unicode" w:eastAsia="Times New Roman" w:hAnsi="Lucida Sans Unicode" w:cs="Lucida Sans Unicode"/>
+          <w:color w:val="000000" w:themeColor="text1"/>
+          <w:kern w:val="0"/>
+          <w:sz w:val="22"/>
+          <w:szCs w:val="22"/>
+          <w:lang w:val="de-DE" w:eastAsia="de-DE"/>
+        </w:rPr>
+        <mc:AlternateContent>
+          <mc:Choice Requires="wps">
+            <w:drawing>
+              <wp:anchor distT="0" distB="0" distL="114300" distR="114300" simplePos="0" relativeHeight="251683840" behindDoc="0" locked="0" layoutInCell="1" allowOverlap="1" wp14:anchorId="1D589A91" wp14:editId="4E647F7F">
+                <wp:simplePos x="0" y="0"/>
+                <wp:positionH relativeFrom="column">
+                  <wp:posOffset>158349</wp:posOffset>
+                </wp:positionH>
+                <wp:positionV relativeFrom="paragraph">
+                  <wp:posOffset>407770</wp:posOffset>
+                </wp:positionV>
+                <wp:extent cx="4439653" cy="577516"/>
+                <wp:effectExtent l="0" t="0" r="5715" b="0"/>
+                <wp:wrapNone/>
+                <wp:docPr id="1201761122" name="Textfeld 2"/>
+                <wp:cNvGraphicFramePr/>
+                <a:graphic xmlns:a="http://schemas.openxmlformats.org/drawingml/2006/main">
+                  <a:graphicData uri="http://schemas.microsoft.com/office/word/2010/wordprocessingShape">
+                    <wps:wsp>
+                      <wps:cNvSpPr txBox="1"/>
+                      <wps:spPr>
+                        <a:xfrm>
+                          <a:off x="0" y="0"/>
+                          <a:ext cx="4439653" cy="577516"/>
+                        </a:xfrm>
+                        <a:prstGeom prst="rect">
+                          <a:avLst/>
+                        </a:prstGeom>
+                        <a:solidFill>
+                          <a:schemeClr val="lt1"/>
+                        </a:solidFill>
+                        <a:ln w="6350">
+                          <a:noFill/>
+                        </a:ln>
+                      </wps:spPr>
+                      <wps:txbx>
+                        <w:txbxContent>
+                          <w:p>
+                            <w:pPr>
+                              <w:spacing w:line="240" w:lineRule="auto"/>
+                              <w:rPr>
+                                <w:rFonts w:ascii="Lucida Sans Unicode" w:hAnsi="Lucida Sans Unicode" w:cs="Lucida Sans Unicode"/>
+                                <w:sz w:val="15"/>
+                                <w:szCs w:val="15"/>
+                              </w:rPr>
+                            </w:pPr>
+                            <w:r>
+                              <w:rPr>
+                                <w:rFonts w:ascii="Lucida Sans Unicode" w:hAnsi="Lucida Sans Unicode" w:cs="Lucida Sans Unicode"/>
+                                <w:b/>
+                                <w:bCs/>
+                                <w:sz w:val="15"/>
+                                <w:szCs w:val="15"/>
+                              </w:rPr>
+                              <w:t xml:space="preserve">Figure </w:t>
+                            </w:r>
+                            <w:r>
+                              <w:rPr>
+                                <w:rFonts w:ascii="Lucida Sans Unicode" w:hAnsi="Lucida Sans Unicode" w:cs="Lucida Sans Unicode"/>
+                                <w:b/>
+                                <w:bCs/>
+                                <w:sz w:val="15"/>
+                                <w:szCs w:val="15"/>
+                              </w:rPr>
+                              <w:t>8</w:t>
+                            </w:r>
+                            <w:r>
+                              <w:rPr>
+                                <w:rFonts w:ascii="Lucida Sans Unicode" w:hAnsi="Lucida Sans Unicode" w:cs="Lucida Sans Unicode"/>
+                                <w:i/>
+                                <w:iCs/>
+                                <w:sz w:val="15"/>
+                                <w:szCs w:val="15"/>
+                              </w:rPr>
+                              <w:br/>
+                            </w:r>
+                            <w:r>
+                              <w:rPr>
+                                <w:rFonts w:ascii="Lucida Sans Unicode" w:hAnsi="Lucida Sans Unicode" w:cs="Lucida Sans Unicode"/>
+                                <w:sz w:val="15"/>
+                                <w:szCs w:val="15"/>
+                              </w:rPr>
+                              <w:t xml:space="preserve">results (n=400) for </w:t>
+                            </w:r>
+                            <w:r>
+                              <w:rPr>
+                                <w:rFonts w:ascii="Lucida Sans Unicode" w:hAnsi="Lucida Sans Unicode" w:cs="Lucida Sans Unicode"/>
+                                <w:sz w:val="15"/>
+                                <w:szCs w:val="15"/>
+                              </w:rPr>
+                              <w:t xml:space="preserve">expert-rated level of </w:t>
+                            </w:r>
+                            <w:r>
+                              <w:rPr>
+                                <w:rFonts w:ascii="Lucida Sans Unicode" w:hAnsi="Lucida Sans Unicode" w:cs="Lucida Sans Unicode"/>
+                                <w:sz w:val="15"/>
+                                <w:szCs w:val="15"/>
+                              </w:rPr>
+                              <w:t>s</w:t>
+                            </w:r>
+                            <w:r>
+                              <w:rPr>
+                                <w:rFonts w:ascii="Lucida Sans Unicode" w:hAnsi="Lucida Sans Unicode" w:cs="Lucida Sans Unicode"/>
+                                <w:sz w:val="15"/>
+                                <w:szCs w:val="15"/>
+                              </w:rPr>
+                              <w:t xml:space="preserve">elf-disclosure </w:t>
+                            </w:r>
+                            <w:r>
+                              <w:rPr>
+                                <w:rFonts w:ascii="Lucida Sans Unicode" w:hAnsi="Lucida Sans Unicode" w:cs="Lucida Sans Unicode"/>
+                                <w:sz w:val="15"/>
+                                <w:szCs w:val="15"/>
+                              </w:rPr>
+                              <w:t xml:space="preserve">based on simulated values for anonymity, interpersonal cues, MOD and </w:t>
+                            </w:r>
+                            <w:r>
+                              <w:rPr>
+                                <w:rFonts w:ascii="Lucida Sans Unicode" w:hAnsi="Lucida Sans Unicode" w:cs="Lucida Sans Unicode"/>
+                                <w:i/>
+                                <w:iCs/>
+                                <w:sz w:val="15"/>
+                                <w:szCs w:val="15"/>
+                              </w:rPr>
+                              <w:t>baseresp</w:t>
+                            </w:r>
+                          </w:p>
+                        </w:txbxContent>
+                      </wps:txbx>
+                      <wps:bodyPr rot="0" spcFirstLastPara="0" vertOverflow="overflow" horzOverflow="overflow" vert="horz" wrap="square" lIns="91440" tIns="45720" rIns="91440" bIns="45720" numCol="1" spcCol="0" rtlCol="0" fromWordArt="0" anchor="t" anchorCtr="0" forceAA="0" compatLnSpc="1">
+                        <a:prstTxWarp prst="textNoShape">
+                          <a:avLst/>
+                        </a:prstTxWarp>
+                        <a:noAutofit/>
+                      </wps:bodyPr>
+                    </wps:wsp>
+                  </a:graphicData>
+                </a:graphic>
+                <wp14:sizeRelH relativeFrom="margin">
+                  <wp14:pctWidth>0</wp14:pctWidth>
+                </wp14:sizeRelH>
+                <wp14:sizeRelV relativeFrom="margin">
+                  <wp14:pctHeight>0</wp14:pctHeight>
+                </wp14:sizeRelV>
+              </wp:anchor>
+            </w:drawing>
+          </mc:Choice>
+          <mc:Fallback>
+            <w:pict>
+              <v:shape w14:anchorId="1D589A91" id="_x0000_s1034" type="#_x0000_t202" style="position:absolute;margin-left:12.45pt;margin-top:32.1pt;width:349.6pt;height:45.45pt;z-index:251683840;visibility:visible;mso-wrap-style:square;mso-width-percent:0;mso-height-percent:0;mso-wrap-distance-left:9pt;mso-wrap-distance-top:0;mso-wrap-distance-right:9pt;mso-wrap-distance-bottom:0;mso-position-horizontal:absolute;mso-position-horizontal-relative:text;mso-position-vertical:absolute;mso-position-vertical-relative:text;mso-width-percent:0;mso-height-percent:0;mso-width-relative:margin;mso-height-relative:margin;v-text-anchor:top" o:gfxdata="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" fillcolor="white [3201]" stroked="f" strokeweight=".5pt">
+                <v:textbox>
+                  <w:txbxContent>
+                    <w:p>
+                      <w:pPr>
+                        <w:spacing w:line="240" w:lineRule="auto"/>
+                        <w:rPr>
+                          <w:rFonts w:ascii="Lucida Sans Unicode" w:hAnsi="Lucida Sans Unicode" w:cs="Lucida Sans Unicode"/>
+                          <w:sz w:val="15"/>
+                          <w:szCs w:val="15"/>
+                        </w:rPr>
+                      </w:pPr>
+                      <w:r>
+                        <w:rPr>
+                          <w:rFonts w:ascii="Lucida Sans Unicode" w:hAnsi="Lucida Sans Unicode" w:cs="Lucida Sans Unicode"/>
+                          <w:b/>
+                          <w:bCs/>
+                          <w:sz w:val="15"/>
+                          <w:szCs w:val="15"/>
+                        </w:rPr>
+                        <w:t xml:space="preserve">Figure </w:t>
+                      </w:r>
+                      <w:r>
+                        <w:rPr>
+                          <w:rFonts w:ascii="Lucida Sans Unicode" w:hAnsi="Lucida Sans Unicode" w:cs="Lucida Sans Unicode"/>
+                          <w:b/>
+                          <w:bCs/>
+                          <w:sz w:val="15"/>
+                          <w:szCs w:val="15"/>
+                        </w:rPr>
+                        <w:t>8</w:t>
+                      </w:r>
+                      <w:r>
+                        <w:rPr>
+                          <w:rFonts w:ascii="Lucida Sans Unicode" w:hAnsi="Lucida Sans Unicode" w:cs="Lucida Sans Unicode"/>
+                          <w:i/>
+                          <w:iCs/>
+                          <w:sz w:val="15"/>
+                          <w:szCs w:val="15"/>
+                        </w:rPr>
+                        <w:br/>
+                      </w:r>
+                      <w:r>
+                        <w:rPr>
+                          <w:rFonts w:ascii="Lucida Sans Unicode" w:hAnsi="Lucida Sans Unicode" w:cs="Lucida Sans Unicode"/>
+                          <w:sz w:val="15"/>
+                          <w:szCs w:val="15"/>
+                        </w:rPr>
+                        <w:t xml:space="preserve">results (n=400) for </w:t>
+                      </w:r>
+                      <w:r>
+                        <w:rPr>
+                          <w:rFonts w:ascii="Lucida Sans Unicode" w:hAnsi="Lucida Sans Unicode" w:cs="Lucida Sans Unicode"/>
+                          <w:sz w:val="15"/>
+                          <w:szCs w:val="15"/>
+                        </w:rPr>
+                        <w:t xml:space="preserve">expert-rated level of </w:t>
+                      </w:r>
+                      <w:r>
+                        <w:rPr>
+                          <w:rFonts w:ascii="Lucida Sans Unicode" w:hAnsi="Lucida Sans Unicode" w:cs="Lucida Sans Unicode"/>
+                          <w:sz w:val="15"/>
+                          <w:szCs w:val="15"/>
+                        </w:rPr>
+                        <w:t>s</w:t>
+                      </w:r>
+                      <w:r>
+                        <w:rPr>
+                          <w:rFonts w:ascii="Lucida Sans Unicode" w:hAnsi="Lucida Sans Unicode" w:cs="Lucida Sans Unicode"/>
+                          <w:sz w:val="15"/>
+                          <w:szCs w:val="15"/>
+                        </w:rPr>
+                        <w:t xml:space="preserve">elf-disclosure </w:t>
+                      </w:r>
+                      <w:r>
+                        <w:rPr>
+                          <w:rFonts w:ascii="Lucida Sans Unicode" w:hAnsi="Lucida Sans Unicode" w:cs="Lucida Sans Unicode"/>
+                          <w:sz w:val="15"/>
+                          <w:szCs w:val="15"/>
+                        </w:rPr>
+                        <w:t xml:space="preserve">based on simulated values for anonymity, interpersonal cues, MOD and </w:t>
+                      </w:r>
+                      <w:r>
+                        <w:rPr>
+                          <w:rFonts w:ascii="Lucida Sans Unicode" w:hAnsi="Lucida Sans Unicode" w:cs="Lucida Sans Unicode"/>
+                          <w:i/>
+                          <w:iCs/>
+                          <w:sz w:val="15"/>
+                          <w:szCs w:val="15"/>
+                        </w:rPr>
+                        <w:t>baseresp</w:t>
+                      </w:r>
+                    </w:p>
+                  </w:txbxContent>
+                </v:textbox>
+              </v:shape>
+            </w:pict>
+          </mc:Fallback>
+        </mc:AlternateContent>
+      </w:r>
     </w:p>
     <w:p>
       <w:pPr>
@@ -8058,7 +8339,10 @@
           <w:szCs w:val="22"/>
         </w:rPr>
       </w:pPr>
-      <w:r>
+    </w:p>
+    <w:p>
+      <w:pPr>
+        <w:spacing w:line="360" w:lineRule="auto"/>
         <w:rPr>
           <w:rFonts w:ascii="Lucida Sans Unicode" w:hAnsi="Lucida Sans Unicode" w:cs="Lucida Sans Unicode"/>
           <w:b/>
@@ -8068,27 +8352,7 @@
           <w:sz w:val="22"/>
           <w:szCs w:val="22"/>
         </w:rPr>
-        <w:t xml:space="preserve">Hypotheses </w:t>
-      </w:r>
-    </w:p>
-    <w:p>
-      <w:pPr>
-        <w:spacing w:line="360" w:lineRule="auto"/>
-        <w:ind w:firstLine="709"/>
-        <w:rPr>
-          <w:rFonts w:ascii="Lucida Sans Unicode" w:hAnsi="Lucida Sans Unicode" w:cs="Lucida Sans Unicode"/>
-          <w:sz w:val="22"/>
-          <w:szCs w:val="22"/>
-        </w:rPr>
-      </w:pPr>
-      <w:r>
-        <w:rPr>
-          <w:rFonts w:ascii="Lucida Sans Unicode" w:hAnsi="Lucida Sans Unicode" w:cs="Lucida Sans Unicode"/>
-          <w:sz w:val="22"/>
-          <w:szCs w:val="22"/>
-        </w:rPr>
-        <w:t xml:space="preserve">Our hypotheses followed directly from the theoretical assumptions by Suler (2004) on which we based our model. We hypothesized that there would be (1) a positive main effect for anonymity on the observable level of self-disclosure, (2) a negative main effect for the number of interpersonal cues on the observable level of self-disclosure and (3) a significant interaction between anonymity and the number of interpersonal cues. </w:t>
-      </w:r>
+      </w:pPr>
     </w:p>
     <w:p>
       <w:pPr>
@@ -8113,58 +8377,42 @@
           <w:sz w:val="22"/>
           <w:szCs w:val="22"/>
         </w:rPr>
-        <w:t xml:space="preserve">Results </w:t>
+        <w:t xml:space="preserve">Hypotheses </w:t>
       </w:r>
     </w:p>
     <w:p>
       <w:pPr>
         <w:spacing w:line="360" w:lineRule="auto"/>
-        <w:rPr>
-          <w:rFonts w:ascii="Lucida Sans Unicode" w:hAnsi="Lucida Sans Unicode" w:cs="Lucida Sans Unicode"/>
-          <w:sz w:val="22"/>
-          <w:szCs w:val="22"/>
-        </w:rPr>
-      </w:pPr>
-      <w:r>
-        <w:rPr>
-          <w:rFonts w:ascii="Lucida Sans Unicode" w:hAnsi="Lucida Sans Unicode" w:cs="Lucida Sans Unicode"/>
-          <w:sz w:val="22"/>
-          <w:szCs w:val="22"/>
-        </w:rPr>
-        <w:t>Utilizing an ordinal logistic regression from the R-package MASS (</w:t>
-      </w:r>
-      <w:r>
-        <w:rPr>
-          <w:rFonts w:ascii="Lucida Sans Unicode" w:hAnsi="Lucida Sans Unicode" w:cs="Lucida Sans Unicode"/>
-          <w:color w:val="EE0000"/>
-          <w:sz w:val="22"/>
-          <w:szCs w:val="22"/>
-        </w:rPr>
-        <w:t>source</w:t>
-      </w:r>
-      <w:r>
-        <w:rPr>
-          <w:rFonts w:ascii="Lucida Sans Unicode" w:hAnsi="Lucida Sans Unicode" w:cs="Lucida Sans Unicode"/>
-          <w:sz w:val="22"/>
-          <w:szCs w:val="22"/>
-        </w:rPr>
-        <w:t xml:space="preserve">), odds ratios were calculated and a one-sided t-test was performed for each hypothesis. </w:t>
-      </w:r>
-      <w:r>
-        <w:rPr>
-          <w:rFonts w:ascii="Lucida Sans Unicode" w:hAnsi="Lucida Sans Unicode" w:cs="Lucida Sans Unicode"/>
-          <w:sz w:val="22"/>
-          <w:szCs w:val="22"/>
-        </w:rPr>
-        <w:t>The results are reported in Table 2</w:t>
-      </w:r>
-      <w:r>
-        <w:rPr>
-          <w:rFonts w:ascii="Lucida Sans Unicode" w:hAnsi="Lucida Sans Unicode" w:cs="Lucida Sans Unicode"/>
-          <w:sz w:val="22"/>
-          <w:szCs w:val="22"/>
-        </w:rPr>
-        <w:t>.</w:t>
+        <w:ind w:firstLine="709"/>
+        <w:rPr>
+          <w:rFonts w:ascii="Lucida Sans Unicode" w:hAnsi="Lucida Sans Unicode" w:cs="Lucida Sans Unicode"/>
+          <w:sz w:val="22"/>
+          <w:szCs w:val="22"/>
+        </w:rPr>
+      </w:pPr>
+      <w:r>
+        <w:rPr>
+          <w:rFonts w:ascii="Lucida Sans Unicode" w:hAnsi="Lucida Sans Unicode" w:cs="Lucida Sans Unicode"/>
+          <w:sz w:val="22"/>
+          <w:szCs w:val="22"/>
+        </w:rPr>
+        <w:t>Our hypotheses followed directly from the theoretical assumptions by Suler (2004) on which we based our model. We hypothesized that there would be (1) a positive main effect for anonymity on the observable level of self-disclosure, (2) a negative main effect for the number of interpersonal cues on the observable level of self-disclosure and (3) a significant interaction between anonymity and the number of interpersonal cues</w:t>
+      </w:r>
+      <w:r>
+        <w:rPr>
+          <w:rFonts w:ascii="Lucida Sans Unicode" w:hAnsi="Lucida Sans Unicode" w:cs="Lucida Sans Unicode"/>
+          <w:sz w:val="22"/>
+          <w:szCs w:val="22"/>
+        </w:rPr>
+        <w:t xml:space="preserve"> regarding the observable level of self-disclosure</w:t>
+      </w:r>
+      <w:r>
+        <w:rPr>
+          <w:rFonts w:ascii="Lucida Sans Unicode" w:hAnsi="Lucida Sans Unicode" w:cs="Lucida Sans Unicode"/>
+          <w:sz w:val="22"/>
+          <w:szCs w:val="22"/>
+        </w:rPr>
+        <w:t xml:space="preserve">. </w:t>
       </w:r>
     </w:p>
     <w:p>
@@ -8174,6 +8422,8 @@
           <w:rFonts w:ascii="Lucida Sans Unicode" w:hAnsi="Lucida Sans Unicode" w:cs="Lucida Sans Unicode"/>
           <w:b/>
           <w:bCs/>
+          <w:i/>
+          <w:iCs/>
           <w:sz w:val="22"/>
           <w:szCs w:val="22"/>
         </w:rPr>
@@ -8183,9 +8433,126 @@
           <w:rFonts w:ascii="Lucida Sans Unicode" w:hAnsi="Lucida Sans Unicode" w:cs="Lucida Sans Unicode"/>
           <w:b/>
           <w:bCs/>
-          <w:sz w:val="22"/>
-          <w:szCs w:val="22"/>
-        </w:rPr>
+          <w:i/>
+          <w:iCs/>
+          <w:sz w:val="22"/>
+          <w:szCs w:val="22"/>
+        </w:rPr>
+        <w:t xml:space="preserve">Results </w:t>
+      </w:r>
+    </w:p>
+    <w:p>
+      <w:pPr>
+        <w:spacing w:line="360" w:lineRule="auto"/>
+        <w:rPr>
+          <w:rFonts w:ascii="Lucida Sans Unicode" w:hAnsi="Lucida Sans Unicode" w:cs="Lucida Sans Unicode"/>
+          <w:color w:val="000000" w:themeColor="text1"/>
+          <w:sz w:val="22"/>
+          <w:szCs w:val="22"/>
+        </w:rPr>
+      </w:pPr>
+      <w:r>
+        <w:rPr>
+          <w:rFonts w:ascii="Lucida Sans Unicode" w:hAnsi="Lucida Sans Unicode" w:cs="Lucida Sans Unicode"/>
+          <w:color w:val="000000" w:themeColor="text1"/>
+          <w:sz w:val="22"/>
+          <w:szCs w:val="22"/>
+        </w:rPr>
+        <w:t>Utilizing an ordinal logistic regression from the R-package MASS (</w:t>
+      </w:r>
+      <w:r>
+        <w:rPr>
+          <w:rFonts w:ascii="Lucida Sans Unicode" w:hAnsi="Lucida Sans Unicode" w:cs="Lucida Sans Unicode"/>
+          <w:color w:val="000000" w:themeColor="text1"/>
+          <w:sz w:val="22"/>
+          <w:szCs w:val="22"/>
+        </w:rPr>
+        <w:t>Vena</w:t>
+      </w:r>
+      <w:r>
+        <w:rPr>
+          <w:rFonts w:ascii="Lucida Sans Unicode" w:hAnsi="Lucida Sans Unicode" w:cs="Lucida Sans Unicode"/>
+          <w:color w:val="000000" w:themeColor="text1"/>
+          <w:sz w:val="22"/>
+          <w:szCs w:val="22"/>
+        </w:rPr>
+        <w:t>bles &amp; Ripley, 2002</w:t>
+      </w:r>
+      <w:r>
+        <w:rPr>
+          <w:rFonts w:ascii="Lucida Sans Unicode" w:hAnsi="Lucida Sans Unicode" w:cs="Lucida Sans Unicode"/>
+          <w:color w:val="000000" w:themeColor="text1"/>
+          <w:sz w:val="22"/>
+          <w:szCs w:val="22"/>
+        </w:rPr>
+        <w:t>), odds ratios were calculated</w:t>
+      </w:r>
+      <w:r>
+        <w:rPr>
+          <w:rFonts w:ascii="Lucida Sans Unicode" w:hAnsi="Lucida Sans Unicode" w:cs="Lucida Sans Unicode"/>
+          <w:color w:val="000000" w:themeColor="text1"/>
+          <w:sz w:val="22"/>
+          <w:szCs w:val="22"/>
+        </w:rPr>
+        <w:t>. One-sided t-tests were performed for hypotheses 1 and 2 and a two-sided t-test for hypothsis 3.</w:t>
+      </w:r>
+    </w:p>
+    <w:p>
+      <w:pPr>
+        <w:spacing w:line="360" w:lineRule="auto"/>
+        <w:rPr>
+          <w:rFonts w:ascii="Lucida Sans Unicode" w:hAnsi="Lucida Sans Unicode" w:cs="Lucida Sans Unicode"/>
+          <w:b/>
+          <w:bCs/>
+          <w:sz w:val="22"/>
+          <w:szCs w:val="22"/>
+        </w:rPr>
+      </w:pPr>
+    </w:p>
+    <w:p>
+      <w:pPr>
+        <w:spacing w:line="360" w:lineRule="auto"/>
+        <w:rPr>
+          <w:rFonts w:ascii="Lucida Sans Unicode" w:hAnsi="Lucida Sans Unicode" w:cs="Lucida Sans Unicode"/>
+          <w:b/>
+          <w:bCs/>
+          <w:sz w:val="22"/>
+          <w:szCs w:val="22"/>
+        </w:rPr>
+      </w:pPr>
+    </w:p>
+    <w:p>
+      <w:pPr>
+        <w:spacing w:line="360" w:lineRule="auto"/>
+        <w:rPr>
+          <w:rFonts w:ascii="Lucida Sans Unicode" w:hAnsi="Lucida Sans Unicode" w:cs="Lucida Sans Unicode"/>
+          <w:b/>
+          <w:bCs/>
+          <w:sz w:val="22"/>
+          <w:szCs w:val="22"/>
+        </w:rPr>
+      </w:pPr>
+    </w:p>
+    <w:p>
+      <w:pPr>
+        <w:spacing w:line="360" w:lineRule="auto"/>
+        <w:rPr>
+          <w:rFonts w:ascii="Lucida Sans Unicode" w:hAnsi="Lucida Sans Unicode" w:cs="Lucida Sans Unicode"/>
+          <w:b/>
+          <w:bCs/>
+          <w:sz w:val="22"/>
+          <w:szCs w:val="22"/>
+        </w:rPr>
+      </w:pPr>
+      <w:r>
+        <w:rPr>
+          <w:rFonts w:ascii="Lucida Sans Unicode" w:hAnsi="Lucida Sans Unicode" w:cs="Lucida Sans Unicode"/>
+          <w:b/>
+          <w:bCs/>
+          <w:sz w:val="22"/>
+          <w:szCs w:val="22"/>
+        </w:rPr>
+        <w:lastRenderedPageBreak/>
         <w:t xml:space="preserve">Table 2 </w:t>
       </w:r>
     </w:p>
@@ -8471,7 +8838,6 @@
                 <w:sz w:val="22"/>
                 <w:szCs w:val="22"/>
               </w:rPr>
-              <w:lastRenderedPageBreak/>
               <w:t>number of interpersonal cues</w:t>
             </w:r>
           </w:p>
@@ -8651,7 +9017,7 @@
                 <w:sz w:val="22"/>
                 <w:szCs w:val="22"/>
               </w:rPr>
-              <w:t>0,98</w:t>
+              <w:t>4.470472e-02</w:t>
             </w:r>
           </w:p>
         </w:tc>
@@ -8672,81 +9038,257 @@
         <w:spacing w:line="360" w:lineRule="auto"/>
         <w:rPr>
           <w:rFonts w:ascii="Lucida Sans Unicode" w:hAnsi="Lucida Sans Unicode" w:cs="Lucida Sans Unicode"/>
-          <w:color w:val="EE0000"/>
-          <w:sz w:val="22"/>
-          <w:szCs w:val="22"/>
-        </w:rPr>
-      </w:pPr>
-      <w:r>
-        <w:rPr>
-          <w:rFonts w:ascii="Lucida Sans Unicode" w:hAnsi="Lucida Sans Unicode" w:cs="Lucida Sans Unicode"/>
-          <w:color w:val="EE0000"/>
-          <w:sz w:val="22"/>
-          <w:szCs w:val="22"/>
-        </w:rPr>
-        <w:t xml:space="preserve">Die ergebnisse bestätigen die ersten beiden Hypothesen. </w:t>
+          <w:sz w:val="22"/>
+          <w:szCs w:val="22"/>
+        </w:rPr>
+      </w:pPr>
+      <w:r>
+        <w:rPr>
+          <w:rFonts w:ascii="Lucida Sans Unicode" w:hAnsi="Lucida Sans Unicode" w:cs="Lucida Sans Unicode"/>
+          <w:sz w:val="22"/>
+          <w:szCs w:val="22"/>
+        </w:rPr>
+        <w:t>Our results are consistent with the hypotheses. Odds for a higher level of self-disclosure increase significantly by the factor 14.13 in completely anonymous online contexts compared to non-anonymous contexts.</w:t>
+      </w:r>
+      <w:r>
+        <w:rPr>
+          <w:rFonts w:ascii="Lucida Sans Unicode" w:hAnsi="Lucida Sans Unicode" w:cs="Lucida Sans Unicode"/>
+          <w:sz w:val="22"/>
+          <w:szCs w:val="22"/>
+        </w:rPr>
+        <w:t xml:space="preserve"> Similarly, odds decrease significantly by the factor 0.29 if online interactions are highly visible compared to the lowest possible level of visible cues. It is worth noting that the estimate for anonymity is very high overall, and particularly in comparison to that of interpersonal cues. In theory, these effects should not differ so greatly and it is not clear which part of our model caused this.</w:t>
+      </w:r>
+      <w:r>
+        <w:rPr>
+          <w:rFonts w:ascii="Lucida Sans Unicode" w:hAnsi="Lucida Sans Unicode" w:cs="Lucida Sans Unicode"/>
+          <w:sz w:val="22"/>
+          <w:szCs w:val="22"/>
+        </w:rPr>
+        <w:br/>
+        <w:t>Lastly, the interaction between anonymity and interpersonal cues also turned out to be significant. Given the strong result of anonymity, the direction of this interaction is somewhat non-intuitive: When an online context is both highly anonymous and characterized by a high number of interpersonal cues, odds for a higher level of self-disclosure decrease. Hence, visiblity seems to be the more important factor in our model, even though the small effect size seems to suggest otherwise.</w:t>
       </w:r>
     </w:p>
     <w:p>
       <w:pPr>
         <w:spacing w:line="360" w:lineRule="auto"/>
-        <w:rPr>
-          <w:rFonts w:ascii="Lucida Sans Unicode" w:hAnsi="Lucida Sans Unicode" w:cs="Lucida Sans Unicode"/>
-          <w:color w:val="EE0000"/>
-          <w:sz w:val="22"/>
-          <w:szCs w:val="22"/>
-        </w:rPr>
-      </w:pPr>
-      <w:r>
-        <w:rPr>
-          <w:rFonts w:ascii="Lucida Sans Unicode" w:hAnsi="Lucida Sans Unicode" w:cs="Lucida Sans Unicode"/>
-          <w:color w:val="EE0000"/>
-          <w:sz w:val="22"/>
-          <w:szCs w:val="22"/>
-        </w:rPr>
-        <w:t xml:space="preserve">Interpretation Odds Ratio anonymity und invisibility. </w:t>
-      </w:r>
-      <w:r>
-        <w:rPr>
-          <w:rFonts w:ascii="Lucida Sans Unicode" w:hAnsi="Lucida Sans Unicode" w:cs="Lucida Sans Unicode"/>
-          <w:color w:val="EE0000"/>
-          <w:sz w:val="22"/>
-          <w:szCs w:val="22"/>
-        </w:rPr>
-        <w:t>Odds Ratio von Anonymity sind tatsächlich sehr hoch, höher als vermutet?</w:t>
+        <w:jc w:val="center"/>
+        <w:rPr>
+          <w:rFonts w:ascii="Lucida Sans Unicode" w:hAnsi="Lucida Sans Unicode" w:cs="Lucida Sans Unicode"/>
+          <w:b/>
+          <w:bCs/>
+          <w:sz w:val="22"/>
+          <w:szCs w:val="22"/>
+        </w:rPr>
+      </w:pPr>
+      <w:r>
+        <w:rPr>
+          <w:rFonts w:ascii="Lucida Sans Unicode" w:hAnsi="Lucida Sans Unicode" w:cs="Lucida Sans Unicode"/>
+          <w:b/>
+          <w:bCs/>
+          <w:sz w:val="22"/>
+          <w:szCs w:val="22"/>
+        </w:rPr>
+        <w:t>Discussion and Meta-Reflection</w:t>
       </w:r>
     </w:p>
     <w:p>
       <w:pPr>
-        <w:spacing w:line="360" w:lineRule="auto"/>
-        <w:rPr>
-          <w:rFonts w:ascii="Lucida Sans Unicode" w:hAnsi="Lucida Sans Unicode" w:cs="Lucida Sans Unicode"/>
-          <w:color w:val="EE0000"/>
-          <w:sz w:val="22"/>
-          <w:szCs w:val="22"/>
-        </w:rPr>
-      </w:pPr>
-      <w:r>
-        <w:rPr>
-          <w:rFonts w:ascii="Lucida Sans Unicode" w:hAnsi="Lucida Sans Unicode" w:cs="Lucida Sans Unicode"/>
-          <w:color w:val="EE0000"/>
-          <w:sz w:val="22"/>
-          <w:szCs w:val="22"/>
-        </w:rPr>
-        <w:t>Interaktionseffekt von anonymity und nic zeigt sich nicht in den Ergebnissen (Odds Ratio gehen sogar in die andere Richtung, deuten auf negativen Interaktionseffekt hin)</w:t>
-      </w:r>
-      <w:r>
-        <w:rPr>
-          <w:rFonts w:ascii="Lucida Sans Unicode" w:hAnsi="Lucida Sans Unicode" w:cs="Lucida Sans Unicode"/>
-          <w:color w:val="EE0000"/>
-          <w:sz w:val="22"/>
-          <w:szCs w:val="22"/>
-        </w:rPr>
-        <w:t>. Das könnte aber auch daran liegen, dass wir den Interaktionseffekt in unserem Modell sehr klein gemacht haben.</w:t>
+        <w:spacing w:before="100" w:beforeAutospacing="1" w:after="100" w:afterAutospacing="1" w:line="360" w:lineRule="auto"/>
+        <w:rPr>
+          <w:rFonts w:ascii="Lucida Sans Unicode" w:eastAsia="Times New Roman" w:hAnsi="Lucida Sans Unicode" w:cs="Lucida Sans Unicode"/>
+          <w:kern w:val="0"/>
+          <w:sz w:val="22"/>
+          <w:szCs w:val="22"/>
+          <w:lang w:eastAsia="de-DE"/>
+          <w14:ligatures w14:val="none"/>
+        </w:rPr>
+      </w:pPr>
+      <w:r>
+        <w:rPr>
+          <w:rFonts w:ascii="Lucida Sans Unicode" w:eastAsia="Times New Roman" w:hAnsi="Lucida Sans Unicode" w:cs="Lucida Sans Unicode"/>
+          <w:kern w:val="0"/>
+          <w:sz w:val="22"/>
+          <w:szCs w:val="22"/>
+          <w:lang w:eastAsia="de-DE"/>
+          <w14:ligatures w14:val="none"/>
+        </w:rPr>
+        <w:t xml:space="preserve">Suler’s (2004) framework for the Online Disinhibition Effect was much mor extensive than we had initially anticipated. Although we imposed significant theoretical </w:t>
+      </w:r>
+      <w:r>
+        <w:rPr>
+          <w:rFonts w:ascii="Lucida Sans Unicode" w:eastAsia="Times New Roman" w:hAnsi="Lucida Sans Unicode" w:cs="Lucida Sans Unicode"/>
+          <w:kern w:val="0"/>
+          <w:sz w:val="22"/>
+          <w:szCs w:val="22"/>
+          <w:lang w:eastAsia="de-DE"/>
+          <w14:ligatures w14:val="none"/>
+        </w:rPr>
+        <w:lastRenderedPageBreak/>
+        <w:t xml:space="preserve">constraints from the start (two instead of </w:t>
+      </w:r>
+      <w:r>
+        <w:rPr>
+          <w:rFonts w:ascii="Lucida Sans Unicode" w:eastAsia="Times New Roman" w:hAnsi="Lucida Sans Unicode" w:cs="Lucida Sans Unicode"/>
+          <w:kern w:val="0"/>
+          <w:sz w:val="22"/>
+          <w:szCs w:val="22"/>
+          <w:lang w:eastAsia="de-DE"/>
+          <w14:ligatures w14:val="none"/>
+        </w:rPr>
+        <w:t>six</w:t>
+      </w:r>
+      <w:r>
+        <w:rPr>
+          <w:rFonts w:ascii="Lucida Sans Unicode" w:eastAsia="Times New Roman" w:hAnsi="Lucida Sans Unicode" w:cs="Lucida Sans Unicode"/>
+          <w:kern w:val="0"/>
+          <w:sz w:val="22"/>
+          <w:szCs w:val="22"/>
+          <w:lang w:eastAsia="de-DE"/>
+          <w14:ligatures w14:val="none"/>
+        </w:rPr>
+        <w:t xml:space="preserve"> possible predictors), in hindsight we still did not narrow our scope enough to allow us to adress each of the individual variables within the formalization steps in a satisfying way.</w:t>
       </w:r>
     </w:p>
     <w:p>
       <w:pPr>
+        <w:spacing w:before="100" w:beforeAutospacing="1" w:after="100" w:afterAutospacing="1" w:line="360" w:lineRule="auto"/>
+        <w:rPr>
+          <w:rFonts w:ascii="Lucida Sans Unicode" w:eastAsia="Times New Roman" w:hAnsi="Lucida Sans Unicode" w:cs="Lucida Sans Unicode"/>
+          <w:kern w:val="0"/>
+          <w:sz w:val="22"/>
+          <w:szCs w:val="22"/>
+          <w:lang w:eastAsia="de-DE"/>
+          <w14:ligatures w14:val="none"/>
+        </w:rPr>
+      </w:pPr>
+      <w:r>
+        <w:rPr>
+          <w:rFonts w:ascii="Lucida Sans Unicode" w:eastAsia="Times New Roman" w:hAnsi="Lucida Sans Unicode" w:cs="Lucida Sans Unicode"/>
+          <w:kern w:val="0"/>
+          <w:sz w:val="22"/>
+          <w:szCs w:val="22"/>
+          <w:lang w:eastAsia="de-DE"/>
+          <w14:ligatures w14:val="none"/>
+        </w:rPr>
+        <w:t>In addition, the original literature was only of a very limited use, since Suler’s (2004) original paper seems to be based on heuristic reasoning rather than on empirical findings. Consequently, terms are used somewhat imprecisely and our search of literature that could provide hints for the mathematical formalization proved especially difficult. As a result, we were largely left on our own both in terms of conceptual development during the creation of the VAST and also when it came to the actual mathematical formalization. Making so many decisions mostly on our own often lead to uncertainty and swallowed a lot of our resources.</w:t>
+      </w:r>
+    </w:p>
+    <w:p>
+      <w:pPr>
+        <w:spacing w:before="100" w:beforeAutospacing="1" w:after="100" w:afterAutospacing="1" w:line="360" w:lineRule="auto"/>
+        <w:rPr>
+          <w:rFonts w:ascii="Lucida Sans Unicode" w:eastAsia="Times New Roman" w:hAnsi="Lucida Sans Unicode" w:cs="Lucida Sans Unicode"/>
+          <w:kern w:val="0"/>
+          <w:sz w:val="22"/>
+          <w:szCs w:val="22"/>
+          <w:lang w:eastAsia="de-DE"/>
+          <w14:ligatures w14:val="none"/>
+        </w:rPr>
+      </w:pPr>
+      <w:r>
+        <w:rPr>
+          <w:rFonts w:ascii="Lucida Sans Unicode" w:eastAsia="Times New Roman" w:hAnsi="Lucida Sans Unicode" w:cs="Lucida Sans Unicode"/>
+          <w:kern w:val="0"/>
+          <w:sz w:val="22"/>
+          <w:szCs w:val="22"/>
+          <w:lang w:eastAsia="de-DE"/>
+          <w14:ligatures w14:val="none"/>
+        </w:rPr>
+        <w:t>Still, despite this limitations, we were able to complete all steps of the formalization process and finally even produced acceptable results. Accordingly, I consider this semester’s seminar and the development of our model a complete success.</w:t>
+      </w:r>
+    </w:p>
+    <w:p>
+      <w:pPr>
+        <w:spacing w:line="360" w:lineRule="auto"/>
+        <w:rPr>
+          <w:rFonts w:ascii="Lucida Sans Unicode" w:hAnsi="Lucida Sans Unicode" w:cs="Lucida Sans Unicode"/>
+          <w:sz w:val="22"/>
+          <w:szCs w:val="22"/>
+        </w:rPr>
+      </w:pPr>
+    </w:p>
+    <w:p>
+      <w:pPr>
+        <w:spacing w:line="360" w:lineRule="auto"/>
+        <w:rPr>
+          <w:rFonts w:ascii="Lucida Sans Unicode" w:hAnsi="Lucida Sans Unicode" w:cs="Lucida Sans Unicode"/>
+          <w:sz w:val="22"/>
+          <w:szCs w:val="22"/>
+        </w:rPr>
+      </w:pPr>
+    </w:p>
+    <w:p>
+      <w:pPr>
+        <w:spacing w:line="360" w:lineRule="auto"/>
+        <w:rPr>
+          <w:rFonts w:ascii="Lucida Sans Unicode" w:hAnsi="Lucida Sans Unicode" w:cs="Lucida Sans Unicode"/>
+          <w:sz w:val="22"/>
+          <w:szCs w:val="22"/>
+        </w:rPr>
+      </w:pPr>
+    </w:p>
+    <w:p>
+      <w:pPr>
+        <w:spacing w:line="360" w:lineRule="auto"/>
+        <w:rPr>
+          <w:rFonts w:ascii="Lucida Sans Unicode" w:hAnsi="Lucida Sans Unicode" w:cs="Lucida Sans Unicode"/>
+          <w:sz w:val="22"/>
+          <w:szCs w:val="22"/>
+        </w:rPr>
+      </w:pPr>
+    </w:p>
+    <w:p>
+      <w:pPr>
+        <w:spacing w:line="360" w:lineRule="auto"/>
+        <w:rPr>
+          <w:rFonts w:ascii="Lucida Sans Unicode" w:hAnsi="Lucida Sans Unicode" w:cs="Lucida Sans Unicode"/>
+          <w:sz w:val="22"/>
+          <w:szCs w:val="22"/>
+        </w:rPr>
+      </w:pPr>
+    </w:p>
+    <w:p>
+      <w:pPr>
+        <w:spacing w:line="360" w:lineRule="auto"/>
+        <w:rPr>
+          <w:rFonts w:ascii="Lucida Sans Unicode" w:hAnsi="Lucida Sans Unicode" w:cs="Lucida Sans Unicode"/>
+          <w:sz w:val="22"/>
+          <w:szCs w:val="22"/>
+        </w:rPr>
+      </w:pPr>
+    </w:p>
+    <w:p>
+      <w:pPr>
+        <w:spacing w:line="360" w:lineRule="auto"/>
+        <w:rPr>
+          <w:rFonts w:ascii="Lucida Sans Unicode" w:hAnsi="Lucida Sans Unicode" w:cs="Lucida Sans Unicode"/>
+          <w:sz w:val="22"/>
+          <w:szCs w:val="22"/>
+        </w:rPr>
+      </w:pPr>
+    </w:p>
+    <w:p>
+      <w:pPr>
+        <w:spacing w:line="360" w:lineRule="auto"/>
+        <w:rPr>
+          <w:rFonts w:ascii="Lucida Sans Unicode" w:hAnsi="Lucida Sans Unicode" w:cs="Lucida Sans Unicode"/>
+          <w:sz w:val="22"/>
+          <w:szCs w:val="22"/>
+        </w:rPr>
+      </w:pPr>
+    </w:p>
+    <w:p>
+      <w:pPr>
+        <w:spacing w:line="360" w:lineRule="auto"/>
+        <w:rPr>
+          <w:rFonts w:ascii="Lucida Sans Unicode" w:hAnsi="Lucida Sans Unicode" w:cs="Lucida Sans Unicode"/>
+          <w:sz w:val="22"/>
+          <w:szCs w:val="22"/>
+        </w:rPr>
+      </w:pPr>
+    </w:p>
+    <w:p>
+      <w:pPr>
         <w:spacing w:line="360" w:lineRule="auto"/>
         <w:jc w:val="center"/>
         <w:rPr>
@@ -8765,281 +9307,12 @@
           <w:sz w:val="22"/>
           <w:szCs w:val="22"/>
         </w:rPr>
-        <w:t>Discussion and Meta-Reflection</w:t>
+        <w:lastRenderedPageBreak/>
+        <w:t>References</w:t>
       </w:r>
     </w:p>
     <w:p>
       <w:pPr>
-        <w:spacing w:before="100" w:beforeAutospacing="1" w:after="100" w:afterAutospacing="1" w:line="360" w:lineRule="auto"/>
-        <w:rPr>
-          <w:rFonts w:ascii="Lucida Sans Unicode" w:eastAsia="Times New Roman" w:hAnsi="Lucida Sans Unicode" w:cs="Lucida Sans Unicode"/>
-          <w:kern w:val="0"/>
-          <w:sz w:val="22"/>
-          <w:szCs w:val="22"/>
-          <w:lang w:eastAsia="de-DE"/>
-          <w14:ligatures w14:val="none"/>
-        </w:rPr>
-      </w:pPr>
-      <w:r>
-        <w:rPr>
-          <w:rFonts w:ascii="Lucida Sans Unicode" w:eastAsia="Times New Roman" w:hAnsi="Lucida Sans Unicode" w:cs="Lucida Sans Unicode"/>
-          <w:kern w:val="0"/>
-          <w:sz w:val="22"/>
-          <w:szCs w:val="22"/>
-          <w:lang w:eastAsia="de-DE"/>
-          <w14:ligatures w14:val="none"/>
-        </w:rPr>
-        <w:t>Suler’s (2004) framework for the Online Disinhibition Effect was much mor extensive than we had initially anticipated. Although we imposed significant theoretical constraints from the start (two instead of 6 possible predictors), in hindsight we still did not narrow our scope enough to allow us to adress each of the individual variables within the formalization steps in a satisfying way.</w:t>
-      </w:r>
-    </w:p>
-    <w:p>
-      <w:pPr>
-        <w:spacing w:before="100" w:beforeAutospacing="1" w:after="100" w:afterAutospacing="1" w:line="360" w:lineRule="auto"/>
-        <w:rPr>
-          <w:rFonts w:ascii="Lucida Sans Unicode" w:eastAsia="Times New Roman" w:hAnsi="Lucida Sans Unicode" w:cs="Lucida Sans Unicode"/>
-          <w:kern w:val="0"/>
-          <w:sz w:val="22"/>
-          <w:szCs w:val="22"/>
-          <w:lang w:eastAsia="de-DE"/>
-          <w14:ligatures w14:val="none"/>
-        </w:rPr>
-      </w:pPr>
-      <w:r>
-        <w:rPr>
-          <w:rFonts w:ascii="Lucida Sans Unicode" w:eastAsia="Times New Roman" w:hAnsi="Lucida Sans Unicode" w:cs="Lucida Sans Unicode"/>
-          <w:kern w:val="0"/>
-          <w:sz w:val="22"/>
-          <w:szCs w:val="22"/>
-          <w:lang w:eastAsia="de-DE"/>
-          <w14:ligatures w14:val="none"/>
-        </w:rPr>
-        <w:t xml:space="preserve">In addition, the original literature was only of a very limited use, since Suler’s (2004) original paper seems to be based on heuristic reasoning rather than on empirical findings. Consequently, terms are used somewhat imprecisely and our search of literature that could provide hints for the mathematical formalization proved especially difficult. As a result, we were largely left on our own both in terms of conceptual development during the creation of the VAST and also when it came to </w:t>
-      </w:r>
-      <w:r>
-        <w:rPr>
-          <w:rFonts w:ascii="Lucida Sans Unicode" w:eastAsia="Times New Roman" w:hAnsi="Lucida Sans Unicode" w:cs="Lucida Sans Unicode"/>
-          <w:kern w:val="0"/>
-          <w:sz w:val="22"/>
-          <w:szCs w:val="22"/>
-          <w:lang w:eastAsia="de-DE"/>
-          <w14:ligatures w14:val="none"/>
-        </w:rPr>
-        <w:lastRenderedPageBreak/>
-        <w:t>the actual mathematical formalization. Making so many decisions mostly on our own often lead to uncertainty and swallowed a lot of our resources.</w:t>
-      </w:r>
-    </w:p>
-    <w:p>
-      <w:pPr>
-        <w:spacing w:before="100" w:beforeAutospacing="1" w:after="100" w:afterAutospacing="1" w:line="360" w:lineRule="auto"/>
-        <w:rPr>
-          <w:rFonts w:ascii="Lucida Sans Unicode" w:eastAsia="Times New Roman" w:hAnsi="Lucida Sans Unicode" w:cs="Lucida Sans Unicode"/>
-          <w:kern w:val="0"/>
-          <w:sz w:val="22"/>
-          <w:szCs w:val="22"/>
-          <w:lang w:eastAsia="de-DE"/>
-          <w14:ligatures w14:val="none"/>
-        </w:rPr>
-      </w:pPr>
-      <w:r>
-        <w:rPr>
-          <w:rFonts w:ascii="Lucida Sans Unicode" w:eastAsia="Times New Roman" w:hAnsi="Lucida Sans Unicode" w:cs="Lucida Sans Unicode"/>
-          <w:kern w:val="0"/>
-          <w:sz w:val="22"/>
-          <w:szCs w:val="22"/>
-          <w:lang w:eastAsia="de-DE"/>
-          <w14:ligatures w14:val="none"/>
-        </w:rPr>
-        <w:t>Still, despite this limitations, we were able to complete all steps of the formalization process and finally even produced acceptable results. Accordingly, I consider this semester’s seminar and the development of our model a complete success.</w:t>
-      </w:r>
-    </w:p>
-    <w:p>
-      <w:pPr>
-        <w:spacing w:line="360" w:lineRule="auto"/>
-        <w:rPr>
-          <w:rFonts w:ascii="Lucida Sans Unicode" w:hAnsi="Lucida Sans Unicode" w:cs="Lucida Sans Unicode"/>
-          <w:b/>
-          <w:bCs/>
-          <w:sz w:val="22"/>
-          <w:szCs w:val="22"/>
-        </w:rPr>
-      </w:pPr>
-    </w:p>
-    <w:p>
-      <w:pPr>
-        <w:spacing w:line="360" w:lineRule="auto"/>
-        <w:rPr>
-          <w:rFonts w:ascii="Lucida Sans Unicode" w:hAnsi="Lucida Sans Unicode" w:cs="Lucida Sans Unicode"/>
-          <w:sz w:val="22"/>
-          <w:szCs w:val="22"/>
-        </w:rPr>
-      </w:pPr>
-    </w:p>
-    <w:p>
-      <w:pPr>
-        <w:spacing w:line="360" w:lineRule="auto"/>
-        <w:rPr>
-          <w:rFonts w:ascii="Lucida Sans Unicode" w:hAnsi="Lucida Sans Unicode" w:cs="Lucida Sans Unicode"/>
-          <w:sz w:val="22"/>
-          <w:szCs w:val="22"/>
-        </w:rPr>
-      </w:pPr>
-    </w:p>
-    <w:p>
-      <w:pPr>
-        <w:spacing w:line="360" w:lineRule="auto"/>
-        <w:rPr>
-          <w:rFonts w:ascii="Lucida Sans Unicode" w:hAnsi="Lucida Sans Unicode" w:cs="Lucida Sans Unicode"/>
-          <w:sz w:val="22"/>
-          <w:szCs w:val="22"/>
-        </w:rPr>
-      </w:pPr>
-    </w:p>
-    <w:p>
-      <w:pPr>
-        <w:spacing w:line="360" w:lineRule="auto"/>
-        <w:rPr>
-          <w:rFonts w:ascii="Lucida Sans Unicode" w:hAnsi="Lucida Sans Unicode" w:cs="Lucida Sans Unicode"/>
-          <w:sz w:val="22"/>
-          <w:szCs w:val="22"/>
-        </w:rPr>
-      </w:pPr>
-    </w:p>
-    <w:p>
-      <w:pPr>
-        <w:spacing w:line="360" w:lineRule="auto"/>
-        <w:rPr>
-          <w:rFonts w:ascii="Lucida Sans Unicode" w:hAnsi="Lucida Sans Unicode" w:cs="Lucida Sans Unicode"/>
-          <w:sz w:val="22"/>
-          <w:szCs w:val="22"/>
-        </w:rPr>
-      </w:pPr>
-    </w:p>
-    <w:p>
-      <w:pPr>
-        <w:spacing w:line="360" w:lineRule="auto"/>
-        <w:rPr>
-          <w:rFonts w:ascii="Lucida Sans Unicode" w:hAnsi="Lucida Sans Unicode" w:cs="Lucida Sans Unicode"/>
-          <w:sz w:val="22"/>
-          <w:szCs w:val="22"/>
-        </w:rPr>
-      </w:pPr>
-    </w:p>
-    <w:p>
-      <w:pPr>
-        <w:spacing w:line="360" w:lineRule="auto"/>
-        <w:rPr>
-          <w:rFonts w:ascii="Lucida Sans Unicode" w:hAnsi="Lucida Sans Unicode" w:cs="Lucida Sans Unicode"/>
-          <w:sz w:val="22"/>
-          <w:szCs w:val="22"/>
-        </w:rPr>
-      </w:pPr>
-    </w:p>
-    <w:p>
-      <w:pPr>
-        <w:spacing w:line="360" w:lineRule="auto"/>
-        <w:rPr>
-          <w:rFonts w:ascii="Lucida Sans Unicode" w:hAnsi="Lucida Sans Unicode" w:cs="Lucida Sans Unicode"/>
-          <w:sz w:val="22"/>
-          <w:szCs w:val="22"/>
-        </w:rPr>
-      </w:pPr>
-    </w:p>
-    <w:p>
-      <w:pPr>
-        <w:spacing w:line="360" w:lineRule="auto"/>
-        <w:rPr>
-          <w:rFonts w:ascii="Lucida Sans Unicode" w:hAnsi="Lucida Sans Unicode" w:cs="Lucida Sans Unicode"/>
-          <w:sz w:val="22"/>
-          <w:szCs w:val="22"/>
-        </w:rPr>
-      </w:pPr>
-    </w:p>
-    <w:p>
-      <w:pPr>
-        <w:spacing w:line="360" w:lineRule="auto"/>
-        <w:rPr>
-          <w:rFonts w:ascii="Lucida Sans Unicode" w:hAnsi="Lucida Sans Unicode" w:cs="Lucida Sans Unicode"/>
-          <w:sz w:val="22"/>
-          <w:szCs w:val="22"/>
-        </w:rPr>
-      </w:pPr>
-    </w:p>
-    <w:p>
-      <w:pPr>
-        <w:spacing w:line="360" w:lineRule="auto"/>
-        <w:rPr>
-          <w:rFonts w:ascii="Lucida Sans Unicode" w:hAnsi="Lucida Sans Unicode" w:cs="Lucida Sans Unicode"/>
-          <w:sz w:val="22"/>
-          <w:szCs w:val="22"/>
-        </w:rPr>
-      </w:pPr>
-    </w:p>
-    <w:p>
-      <w:pPr>
-        <w:spacing w:line="360" w:lineRule="auto"/>
-        <w:rPr>
-          <w:rFonts w:ascii="Lucida Sans Unicode" w:hAnsi="Lucida Sans Unicode" w:cs="Lucida Sans Unicode"/>
-          <w:sz w:val="22"/>
-          <w:szCs w:val="22"/>
-        </w:rPr>
-      </w:pPr>
-    </w:p>
-    <w:p>
-      <w:pPr>
-        <w:spacing w:line="360" w:lineRule="auto"/>
-        <w:rPr>
-          <w:rFonts w:ascii="Lucida Sans Unicode" w:hAnsi="Lucida Sans Unicode" w:cs="Lucida Sans Unicode"/>
-          <w:sz w:val="22"/>
-          <w:szCs w:val="22"/>
-        </w:rPr>
-      </w:pPr>
-    </w:p>
-    <w:p>
-      <w:pPr>
-        <w:spacing w:line="360" w:lineRule="auto"/>
-        <w:rPr>
-          <w:rFonts w:ascii="Lucida Sans Unicode" w:hAnsi="Lucida Sans Unicode" w:cs="Lucida Sans Unicode"/>
-          <w:sz w:val="22"/>
-          <w:szCs w:val="22"/>
-        </w:rPr>
-      </w:pPr>
-    </w:p>
-    <w:p>
-      <w:pPr>
-        <w:spacing w:line="360" w:lineRule="auto"/>
-        <w:rPr>
-          <w:rFonts w:ascii="Lucida Sans Unicode" w:hAnsi="Lucida Sans Unicode" w:cs="Lucida Sans Unicode"/>
-          <w:sz w:val="22"/>
-          <w:szCs w:val="22"/>
-        </w:rPr>
-      </w:pPr>
-    </w:p>
-    <w:p>
-      <w:pPr>
-        <w:spacing w:line="360" w:lineRule="auto"/>
-        <w:jc w:val="center"/>
-        <w:rPr>
-          <w:rFonts w:ascii="Lucida Sans Unicode" w:hAnsi="Lucida Sans Unicode" w:cs="Lucida Sans Unicode"/>
-          <w:b/>
-          <w:bCs/>
-          <w:sz w:val="22"/>
-          <w:szCs w:val="22"/>
-        </w:rPr>
-      </w:pPr>
-      <w:r>
-        <w:rPr>
-          <w:rFonts w:ascii="Lucida Sans Unicode" w:hAnsi="Lucida Sans Unicode" w:cs="Lucida Sans Unicode"/>
-          <w:b/>
-          <w:bCs/>
-          <w:sz w:val="22"/>
-          <w:szCs w:val="22"/>
-        </w:rPr>
-        <w:lastRenderedPageBreak/>
-        <w:t>References</w:t>
-      </w:r>
-    </w:p>
-    <w:p>
-      <w:pPr>
         <w:spacing w:line="360" w:lineRule="auto"/>
         <w:ind w:left="709" w:hanging="709"/>
         <w:rPr>
@@ -9054,23 +9327,7 @@
           <w:sz w:val="22"/>
           <w:szCs w:val="22"/>
         </w:rPr>
-        <w:t>Chen, X., Gang, L., Hu, Y., &amp; Li, Y. (2016). How anonymity influence self-disclosure tendency on</w:t>
-      </w:r>
-      <w:r>
-        <w:rPr>
-          <w:rFonts w:ascii="Lucida Sans Unicode" w:hAnsi="Lucida Sans Unicode" w:cs="Lucida Sans Unicode"/>
-          <w:sz w:val="22"/>
-          <w:szCs w:val="22"/>
-        </w:rPr>
-        <w:t xml:space="preserve"> </w:t>
-      </w:r>
-      <w:r>
-        <w:rPr>
-          <w:rFonts w:ascii="Lucida Sans Unicode" w:hAnsi="Lucida Sans Unicode" w:cs="Lucida Sans Unicode"/>
-          <w:sz w:val="22"/>
-          <w:szCs w:val="22"/>
-        </w:rPr>
-        <w:t>Sina Weibo. Anthropologist, 26, 217–226.</w:t>
+        <w:t>Chen, X., Gang, L., Hu, Y., &amp; Li, Y. (2016). How anonymity influence self-disclosure tendency on Sina Weibo. Anthropologist, 26, 217–226.</w:t>
       </w:r>
       <w:r>
         <w:rPr>
@@ -9850,16 +10107,6 @@
         </w:rPr>
         <w:t> </w:t>
       </w:r>
-    </w:p>
-    <w:p>
-      <w:pPr>
-        <w:spacing w:line="360" w:lineRule="auto"/>
-        <w:rPr>
-          <w:rFonts w:ascii="Lucida Sans Unicode" w:hAnsi="Lucida Sans Unicode" w:cs="Lucida Sans Unicode"/>
-          <w:sz w:val="22"/>
-          <w:szCs w:val="22"/>
-        </w:rPr>
-      </w:pPr>
     </w:p>
     <w:p>
       <w:pPr>

</xml_diff>

<commit_message>
checked code one last time, added final report
</commit_message>
<xml_diff>
--- a/manuscript/Entwurf_Bericht.docx
+++ b/manuscript/Entwurf_Bericht.docx
@@ -6989,13 +6989,13 @@
           <w14:ligatures w14:val="none"/>
         </w:rPr>
         <w:drawing>
-          <wp:anchor distT="107950" distB="180340" distL="180340" distR="180340" simplePos="0" relativeHeight="251673600" behindDoc="0" locked="0" layoutInCell="1" allowOverlap="1" wp14:anchorId="4D428FE2" wp14:editId="5FE9B412">
+          <wp:anchor distT="107950" distB="180340" distL="180340" distR="180340" simplePos="0" relativeHeight="251673600" behindDoc="0" locked="0" layoutInCell="1" allowOverlap="1" wp14:anchorId="4D428FE2" wp14:editId="1DAFE524">
             <wp:simplePos x="0" y="0"/>
             <wp:positionH relativeFrom="column">
-              <wp:posOffset>584466</wp:posOffset>
+              <wp:posOffset>581025</wp:posOffset>
             </wp:positionH>
             <wp:positionV relativeFrom="paragraph">
-              <wp:posOffset>-123497</wp:posOffset>
+              <wp:posOffset>-29210</wp:posOffset>
             </wp:positionV>
             <wp:extent cx="4507200" cy="2674800"/>
             <wp:effectExtent l="0" t="0" r="1905" b="5080"/>
@@ -12029,8 +12029,3503 @@
         </w:rPr>
       </w:pPr>
     </w:p>
+    <w:p>
+      <w:pPr>
+        <w:spacing w:line="360" w:lineRule="auto"/>
+        <w:rPr>
+          <w:rFonts w:ascii="Lucida Sans Unicode" w:hAnsi="Lucida Sans Unicode" w:cs="Lucida Sans Unicode"/>
+          <w:sz w:val="22"/>
+          <w:szCs w:val="22"/>
+        </w:rPr>
+      </w:pPr>
+    </w:p>
+    <w:p>
+      <w:pPr>
+        <w:spacing w:line="360" w:lineRule="auto"/>
+        <w:rPr>
+          <w:rFonts w:ascii="Lucida Sans Unicode" w:hAnsi="Lucida Sans Unicode" w:cs="Lucida Sans Unicode"/>
+          <w:sz w:val="22"/>
+          <w:szCs w:val="22"/>
+        </w:rPr>
+      </w:pPr>
+    </w:p>
+    <w:p>
+      <w:pPr>
+        <w:spacing w:line="360" w:lineRule="auto"/>
+        <w:rPr>
+          <w:rFonts w:ascii="Lucida Sans Unicode" w:hAnsi="Lucida Sans Unicode" w:cs="Lucida Sans Unicode"/>
+          <w:sz w:val="22"/>
+          <w:szCs w:val="22"/>
+        </w:rPr>
+        <w:sectPr>
+          <w:pgSz w:w="16838" w:h="11906" w:orient="landscape"/>
+          <w:pgMar w:top="1418" w:right="1418" w:bottom="1418" w:left="1418" w:header="708" w:footer="708" w:gutter="0"/>
+          <w:cols w:space="708"/>
+          <w:docGrid w:linePitch="360"/>
+        </w:sectPr>
+      </w:pPr>
+    </w:p>
+    <w:p>
+      <w:pPr>
+        <w:spacing w:line="360" w:lineRule="auto"/>
+        <w:rPr>
+          <w:rFonts w:ascii="Lucida Sans Unicode" w:hAnsi="Lucida Sans Unicode" w:cs="Lucida Sans Unicode"/>
+          <w:b/>
+          <w:bCs/>
+          <w:sz w:val="22"/>
+          <w:szCs w:val="22"/>
+        </w:rPr>
+      </w:pPr>
+      <w:r>
+        <w:rPr>
+          <w:rFonts w:ascii="Lucida Sans Unicode" w:hAnsi="Lucida Sans Unicode" w:cs="Lucida Sans Unicode"/>
+          <w:b/>
+          <w:bCs/>
+          <w:sz w:val="22"/>
+          <w:szCs w:val="22"/>
+        </w:rPr>
+        <w:lastRenderedPageBreak/>
+        <w:t xml:space="preserve">Appendix </w:t>
+      </w:r>
+      <w:r>
+        <w:rPr>
+          <w:rFonts w:ascii="Lucida Sans Unicode" w:hAnsi="Lucida Sans Unicode" w:cs="Lucida Sans Unicode"/>
+          <w:b/>
+          <w:bCs/>
+          <w:sz w:val="22"/>
+          <w:szCs w:val="22"/>
+        </w:rPr>
+        <w:t>B</w:t>
+      </w:r>
+      <w:r>
+        <w:rPr>
+          <w:rFonts w:ascii="Lucida Sans Unicode" w:hAnsi="Lucida Sans Unicode" w:cs="Lucida Sans Unicode"/>
+          <w:b/>
+          <w:bCs/>
+          <w:sz w:val="22"/>
+          <w:szCs w:val="22"/>
+        </w:rPr>
+        <w:t>: Statement on the use of generative AI and AI-assisted technologies in the writing process</w:t>
+      </w:r>
+    </w:p>
+    <w:p>
+      <w:pPr>
+        <w:spacing w:before="100" w:beforeAutospacing="1" w:after="100" w:afterAutospacing="1" w:line="240" w:lineRule="auto"/>
+        <w:rPr>
+          <w:rFonts w:ascii="Lucida Sans Unicode" w:eastAsia="Times New Roman" w:hAnsi="Lucida Sans Unicode" w:cs="Lucida Sans Unicode"/>
+          <w:noProof w:val="0"/>
+          <w:kern w:val="0"/>
+          <w:sz w:val="22"/>
+          <w:szCs w:val="22"/>
+          <w:lang w:val="de-DE" w:eastAsia="de-DE"/>
+          <w14:ligatures w14:val="none"/>
+        </w:rPr>
+      </w:pPr>
+      <w:r>
+        <w:rPr>
+          <w:rFonts w:ascii="Lucida Sans Unicode" w:eastAsia="Times New Roman" w:hAnsi="Lucida Sans Unicode" w:cs="Lucida Sans Unicode"/>
+          <w:noProof w:val="0"/>
+          <w:kern w:val="0"/>
+          <w:sz w:val="22"/>
+          <w:szCs w:val="22"/>
+          <w:lang w:val="de-DE" w:eastAsia="de-DE"/>
+          <w14:ligatures w14:val="none"/>
+        </w:rPr>
+        <w:t xml:space="preserve">In </w:t>
+      </w:r>
+      <w:proofErr w:type="spellStart"/>
+      <w:r>
+        <w:rPr>
+          <w:rFonts w:ascii="Lucida Sans Unicode" w:eastAsia="Times New Roman" w:hAnsi="Lucida Sans Unicode" w:cs="Lucida Sans Unicode"/>
+          <w:noProof w:val="0"/>
+          <w:kern w:val="0"/>
+          <w:sz w:val="22"/>
+          <w:szCs w:val="22"/>
+          <w:lang w:val="de-DE" w:eastAsia="de-DE"/>
+          <w14:ligatures w14:val="none"/>
+        </w:rPr>
+        <w:t>writing</w:t>
+      </w:r>
+      <w:proofErr w:type="spellEnd"/>
+      <w:r>
+        <w:rPr>
+          <w:rFonts w:ascii="Lucida Sans Unicode" w:eastAsia="Times New Roman" w:hAnsi="Lucida Sans Unicode" w:cs="Lucida Sans Unicode"/>
+          <w:noProof w:val="0"/>
+          <w:kern w:val="0"/>
+          <w:sz w:val="22"/>
+          <w:szCs w:val="22"/>
+          <w:lang w:val="de-DE" w:eastAsia="de-DE"/>
+          <w14:ligatures w14:val="none"/>
+        </w:rPr>
+        <w:t xml:space="preserve"> </w:t>
+      </w:r>
+      <w:proofErr w:type="spellStart"/>
+      <w:r>
+        <w:rPr>
+          <w:rFonts w:ascii="Lucida Sans Unicode" w:eastAsia="Times New Roman" w:hAnsi="Lucida Sans Unicode" w:cs="Lucida Sans Unicode"/>
+          <w:noProof w:val="0"/>
+          <w:kern w:val="0"/>
+          <w:sz w:val="22"/>
+          <w:szCs w:val="22"/>
+          <w:lang w:val="de-DE" w:eastAsia="de-DE"/>
+          <w14:ligatures w14:val="none"/>
+        </w:rPr>
+        <w:t>this</w:t>
+      </w:r>
+      <w:proofErr w:type="spellEnd"/>
+      <w:r>
+        <w:rPr>
+          <w:rFonts w:ascii="Lucida Sans Unicode" w:eastAsia="Times New Roman" w:hAnsi="Lucida Sans Unicode" w:cs="Lucida Sans Unicode"/>
+          <w:noProof w:val="0"/>
+          <w:kern w:val="0"/>
+          <w:sz w:val="22"/>
+          <w:szCs w:val="22"/>
+          <w:lang w:val="de-DE" w:eastAsia="de-DE"/>
+          <w14:ligatures w14:val="none"/>
+        </w:rPr>
+        <w:t xml:space="preserve"> </w:t>
+      </w:r>
+      <w:proofErr w:type="spellStart"/>
+      <w:r>
+        <w:rPr>
+          <w:rFonts w:ascii="Lucida Sans Unicode" w:eastAsia="Times New Roman" w:hAnsi="Lucida Sans Unicode" w:cs="Lucida Sans Unicode"/>
+          <w:noProof w:val="0"/>
+          <w:kern w:val="0"/>
+          <w:sz w:val="22"/>
+          <w:szCs w:val="22"/>
+          <w:lang w:val="de-DE" w:eastAsia="de-DE"/>
+          <w14:ligatures w14:val="none"/>
+        </w:rPr>
+        <w:t>paper</w:t>
+      </w:r>
+      <w:proofErr w:type="spellEnd"/>
+      <w:r>
+        <w:rPr>
+          <w:rFonts w:ascii="Lucida Sans Unicode" w:eastAsia="Times New Roman" w:hAnsi="Lucida Sans Unicode" w:cs="Lucida Sans Unicode"/>
+          <w:noProof w:val="0"/>
+          <w:kern w:val="0"/>
+          <w:sz w:val="22"/>
+          <w:szCs w:val="22"/>
+          <w:lang w:val="de-DE" w:eastAsia="de-DE"/>
+          <w14:ligatures w14:val="none"/>
+        </w:rPr>
+        <w:t xml:space="preserve">, I </w:t>
+      </w:r>
+      <w:proofErr w:type="spellStart"/>
+      <w:r>
+        <w:rPr>
+          <w:rFonts w:ascii="Lucida Sans Unicode" w:eastAsia="Times New Roman" w:hAnsi="Lucida Sans Unicode" w:cs="Lucida Sans Unicode"/>
+          <w:noProof w:val="0"/>
+          <w:kern w:val="0"/>
+          <w:sz w:val="22"/>
+          <w:szCs w:val="22"/>
+          <w:lang w:val="de-DE" w:eastAsia="de-DE"/>
+          <w14:ligatures w14:val="none"/>
+        </w:rPr>
+        <w:t>have</w:t>
+      </w:r>
+      <w:proofErr w:type="spellEnd"/>
+      <w:r>
+        <w:rPr>
+          <w:rFonts w:ascii="Lucida Sans Unicode" w:eastAsia="Times New Roman" w:hAnsi="Lucida Sans Unicode" w:cs="Lucida Sans Unicode"/>
+          <w:noProof w:val="0"/>
+          <w:kern w:val="0"/>
+          <w:sz w:val="22"/>
+          <w:szCs w:val="22"/>
+          <w:lang w:val="de-DE" w:eastAsia="de-DE"/>
+          <w14:ligatures w14:val="none"/>
+        </w:rPr>
+        <w:t xml:space="preserve"> </w:t>
+      </w:r>
+      <w:proofErr w:type="spellStart"/>
+      <w:r>
+        <w:rPr>
+          <w:rFonts w:ascii="Lucida Sans Unicode" w:eastAsia="Times New Roman" w:hAnsi="Lucida Sans Unicode" w:cs="Lucida Sans Unicode"/>
+          <w:noProof w:val="0"/>
+          <w:kern w:val="0"/>
+          <w:sz w:val="22"/>
+          <w:szCs w:val="22"/>
+          <w:lang w:val="de-DE" w:eastAsia="de-DE"/>
+          <w14:ligatures w14:val="none"/>
+        </w:rPr>
+        <w:t>used</w:t>
+      </w:r>
+      <w:proofErr w:type="spellEnd"/>
+      <w:r>
+        <w:rPr>
+          <w:rFonts w:ascii="Lucida Sans Unicode" w:eastAsia="Times New Roman" w:hAnsi="Lucida Sans Unicode" w:cs="Lucida Sans Unicode"/>
+          <w:noProof w:val="0"/>
+          <w:kern w:val="0"/>
+          <w:sz w:val="22"/>
+          <w:szCs w:val="22"/>
+          <w:lang w:val="de-DE" w:eastAsia="de-DE"/>
+          <w14:ligatures w14:val="none"/>
+        </w:rPr>
+        <w:t xml:space="preserve"> </w:t>
+      </w:r>
+      <w:proofErr w:type="spellStart"/>
+      <w:r>
+        <w:rPr>
+          <w:rFonts w:ascii="Lucida Sans Unicode" w:eastAsia="Times New Roman" w:hAnsi="Lucida Sans Unicode" w:cs="Lucida Sans Unicode"/>
+          <w:noProof w:val="0"/>
+          <w:kern w:val="0"/>
+          <w:sz w:val="22"/>
+          <w:szCs w:val="22"/>
+          <w:lang w:val="de-DE" w:eastAsia="de-DE"/>
+          <w14:ligatures w14:val="none"/>
+        </w:rPr>
+        <w:t>the</w:t>
+      </w:r>
+      <w:proofErr w:type="spellEnd"/>
+      <w:r>
+        <w:rPr>
+          <w:rFonts w:ascii="Lucida Sans Unicode" w:eastAsia="Times New Roman" w:hAnsi="Lucida Sans Unicode" w:cs="Lucida Sans Unicode"/>
+          <w:noProof w:val="0"/>
+          <w:kern w:val="0"/>
+          <w:sz w:val="22"/>
+          <w:szCs w:val="22"/>
+          <w:lang w:val="de-DE" w:eastAsia="de-DE"/>
+          <w14:ligatures w14:val="none"/>
+        </w:rPr>
+        <w:t xml:space="preserve"> </w:t>
+      </w:r>
+      <w:proofErr w:type="spellStart"/>
+      <w:r>
+        <w:rPr>
+          <w:rFonts w:ascii="Lucida Sans Unicode" w:eastAsia="Times New Roman" w:hAnsi="Lucida Sans Unicode" w:cs="Lucida Sans Unicode"/>
+          <w:noProof w:val="0"/>
+          <w:kern w:val="0"/>
+          <w:sz w:val="22"/>
+          <w:szCs w:val="22"/>
+          <w:lang w:val="de-DE" w:eastAsia="de-DE"/>
+          <w14:ligatures w14:val="none"/>
+        </w:rPr>
+        <w:t>following</w:t>
+      </w:r>
+      <w:proofErr w:type="spellEnd"/>
+      <w:r>
+        <w:rPr>
+          <w:rFonts w:ascii="Lucida Sans Unicode" w:eastAsia="Times New Roman" w:hAnsi="Lucida Sans Unicode" w:cs="Lucida Sans Unicode"/>
+          <w:noProof w:val="0"/>
+          <w:kern w:val="0"/>
+          <w:sz w:val="22"/>
+          <w:szCs w:val="22"/>
+          <w:lang w:val="de-DE" w:eastAsia="de-DE"/>
+          <w14:ligatures w14:val="none"/>
+        </w:rPr>
+        <w:t xml:space="preserve"> </w:t>
+      </w:r>
+      <w:proofErr w:type="spellStart"/>
+      <w:r>
+        <w:rPr>
+          <w:rFonts w:ascii="Lucida Sans Unicode" w:eastAsia="Times New Roman" w:hAnsi="Lucida Sans Unicode" w:cs="Lucida Sans Unicode"/>
+          <w:noProof w:val="0"/>
+          <w:kern w:val="0"/>
+          <w:sz w:val="22"/>
+          <w:szCs w:val="22"/>
+          <w:lang w:val="de-DE" w:eastAsia="de-DE"/>
+          <w14:ligatures w14:val="none"/>
+        </w:rPr>
+        <w:t>tools</w:t>
+      </w:r>
+      <w:proofErr w:type="spellEnd"/>
+      <w:r>
+        <w:rPr>
+          <w:rFonts w:ascii="Lucida Sans Unicode" w:eastAsia="Times New Roman" w:hAnsi="Lucida Sans Unicode" w:cs="Lucida Sans Unicode"/>
+          <w:noProof w:val="0"/>
+          <w:kern w:val="0"/>
+          <w:sz w:val="22"/>
+          <w:szCs w:val="22"/>
+          <w:lang w:val="de-DE" w:eastAsia="de-DE"/>
+          <w14:ligatures w14:val="none"/>
+        </w:rPr>
+        <w:t xml:space="preserve">: ChatGPT, </w:t>
+      </w:r>
+      <w:proofErr w:type="spellStart"/>
+      <w:r>
+        <w:rPr>
+          <w:rFonts w:ascii="Lucida Sans Unicode" w:eastAsia="Times New Roman" w:hAnsi="Lucida Sans Unicode" w:cs="Lucida Sans Unicode"/>
+          <w:noProof w:val="0"/>
+          <w:kern w:val="0"/>
+          <w:sz w:val="22"/>
+          <w:szCs w:val="22"/>
+          <w:lang w:val="de-DE" w:eastAsia="de-DE"/>
+          <w14:ligatures w14:val="none"/>
+        </w:rPr>
+        <w:t>Elicit</w:t>
+      </w:r>
+      <w:proofErr w:type="spellEnd"/>
+      <w:r>
+        <w:rPr>
+          <w:rFonts w:ascii="Lucida Sans Unicode" w:eastAsia="Times New Roman" w:hAnsi="Lucida Sans Unicode" w:cs="Lucida Sans Unicode"/>
+          <w:noProof w:val="0"/>
+          <w:kern w:val="0"/>
+          <w:sz w:val="22"/>
+          <w:szCs w:val="22"/>
+          <w:lang w:val="de-DE" w:eastAsia="de-DE"/>
+          <w14:ligatures w14:val="none"/>
+        </w:rPr>
+        <w:t>, DeepL</w:t>
+      </w:r>
+      <w:r>
+        <w:rPr>
+          <w:rFonts w:ascii="Lucida Sans Unicode" w:eastAsia="Times New Roman" w:hAnsi="Lucida Sans Unicode" w:cs="Lucida Sans Unicode"/>
+          <w:noProof w:val="0"/>
+          <w:kern w:val="0"/>
+          <w:sz w:val="22"/>
+          <w:szCs w:val="22"/>
+          <w:lang w:val="de-DE" w:eastAsia="de-DE"/>
+          <w14:ligatures w14:val="none"/>
+        </w:rPr>
+        <w:t xml:space="preserve">, </w:t>
+      </w:r>
+      <w:proofErr w:type="spellStart"/>
+      <w:r>
+        <w:rPr>
+          <w:rFonts w:ascii="Lucida Sans Unicode" w:eastAsia="Times New Roman" w:hAnsi="Lucida Sans Unicode" w:cs="Lucida Sans Unicode"/>
+          <w:noProof w:val="0"/>
+          <w:kern w:val="0"/>
+          <w:sz w:val="22"/>
+          <w:szCs w:val="22"/>
+          <w:lang w:val="de-DE" w:eastAsia="de-DE"/>
+          <w14:ligatures w14:val="none"/>
+        </w:rPr>
+        <w:t>Perplexity</w:t>
+      </w:r>
+      <w:proofErr w:type="spellEnd"/>
+      <w:r>
+        <w:rPr>
+          <w:rFonts w:ascii="Lucida Sans Unicode" w:eastAsia="Times New Roman" w:hAnsi="Lucida Sans Unicode" w:cs="Lucida Sans Unicode"/>
+          <w:noProof w:val="0"/>
+          <w:kern w:val="0"/>
+          <w:sz w:val="22"/>
+          <w:szCs w:val="22"/>
+          <w:lang w:val="de-DE" w:eastAsia="de-DE"/>
+          <w14:ligatures w14:val="none"/>
+        </w:rPr>
+        <w:t xml:space="preserve">, </w:t>
+      </w:r>
+      <w:proofErr w:type="spellStart"/>
+      <w:r>
+        <w:rPr>
+          <w:rFonts w:ascii="Lucida Sans Unicode" w:eastAsia="Times New Roman" w:hAnsi="Lucida Sans Unicode" w:cs="Lucida Sans Unicode"/>
+          <w:noProof w:val="0"/>
+          <w:kern w:val="0"/>
+          <w:sz w:val="22"/>
+          <w:szCs w:val="22"/>
+          <w:lang w:val="de-DE" w:eastAsia="de-DE"/>
+          <w14:ligatures w14:val="none"/>
+        </w:rPr>
+        <w:t>Semantic</w:t>
+      </w:r>
+      <w:proofErr w:type="spellEnd"/>
+      <w:r>
+        <w:rPr>
+          <w:rFonts w:ascii="Lucida Sans Unicode" w:eastAsia="Times New Roman" w:hAnsi="Lucida Sans Unicode" w:cs="Lucida Sans Unicode"/>
+          <w:noProof w:val="0"/>
+          <w:kern w:val="0"/>
+          <w:sz w:val="22"/>
+          <w:szCs w:val="22"/>
+          <w:lang w:val="de-DE" w:eastAsia="de-DE"/>
+          <w14:ligatures w14:val="none"/>
+        </w:rPr>
+        <w:t xml:space="preserve"> Scholar. I </w:t>
+      </w:r>
+      <w:proofErr w:type="spellStart"/>
+      <w:r>
+        <w:rPr>
+          <w:rFonts w:ascii="Lucida Sans Unicode" w:eastAsia="Times New Roman" w:hAnsi="Lucida Sans Unicode" w:cs="Lucida Sans Unicode"/>
+          <w:noProof w:val="0"/>
+          <w:kern w:val="0"/>
+          <w:sz w:val="22"/>
+          <w:szCs w:val="22"/>
+          <w:lang w:val="de-DE" w:eastAsia="de-DE"/>
+          <w14:ligatures w14:val="none"/>
+        </w:rPr>
+        <w:t>used</w:t>
+      </w:r>
+      <w:proofErr w:type="spellEnd"/>
+      <w:r>
+        <w:rPr>
+          <w:rFonts w:ascii="Lucida Sans Unicode" w:eastAsia="Times New Roman" w:hAnsi="Lucida Sans Unicode" w:cs="Lucida Sans Unicode"/>
+          <w:noProof w:val="0"/>
+          <w:kern w:val="0"/>
+          <w:sz w:val="22"/>
+          <w:szCs w:val="22"/>
+          <w:lang w:val="de-DE" w:eastAsia="de-DE"/>
+          <w14:ligatures w14:val="none"/>
+        </w:rPr>
+        <w:t xml:space="preserve"> </w:t>
+      </w:r>
+      <w:proofErr w:type="spellStart"/>
+      <w:r>
+        <w:rPr>
+          <w:rFonts w:ascii="Lucida Sans Unicode" w:eastAsia="Times New Roman" w:hAnsi="Lucida Sans Unicode" w:cs="Lucida Sans Unicode"/>
+          <w:noProof w:val="0"/>
+          <w:kern w:val="0"/>
+          <w:sz w:val="22"/>
+          <w:szCs w:val="22"/>
+          <w:lang w:val="de-DE" w:eastAsia="de-DE"/>
+          <w14:ligatures w14:val="none"/>
+        </w:rPr>
+        <w:t>it</w:t>
+      </w:r>
+      <w:proofErr w:type="spellEnd"/>
+      <w:r>
+        <w:rPr>
+          <w:rFonts w:ascii="Lucida Sans Unicode" w:eastAsia="Times New Roman" w:hAnsi="Lucida Sans Unicode" w:cs="Lucida Sans Unicode"/>
+          <w:noProof w:val="0"/>
+          <w:kern w:val="0"/>
+          <w:sz w:val="22"/>
+          <w:szCs w:val="22"/>
+          <w:lang w:val="de-DE" w:eastAsia="de-DE"/>
+          <w14:ligatures w14:val="none"/>
+        </w:rPr>
+        <w:t xml:space="preserve"> </w:t>
+      </w:r>
+      <w:proofErr w:type="spellStart"/>
+      <w:r>
+        <w:rPr>
+          <w:rFonts w:ascii="Lucida Sans Unicode" w:eastAsia="Times New Roman" w:hAnsi="Lucida Sans Unicode" w:cs="Lucida Sans Unicode"/>
+          <w:noProof w:val="0"/>
+          <w:kern w:val="0"/>
+          <w:sz w:val="22"/>
+          <w:szCs w:val="22"/>
+          <w:lang w:val="de-DE" w:eastAsia="de-DE"/>
+          <w14:ligatures w14:val="none"/>
+        </w:rPr>
+        <w:t>for</w:t>
+      </w:r>
+      <w:proofErr w:type="spellEnd"/>
+      <w:r>
+        <w:rPr>
+          <w:rFonts w:ascii="Lucida Sans Unicode" w:eastAsia="Times New Roman" w:hAnsi="Lucida Sans Unicode" w:cs="Lucida Sans Unicode"/>
+          <w:noProof w:val="0"/>
+          <w:kern w:val="0"/>
+          <w:sz w:val="22"/>
+          <w:szCs w:val="22"/>
+          <w:lang w:val="de-DE" w:eastAsia="de-DE"/>
+          <w14:ligatures w14:val="none"/>
+        </w:rPr>
+        <w:t xml:space="preserve"> </w:t>
+      </w:r>
+      <w:proofErr w:type="spellStart"/>
+      <w:r>
+        <w:rPr>
+          <w:rFonts w:ascii="Lucida Sans Unicode" w:eastAsia="Times New Roman" w:hAnsi="Lucida Sans Unicode" w:cs="Lucida Sans Unicode"/>
+          <w:noProof w:val="0"/>
+          <w:kern w:val="0"/>
+          <w:sz w:val="22"/>
+          <w:szCs w:val="22"/>
+          <w:lang w:val="de-DE" w:eastAsia="de-DE"/>
+          <w14:ligatures w14:val="none"/>
+        </w:rPr>
+        <w:t>the</w:t>
+      </w:r>
+      <w:proofErr w:type="spellEnd"/>
+      <w:r>
+        <w:rPr>
+          <w:rFonts w:ascii="Lucida Sans Unicode" w:eastAsia="Times New Roman" w:hAnsi="Lucida Sans Unicode" w:cs="Lucida Sans Unicode"/>
+          <w:noProof w:val="0"/>
+          <w:kern w:val="0"/>
+          <w:sz w:val="22"/>
+          <w:szCs w:val="22"/>
+          <w:lang w:val="de-DE" w:eastAsia="de-DE"/>
+          <w14:ligatures w14:val="none"/>
+        </w:rPr>
+        <w:t xml:space="preserve"> </w:t>
+      </w:r>
+      <w:proofErr w:type="spellStart"/>
+      <w:r>
+        <w:rPr>
+          <w:rFonts w:ascii="Lucida Sans Unicode" w:eastAsia="Times New Roman" w:hAnsi="Lucida Sans Unicode" w:cs="Lucida Sans Unicode"/>
+          <w:noProof w:val="0"/>
+          <w:kern w:val="0"/>
+          <w:sz w:val="22"/>
+          <w:szCs w:val="22"/>
+          <w:lang w:val="de-DE" w:eastAsia="de-DE"/>
+          <w14:ligatures w14:val="none"/>
+        </w:rPr>
+        <w:t>following</w:t>
+      </w:r>
+      <w:proofErr w:type="spellEnd"/>
+      <w:r>
+        <w:rPr>
+          <w:rFonts w:ascii="Lucida Sans Unicode" w:eastAsia="Times New Roman" w:hAnsi="Lucida Sans Unicode" w:cs="Lucida Sans Unicode"/>
+          <w:noProof w:val="0"/>
+          <w:kern w:val="0"/>
+          <w:sz w:val="22"/>
+          <w:szCs w:val="22"/>
+          <w:lang w:val="de-DE" w:eastAsia="de-DE"/>
+          <w14:ligatures w14:val="none"/>
+        </w:rPr>
+        <w:t xml:space="preserve"> </w:t>
+      </w:r>
+      <w:proofErr w:type="spellStart"/>
+      <w:r>
+        <w:rPr>
+          <w:rFonts w:ascii="Lucida Sans Unicode" w:eastAsia="Times New Roman" w:hAnsi="Lucida Sans Unicode" w:cs="Lucida Sans Unicode"/>
+          <w:noProof w:val="0"/>
+          <w:kern w:val="0"/>
+          <w:sz w:val="22"/>
+          <w:szCs w:val="22"/>
+          <w:lang w:val="de-DE" w:eastAsia="de-DE"/>
+          <w14:ligatures w14:val="none"/>
+        </w:rPr>
+        <w:t>purpose</w:t>
+      </w:r>
+      <w:proofErr w:type="spellEnd"/>
+      <w:r>
+        <w:rPr>
+          <w:rFonts w:ascii="Lucida Sans Unicode" w:eastAsia="Times New Roman" w:hAnsi="Lucida Sans Unicode" w:cs="Lucida Sans Unicode"/>
+          <w:noProof w:val="0"/>
+          <w:kern w:val="0"/>
+          <w:sz w:val="22"/>
+          <w:szCs w:val="22"/>
+          <w:lang w:val="de-DE" w:eastAsia="de-DE"/>
+          <w14:ligatures w14:val="none"/>
+        </w:rPr>
+        <w:t>/s:</w:t>
+      </w:r>
+    </w:p>
+    <w:p>
+      <w:pPr>
+        <w:numPr>
+          <w:ilvl w:val="0"/>
+          <w:numId w:val="3"/>
+        </w:numPr>
+        <w:spacing w:before="100" w:beforeAutospacing="1" w:after="100" w:afterAutospacing="1" w:line="240" w:lineRule="auto"/>
+        <w:rPr>
+          <w:rFonts w:ascii="Lucida Sans Unicode" w:eastAsia="Times New Roman" w:hAnsi="Lucida Sans Unicode" w:cs="Lucida Sans Unicode"/>
+          <w:noProof w:val="0"/>
+          <w:kern w:val="0"/>
+          <w:sz w:val="22"/>
+          <w:szCs w:val="22"/>
+          <w:lang w:val="de-DE" w:eastAsia="de-DE"/>
+          <w14:ligatures w14:val="none"/>
+        </w:rPr>
+      </w:pPr>
+      <w:r>
+        <w:rPr>
+          <w:rFonts w:ascii="Lucida Sans Unicode" w:eastAsia="Times New Roman" w:hAnsi="Lucida Sans Unicode" w:cs="Lucida Sans Unicode"/>
+          <w:noProof w:val="0"/>
+          <w:kern w:val="0"/>
+          <w:sz w:val="22"/>
+          <w:szCs w:val="22"/>
+          <w:lang w:val="de-DE" w:eastAsia="de-DE"/>
+          <w14:ligatures w14:val="none"/>
+        </w:rPr>
+        <w:t xml:space="preserve">[ ] </w:t>
+      </w:r>
+      <w:proofErr w:type="spellStart"/>
+      <w:r>
+        <w:rPr>
+          <w:rFonts w:ascii="Lucida Sans Unicode" w:eastAsia="Times New Roman" w:hAnsi="Lucida Sans Unicode" w:cs="Lucida Sans Unicode"/>
+          <w:noProof w:val="0"/>
+          <w:kern w:val="0"/>
+          <w:sz w:val="22"/>
+          <w:szCs w:val="22"/>
+          <w:lang w:val="de-DE" w:eastAsia="de-DE"/>
+          <w14:ligatures w14:val="none"/>
+        </w:rPr>
+        <w:t>improving</w:t>
+      </w:r>
+      <w:proofErr w:type="spellEnd"/>
+      <w:r>
+        <w:rPr>
+          <w:rFonts w:ascii="Lucida Sans Unicode" w:eastAsia="Times New Roman" w:hAnsi="Lucida Sans Unicode" w:cs="Lucida Sans Unicode"/>
+          <w:noProof w:val="0"/>
+          <w:kern w:val="0"/>
+          <w:sz w:val="22"/>
+          <w:szCs w:val="22"/>
+          <w:lang w:val="de-DE" w:eastAsia="de-DE"/>
+          <w14:ligatures w14:val="none"/>
+        </w:rPr>
+        <w:t xml:space="preserve"> </w:t>
+      </w:r>
+      <w:proofErr w:type="spellStart"/>
+      <w:r>
+        <w:rPr>
+          <w:rFonts w:ascii="Lucida Sans Unicode" w:eastAsia="Times New Roman" w:hAnsi="Lucida Sans Unicode" w:cs="Lucida Sans Unicode"/>
+          <w:noProof w:val="0"/>
+          <w:kern w:val="0"/>
+          <w:sz w:val="22"/>
+          <w:szCs w:val="22"/>
+          <w:lang w:val="de-DE" w:eastAsia="de-DE"/>
+          <w14:ligatures w14:val="none"/>
+        </w:rPr>
+        <w:t>linguistic</w:t>
+      </w:r>
+      <w:proofErr w:type="spellEnd"/>
+      <w:r>
+        <w:rPr>
+          <w:rFonts w:ascii="Lucida Sans Unicode" w:eastAsia="Times New Roman" w:hAnsi="Lucida Sans Unicode" w:cs="Lucida Sans Unicode"/>
+          <w:noProof w:val="0"/>
+          <w:kern w:val="0"/>
+          <w:sz w:val="22"/>
+          <w:szCs w:val="22"/>
+          <w:lang w:val="de-DE" w:eastAsia="de-DE"/>
+          <w14:ligatures w14:val="none"/>
+        </w:rPr>
+        <w:t xml:space="preserve"> </w:t>
+      </w:r>
+      <w:proofErr w:type="spellStart"/>
+      <w:r>
+        <w:rPr>
+          <w:rFonts w:ascii="Lucida Sans Unicode" w:eastAsia="Times New Roman" w:hAnsi="Lucida Sans Unicode" w:cs="Lucida Sans Unicode"/>
+          <w:noProof w:val="0"/>
+          <w:kern w:val="0"/>
+          <w:sz w:val="22"/>
+          <w:szCs w:val="22"/>
+          <w:lang w:val="de-DE" w:eastAsia="de-DE"/>
+          <w14:ligatures w14:val="none"/>
+        </w:rPr>
+        <w:t>quality</w:t>
+      </w:r>
+      <w:proofErr w:type="spellEnd"/>
+      <w:r>
+        <w:rPr>
+          <w:rFonts w:ascii="Lucida Sans Unicode" w:eastAsia="Times New Roman" w:hAnsi="Lucida Sans Unicode" w:cs="Lucida Sans Unicode"/>
+          <w:noProof w:val="0"/>
+          <w:kern w:val="0"/>
+          <w:sz w:val="22"/>
+          <w:szCs w:val="22"/>
+          <w:lang w:val="de-DE" w:eastAsia="de-DE"/>
+          <w14:ligatures w14:val="none"/>
+        </w:rPr>
+        <w:t xml:space="preserve"> and </w:t>
+      </w:r>
+      <w:proofErr w:type="spellStart"/>
+      <w:r>
+        <w:rPr>
+          <w:rFonts w:ascii="Lucida Sans Unicode" w:eastAsia="Times New Roman" w:hAnsi="Lucida Sans Unicode" w:cs="Lucida Sans Unicode"/>
+          <w:noProof w:val="0"/>
+          <w:kern w:val="0"/>
+          <w:sz w:val="22"/>
+          <w:szCs w:val="22"/>
+          <w:lang w:val="de-DE" w:eastAsia="de-DE"/>
+          <w14:ligatures w14:val="none"/>
+        </w:rPr>
+        <w:t>readability</w:t>
+      </w:r>
+      <w:proofErr w:type="spellEnd"/>
+    </w:p>
+    <w:p>
+      <w:pPr>
+        <w:numPr>
+          <w:ilvl w:val="0"/>
+          <w:numId w:val="3"/>
+        </w:numPr>
+        <w:spacing w:before="100" w:beforeAutospacing="1" w:after="100" w:afterAutospacing="1" w:line="240" w:lineRule="auto"/>
+        <w:rPr>
+          <w:rFonts w:ascii="Lucida Sans Unicode" w:eastAsia="Times New Roman" w:hAnsi="Lucida Sans Unicode" w:cs="Lucida Sans Unicode"/>
+          <w:noProof w:val="0"/>
+          <w:kern w:val="0"/>
+          <w:sz w:val="22"/>
+          <w:szCs w:val="22"/>
+          <w:lang w:val="de-DE" w:eastAsia="de-DE"/>
+          <w14:ligatures w14:val="none"/>
+        </w:rPr>
+      </w:pPr>
+      <w:r>
+        <w:rPr>
+          <w:rFonts w:ascii="Lucida Sans Unicode" w:eastAsia="Times New Roman" w:hAnsi="Lucida Sans Unicode" w:cs="Lucida Sans Unicode"/>
+          <w:noProof w:val="0"/>
+          <w:kern w:val="0"/>
+          <w:sz w:val="22"/>
+          <w:szCs w:val="22"/>
+          <w:lang w:val="de-DE" w:eastAsia="de-DE"/>
+          <w14:ligatures w14:val="none"/>
+        </w:rPr>
+        <w:t xml:space="preserve">[ ] </w:t>
+      </w:r>
+      <w:proofErr w:type="spellStart"/>
+      <w:r>
+        <w:rPr>
+          <w:rFonts w:ascii="Lucida Sans Unicode" w:eastAsia="Times New Roman" w:hAnsi="Lucida Sans Unicode" w:cs="Lucida Sans Unicode"/>
+          <w:noProof w:val="0"/>
+          <w:kern w:val="0"/>
+          <w:sz w:val="22"/>
+          <w:szCs w:val="22"/>
+          <w:lang w:val="de-DE" w:eastAsia="de-DE"/>
+          <w14:ligatures w14:val="none"/>
+        </w:rPr>
+        <w:t>writing</w:t>
+      </w:r>
+      <w:proofErr w:type="spellEnd"/>
+      <w:r>
+        <w:rPr>
+          <w:rFonts w:ascii="Lucida Sans Unicode" w:eastAsia="Times New Roman" w:hAnsi="Lucida Sans Unicode" w:cs="Lucida Sans Unicode"/>
+          <w:noProof w:val="0"/>
+          <w:kern w:val="0"/>
+          <w:sz w:val="22"/>
+          <w:szCs w:val="22"/>
+          <w:lang w:val="de-DE" w:eastAsia="de-DE"/>
+          <w14:ligatures w14:val="none"/>
+        </w:rPr>
+        <w:t xml:space="preserve"> </w:t>
+      </w:r>
+      <w:proofErr w:type="spellStart"/>
+      <w:r>
+        <w:rPr>
+          <w:rFonts w:ascii="Lucida Sans Unicode" w:eastAsia="Times New Roman" w:hAnsi="Lucida Sans Unicode" w:cs="Lucida Sans Unicode"/>
+          <w:noProof w:val="0"/>
+          <w:kern w:val="0"/>
+          <w:sz w:val="22"/>
+          <w:szCs w:val="22"/>
+          <w:lang w:val="de-DE" w:eastAsia="de-DE"/>
+          <w14:ligatures w14:val="none"/>
+        </w:rPr>
+        <w:t>assistance</w:t>
+      </w:r>
+      <w:proofErr w:type="spellEnd"/>
+      <w:r>
+        <w:rPr>
+          <w:rFonts w:ascii="Lucida Sans Unicode" w:eastAsia="Times New Roman" w:hAnsi="Lucida Sans Unicode" w:cs="Lucida Sans Unicode"/>
+          <w:noProof w:val="0"/>
+          <w:kern w:val="0"/>
+          <w:sz w:val="22"/>
+          <w:szCs w:val="22"/>
+          <w:lang w:val="de-DE" w:eastAsia="de-DE"/>
+          <w14:ligatures w14:val="none"/>
+        </w:rPr>
+        <w:t xml:space="preserve"> e.g. </w:t>
+      </w:r>
+      <w:proofErr w:type="spellStart"/>
+      <w:r>
+        <w:rPr>
+          <w:rFonts w:ascii="Lucida Sans Unicode" w:eastAsia="Times New Roman" w:hAnsi="Lucida Sans Unicode" w:cs="Lucida Sans Unicode"/>
+          <w:noProof w:val="0"/>
+          <w:kern w:val="0"/>
+          <w:sz w:val="22"/>
+          <w:szCs w:val="22"/>
+          <w:lang w:val="de-DE" w:eastAsia="de-DE"/>
+          <w14:ligatures w14:val="none"/>
+        </w:rPr>
+        <w:t>for</w:t>
+      </w:r>
+      <w:proofErr w:type="spellEnd"/>
+      <w:r>
+        <w:rPr>
+          <w:rFonts w:ascii="Lucida Sans Unicode" w:eastAsia="Times New Roman" w:hAnsi="Lucida Sans Unicode" w:cs="Lucida Sans Unicode"/>
+          <w:noProof w:val="0"/>
+          <w:kern w:val="0"/>
+          <w:sz w:val="22"/>
+          <w:szCs w:val="22"/>
+          <w:lang w:val="de-DE" w:eastAsia="de-DE"/>
+          <w14:ligatures w14:val="none"/>
+        </w:rPr>
+        <w:t xml:space="preserve"> </w:t>
+      </w:r>
+      <w:proofErr w:type="spellStart"/>
+      <w:r>
+        <w:rPr>
+          <w:rFonts w:ascii="Lucida Sans Unicode" w:eastAsia="Times New Roman" w:hAnsi="Lucida Sans Unicode" w:cs="Lucida Sans Unicode"/>
+          <w:noProof w:val="0"/>
+          <w:kern w:val="0"/>
+          <w:sz w:val="22"/>
+          <w:szCs w:val="22"/>
+          <w:lang w:val="de-DE" w:eastAsia="de-DE"/>
+          <w14:ligatures w14:val="none"/>
+        </w:rPr>
+        <w:t>generating</w:t>
+      </w:r>
+      <w:proofErr w:type="spellEnd"/>
+      <w:r>
+        <w:rPr>
+          <w:rFonts w:ascii="Lucida Sans Unicode" w:eastAsia="Times New Roman" w:hAnsi="Lucida Sans Unicode" w:cs="Lucida Sans Unicode"/>
+          <w:noProof w:val="0"/>
+          <w:kern w:val="0"/>
+          <w:sz w:val="22"/>
+          <w:szCs w:val="22"/>
+          <w:lang w:val="de-DE" w:eastAsia="de-DE"/>
+          <w14:ligatures w14:val="none"/>
+        </w:rPr>
+        <w:t xml:space="preserve"> </w:t>
+      </w:r>
+      <w:proofErr w:type="spellStart"/>
+      <w:r>
+        <w:rPr>
+          <w:rFonts w:ascii="Lucida Sans Unicode" w:eastAsia="Times New Roman" w:hAnsi="Lucida Sans Unicode" w:cs="Lucida Sans Unicode"/>
+          <w:noProof w:val="0"/>
+          <w:kern w:val="0"/>
+          <w:sz w:val="22"/>
+          <w:szCs w:val="22"/>
+          <w:lang w:val="de-DE" w:eastAsia="de-DE"/>
+          <w14:ligatures w14:val="none"/>
+        </w:rPr>
+        <w:t>table</w:t>
+      </w:r>
+      <w:proofErr w:type="spellEnd"/>
+      <w:r>
+        <w:rPr>
+          <w:rFonts w:ascii="Lucida Sans Unicode" w:eastAsia="Times New Roman" w:hAnsi="Lucida Sans Unicode" w:cs="Lucida Sans Unicode"/>
+          <w:noProof w:val="0"/>
+          <w:kern w:val="0"/>
+          <w:sz w:val="22"/>
+          <w:szCs w:val="22"/>
+          <w:lang w:val="de-DE" w:eastAsia="de-DE"/>
+          <w14:ligatures w14:val="none"/>
+        </w:rPr>
+        <w:t xml:space="preserve"> </w:t>
+      </w:r>
+      <w:proofErr w:type="spellStart"/>
+      <w:r>
+        <w:rPr>
+          <w:rFonts w:ascii="Lucida Sans Unicode" w:eastAsia="Times New Roman" w:hAnsi="Lucida Sans Unicode" w:cs="Lucida Sans Unicode"/>
+          <w:noProof w:val="0"/>
+          <w:kern w:val="0"/>
+          <w:sz w:val="22"/>
+          <w:szCs w:val="22"/>
+          <w:lang w:val="de-DE" w:eastAsia="de-DE"/>
+          <w14:ligatures w14:val="none"/>
+        </w:rPr>
+        <w:t>of</w:t>
+      </w:r>
+      <w:proofErr w:type="spellEnd"/>
+      <w:r>
+        <w:rPr>
+          <w:rFonts w:ascii="Lucida Sans Unicode" w:eastAsia="Times New Roman" w:hAnsi="Lucida Sans Unicode" w:cs="Lucida Sans Unicode"/>
+          <w:noProof w:val="0"/>
+          <w:kern w:val="0"/>
+          <w:sz w:val="22"/>
+          <w:szCs w:val="22"/>
+          <w:lang w:val="de-DE" w:eastAsia="de-DE"/>
+          <w14:ligatures w14:val="none"/>
+        </w:rPr>
+        <w:t xml:space="preserve"> </w:t>
+      </w:r>
+      <w:proofErr w:type="spellStart"/>
+      <w:r>
+        <w:rPr>
+          <w:rFonts w:ascii="Lucida Sans Unicode" w:eastAsia="Times New Roman" w:hAnsi="Lucida Sans Unicode" w:cs="Lucida Sans Unicode"/>
+          <w:noProof w:val="0"/>
+          <w:kern w:val="0"/>
+          <w:sz w:val="22"/>
+          <w:szCs w:val="22"/>
+          <w:lang w:val="de-DE" w:eastAsia="de-DE"/>
+          <w14:ligatures w14:val="none"/>
+        </w:rPr>
+        <w:t>contents</w:t>
+      </w:r>
+      <w:proofErr w:type="spellEnd"/>
+      <w:r>
+        <w:rPr>
+          <w:rFonts w:ascii="Lucida Sans Unicode" w:eastAsia="Times New Roman" w:hAnsi="Lucida Sans Unicode" w:cs="Lucida Sans Unicode"/>
+          <w:noProof w:val="0"/>
+          <w:kern w:val="0"/>
+          <w:sz w:val="22"/>
+          <w:szCs w:val="22"/>
+          <w:lang w:val="de-DE" w:eastAsia="de-DE"/>
+          <w14:ligatures w14:val="none"/>
+        </w:rPr>
+        <w:t xml:space="preserve">, </w:t>
+      </w:r>
+      <w:proofErr w:type="spellStart"/>
+      <w:r>
+        <w:rPr>
+          <w:rFonts w:ascii="Lucida Sans Unicode" w:eastAsia="Times New Roman" w:hAnsi="Lucida Sans Unicode" w:cs="Lucida Sans Unicode"/>
+          <w:noProof w:val="0"/>
+          <w:kern w:val="0"/>
+          <w:sz w:val="22"/>
+          <w:szCs w:val="22"/>
+          <w:lang w:val="de-DE" w:eastAsia="de-DE"/>
+          <w14:ligatures w14:val="none"/>
+        </w:rPr>
+        <w:t>outlines</w:t>
+      </w:r>
+      <w:proofErr w:type="spellEnd"/>
+      <w:r>
+        <w:rPr>
+          <w:rFonts w:ascii="Lucida Sans Unicode" w:eastAsia="Times New Roman" w:hAnsi="Lucida Sans Unicode" w:cs="Lucida Sans Unicode"/>
+          <w:noProof w:val="0"/>
+          <w:kern w:val="0"/>
+          <w:sz w:val="22"/>
+          <w:szCs w:val="22"/>
+          <w:lang w:val="de-DE" w:eastAsia="de-DE"/>
+          <w14:ligatures w14:val="none"/>
+        </w:rPr>
+        <w:t xml:space="preserve">, </w:t>
+      </w:r>
+      <w:proofErr w:type="spellStart"/>
+      <w:r>
+        <w:rPr>
+          <w:rFonts w:ascii="Lucida Sans Unicode" w:eastAsia="Times New Roman" w:hAnsi="Lucida Sans Unicode" w:cs="Lucida Sans Unicode"/>
+          <w:noProof w:val="0"/>
+          <w:kern w:val="0"/>
+          <w:sz w:val="22"/>
+          <w:szCs w:val="22"/>
+          <w:lang w:val="de-DE" w:eastAsia="de-DE"/>
+          <w14:ligatures w14:val="none"/>
+        </w:rPr>
+        <w:t>first</w:t>
+      </w:r>
+      <w:proofErr w:type="spellEnd"/>
+      <w:r>
+        <w:rPr>
+          <w:rFonts w:ascii="Lucida Sans Unicode" w:eastAsia="Times New Roman" w:hAnsi="Lucida Sans Unicode" w:cs="Lucida Sans Unicode"/>
+          <w:noProof w:val="0"/>
+          <w:kern w:val="0"/>
+          <w:sz w:val="22"/>
+          <w:szCs w:val="22"/>
+          <w:lang w:val="de-DE" w:eastAsia="de-DE"/>
+          <w14:ligatures w14:val="none"/>
+        </w:rPr>
+        <w:t xml:space="preserve"> </w:t>
+      </w:r>
+      <w:proofErr w:type="spellStart"/>
+      <w:r>
+        <w:rPr>
+          <w:rFonts w:ascii="Lucida Sans Unicode" w:eastAsia="Times New Roman" w:hAnsi="Lucida Sans Unicode" w:cs="Lucida Sans Unicode"/>
+          <w:noProof w:val="0"/>
+          <w:kern w:val="0"/>
+          <w:sz w:val="22"/>
+          <w:szCs w:val="22"/>
+          <w:lang w:val="de-DE" w:eastAsia="de-DE"/>
+          <w14:ligatures w14:val="none"/>
+        </w:rPr>
+        <w:t>sentences</w:t>
+      </w:r>
+      <w:proofErr w:type="spellEnd"/>
+      <w:r>
+        <w:rPr>
+          <w:rFonts w:ascii="Lucida Sans Unicode" w:eastAsia="Times New Roman" w:hAnsi="Lucida Sans Unicode" w:cs="Lucida Sans Unicode"/>
+          <w:noProof w:val="0"/>
+          <w:kern w:val="0"/>
+          <w:sz w:val="22"/>
+          <w:szCs w:val="22"/>
+          <w:lang w:val="de-DE" w:eastAsia="de-DE"/>
+          <w14:ligatures w14:val="none"/>
+        </w:rPr>
+        <w:t xml:space="preserve"> and </w:t>
+      </w:r>
+      <w:proofErr w:type="spellStart"/>
+      <w:r>
+        <w:rPr>
+          <w:rFonts w:ascii="Lucida Sans Unicode" w:eastAsia="Times New Roman" w:hAnsi="Lucida Sans Unicode" w:cs="Lucida Sans Unicode"/>
+          <w:noProof w:val="0"/>
+          <w:kern w:val="0"/>
+          <w:sz w:val="22"/>
+          <w:szCs w:val="22"/>
+          <w:lang w:val="de-DE" w:eastAsia="de-DE"/>
+          <w14:ligatures w14:val="none"/>
+        </w:rPr>
+        <w:t>paragraphs</w:t>
+      </w:r>
+      <w:proofErr w:type="spellEnd"/>
+    </w:p>
+    <w:p>
+      <w:pPr>
+        <w:numPr>
+          <w:ilvl w:val="0"/>
+          <w:numId w:val="3"/>
+        </w:numPr>
+        <w:spacing w:before="100" w:beforeAutospacing="1" w:after="100" w:afterAutospacing="1" w:line="240" w:lineRule="auto"/>
+        <w:rPr>
+          <w:rFonts w:ascii="Lucida Sans Unicode" w:eastAsia="Times New Roman" w:hAnsi="Lucida Sans Unicode" w:cs="Lucida Sans Unicode"/>
+          <w:noProof w:val="0"/>
+          <w:kern w:val="0"/>
+          <w:sz w:val="22"/>
+          <w:szCs w:val="22"/>
+          <w:lang w:val="de-DE" w:eastAsia="de-DE"/>
+          <w14:ligatures w14:val="none"/>
+        </w:rPr>
+      </w:pPr>
+      <w:r>
+        <w:rPr>
+          <w:rFonts w:ascii="Lucida Sans Unicode" w:eastAsia="Times New Roman" w:hAnsi="Lucida Sans Unicode" w:cs="Lucida Sans Unicode"/>
+          <w:noProof w:val="0"/>
+          <w:kern w:val="0"/>
+          <w:sz w:val="22"/>
+          <w:szCs w:val="22"/>
+          <w:lang w:val="de-DE" w:eastAsia="de-DE"/>
+          <w14:ligatures w14:val="none"/>
+        </w:rPr>
+        <w:t xml:space="preserve">[ ] </w:t>
+      </w:r>
+      <w:proofErr w:type="spellStart"/>
+      <w:r>
+        <w:rPr>
+          <w:rFonts w:ascii="Lucida Sans Unicode" w:eastAsia="Times New Roman" w:hAnsi="Lucida Sans Unicode" w:cs="Lucida Sans Unicode"/>
+          <w:noProof w:val="0"/>
+          <w:kern w:val="0"/>
+          <w:sz w:val="22"/>
+          <w:szCs w:val="22"/>
+          <w:lang w:val="de-DE" w:eastAsia="de-DE"/>
+          <w14:ligatures w14:val="none"/>
+        </w:rPr>
+        <w:t>finding</w:t>
+      </w:r>
+      <w:proofErr w:type="spellEnd"/>
+      <w:r>
+        <w:rPr>
+          <w:rFonts w:ascii="Lucida Sans Unicode" w:eastAsia="Times New Roman" w:hAnsi="Lucida Sans Unicode" w:cs="Lucida Sans Unicode"/>
+          <w:noProof w:val="0"/>
+          <w:kern w:val="0"/>
+          <w:sz w:val="22"/>
+          <w:szCs w:val="22"/>
+          <w:lang w:val="de-DE" w:eastAsia="de-DE"/>
+          <w14:ligatures w14:val="none"/>
+        </w:rPr>
+        <w:t xml:space="preserve"> relevant </w:t>
+      </w:r>
+      <w:proofErr w:type="spellStart"/>
+      <w:r>
+        <w:rPr>
+          <w:rFonts w:ascii="Lucida Sans Unicode" w:eastAsia="Times New Roman" w:hAnsi="Lucida Sans Unicode" w:cs="Lucida Sans Unicode"/>
+          <w:noProof w:val="0"/>
+          <w:kern w:val="0"/>
+          <w:sz w:val="22"/>
+          <w:szCs w:val="22"/>
+          <w:lang w:val="de-DE" w:eastAsia="de-DE"/>
+          <w14:ligatures w14:val="none"/>
+        </w:rPr>
+        <w:t>citations</w:t>
+      </w:r>
+      <w:proofErr w:type="spellEnd"/>
+      <w:r>
+        <w:rPr>
+          <w:rFonts w:ascii="Lucida Sans Unicode" w:eastAsia="Times New Roman" w:hAnsi="Lucida Sans Unicode" w:cs="Lucida Sans Unicode"/>
+          <w:noProof w:val="0"/>
+          <w:kern w:val="0"/>
+          <w:sz w:val="22"/>
+          <w:szCs w:val="22"/>
+          <w:lang w:val="de-DE" w:eastAsia="de-DE"/>
+          <w14:ligatures w14:val="none"/>
+        </w:rPr>
+        <w:t xml:space="preserve"> (</w:t>
+      </w:r>
+      <w:proofErr w:type="spellStart"/>
+      <w:r>
+        <w:rPr>
+          <w:rFonts w:ascii="Lucida Sans Unicode" w:eastAsia="Times New Roman" w:hAnsi="Lucida Sans Unicode" w:cs="Lucida Sans Unicode"/>
+          <w:noProof w:val="0"/>
+          <w:kern w:val="0"/>
+          <w:sz w:val="22"/>
+          <w:szCs w:val="22"/>
+          <w:lang w:val="de-DE" w:eastAsia="de-DE"/>
+          <w14:ligatures w14:val="none"/>
+        </w:rPr>
+        <w:t>correctly</w:t>
+      </w:r>
+      <w:proofErr w:type="spellEnd"/>
+      <w:r>
+        <w:rPr>
+          <w:rFonts w:ascii="Lucida Sans Unicode" w:eastAsia="Times New Roman" w:hAnsi="Lucida Sans Unicode" w:cs="Lucida Sans Unicode"/>
+          <w:noProof w:val="0"/>
+          <w:kern w:val="0"/>
+          <w:sz w:val="22"/>
+          <w:szCs w:val="22"/>
+          <w:lang w:val="de-DE" w:eastAsia="de-DE"/>
+          <w14:ligatures w14:val="none"/>
+        </w:rPr>
+        <w:t xml:space="preserve"> </w:t>
+      </w:r>
+      <w:proofErr w:type="spellStart"/>
+      <w:r>
+        <w:rPr>
+          <w:rFonts w:ascii="Lucida Sans Unicode" w:eastAsia="Times New Roman" w:hAnsi="Lucida Sans Unicode" w:cs="Lucida Sans Unicode"/>
+          <w:noProof w:val="0"/>
+          <w:kern w:val="0"/>
+          <w:sz w:val="22"/>
+          <w:szCs w:val="22"/>
+          <w:lang w:val="de-DE" w:eastAsia="de-DE"/>
+          <w14:ligatures w14:val="none"/>
+        </w:rPr>
+        <w:t>marked</w:t>
+      </w:r>
+      <w:proofErr w:type="spellEnd"/>
+      <w:r>
+        <w:rPr>
+          <w:rFonts w:ascii="Lucida Sans Unicode" w:eastAsia="Times New Roman" w:hAnsi="Lucida Sans Unicode" w:cs="Lucida Sans Unicode"/>
+          <w:noProof w:val="0"/>
+          <w:kern w:val="0"/>
+          <w:sz w:val="22"/>
+          <w:szCs w:val="22"/>
+          <w:lang w:val="de-DE" w:eastAsia="de-DE"/>
+          <w14:ligatures w14:val="none"/>
+        </w:rPr>
+        <w:t xml:space="preserve"> </w:t>
+      </w:r>
+      <w:proofErr w:type="spellStart"/>
+      <w:r>
+        <w:rPr>
+          <w:rFonts w:ascii="Lucida Sans Unicode" w:eastAsia="Times New Roman" w:hAnsi="Lucida Sans Unicode" w:cs="Lucida Sans Unicode"/>
+          <w:noProof w:val="0"/>
+          <w:kern w:val="0"/>
+          <w:sz w:val="22"/>
+          <w:szCs w:val="22"/>
+          <w:lang w:val="de-DE" w:eastAsia="de-DE"/>
+          <w14:ligatures w14:val="none"/>
+        </w:rPr>
+        <w:t>as</w:t>
+      </w:r>
+      <w:proofErr w:type="spellEnd"/>
+      <w:r>
+        <w:rPr>
+          <w:rFonts w:ascii="Lucida Sans Unicode" w:eastAsia="Times New Roman" w:hAnsi="Lucida Sans Unicode" w:cs="Lucida Sans Unicode"/>
+          <w:noProof w:val="0"/>
+          <w:kern w:val="0"/>
+          <w:sz w:val="22"/>
+          <w:szCs w:val="22"/>
+          <w:lang w:val="de-DE" w:eastAsia="de-DE"/>
+          <w14:ligatures w14:val="none"/>
+        </w:rPr>
+        <w:t xml:space="preserve"> such)</w:t>
+      </w:r>
+    </w:p>
+    <w:p>
+      <w:pPr>
+        <w:numPr>
+          <w:ilvl w:val="0"/>
+          <w:numId w:val="3"/>
+        </w:numPr>
+        <w:spacing w:before="100" w:beforeAutospacing="1" w:after="100" w:afterAutospacing="1" w:line="240" w:lineRule="auto"/>
+        <w:rPr>
+          <w:rFonts w:ascii="Lucida Sans Unicode" w:eastAsia="Times New Roman" w:hAnsi="Lucida Sans Unicode" w:cs="Lucida Sans Unicode"/>
+          <w:noProof w:val="0"/>
+          <w:kern w:val="0"/>
+          <w:sz w:val="22"/>
+          <w:szCs w:val="22"/>
+          <w:lang w:val="de-DE" w:eastAsia="de-DE"/>
+          <w14:ligatures w14:val="none"/>
+        </w:rPr>
+      </w:pPr>
+      <w:r>
+        <w:rPr>
+          <w:rFonts w:ascii="Lucida Sans Unicode" w:eastAsia="Times New Roman" w:hAnsi="Lucida Sans Unicode" w:cs="Lucida Sans Unicode"/>
+          <w:noProof w:val="0"/>
+          <w:kern w:val="0"/>
+          <w:sz w:val="22"/>
+          <w:szCs w:val="22"/>
+          <w:lang w:val="de-DE" w:eastAsia="de-DE"/>
+          <w14:ligatures w14:val="none"/>
+        </w:rPr>
+        <w:t xml:space="preserve">[ ] </w:t>
+      </w:r>
+      <w:proofErr w:type="spellStart"/>
+      <w:r>
+        <w:rPr>
+          <w:rFonts w:ascii="Lucida Sans Unicode" w:eastAsia="Times New Roman" w:hAnsi="Lucida Sans Unicode" w:cs="Lucida Sans Unicode"/>
+          <w:noProof w:val="0"/>
+          <w:kern w:val="0"/>
+          <w:sz w:val="22"/>
+          <w:szCs w:val="22"/>
+          <w:lang w:val="de-DE" w:eastAsia="de-DE"/>
+          <w14:ligatures w14:val="none"/>
+        </w:rPr>
+        <w:t>finding</w:t>
+      </w:r>
+      <w:proofErr w:type="spellEnd"/>
+      <w:r>
+        <w:rPr>
+          <w:rFonts w:ascii="Lucida Sans Unicode" w:eastAsia="Times New Roman" w:hAnsi="Lucida Sans Unicode" w:cs="Lucida Sans Unicode"/>
+          <w:noProof w:val="0"/>
+          <w:kern w:val="0"/>
+          <w:sz w:val="22"/>
+          <w:szCs w:val="22"/>
+          <w:lang w:val="de-DE" w:eastAsia="de-DE"/>
+          <w14:ligatures w14:val="none"/>
+        </w:rPr>
+        <w:t xml:space="preserve"> relevant </w:t>
+      </w:r>
+      <w:proofErr w:type="spellStart"/>
+      <w:r>
+        <w:rPr>
+          <w:rFonts w:ascii="Lucida Sans Unicode" w:eastAsia="Times New Roman" w:hAnsi="Lucida Sans Unicode" w:cs="Lucida Sans Unicode"/>
+          <w:noProof w:val="0"/>
+          <w:kern w:val="0"/>
+          <w:sz w:val="22"/>
+          <w:szCs w:val="22"/>
+          <w:lang w:val="de-DE" w:eastAsia="de-DE"/>
+          <w14:ligatures w14:val="none"/>
+        </w:rPr>
+        <w:t>scientific</w:t>
+      </w:r>
+      <w:proofErr w:type="spellEnd"/>
+      <w:r>
+        <w:rPr>
+          <w:rFonts w:ascii="Lucida Sans Unicode" w:eastAsia="Times New Roman" w:hAnsi="Lucida Sans Unicode" w:cs="Lucida Sans Unicode"/>
+          <w:noProof w:val="0"/>
+          <w:kern w:val="0"/>
+          <w:sz w:val="22"/>
+          <w:szCs w:val="22"/>
+          <w:lang w:val="de-DE" w:eastAsia="de-DE"/>
+          <w14:ligatures w14:val="none"/>
+        </w:rPr>
+        <w:t xml:space="preserve"> </w:t>
+      </w:r>
+      <w:proofErr w:type="spellStart"/>
+      <w:r>
+        <w:rPr>
+          <w:rFonts w:ascii="Lucida Sans Unicode" w:eastAsia="Times New Roman" w:hAnsi="Lucida Sans Unicode" w:cs="Lucida Sans Unicode"/>
+          <w:noProof w:val="0"/>
+          <w:kern w:val="0"/>
+          <w:sz w:val="22"/>
+          <w:szCs w:val="22"/>
+          <w:lang w:val="de-DE" w:eastAsia="de-DE"/>
+          <w14:ligatures w14:val="none"/>
+        </w:rPr>
+        <w:t>sources</w:t>
+      </w:r>
+      <w:proofErr w:type="spellEnd"/>
+      <w:r>
+        <w:rPr>
+          <w:rFonts w:ascii="Lucida Sans Unicode" w:eastAsia="Times New Roman" w:hAnsi="Lucida Sans Unicode" w:cs="Lucida Sans Unicode"/>
+          <w:noProof w:val="0"/>
+          <w:kern w:val="0"/>
+          <w:sz w:val="22"/>
+          <w:szCs w:val="22"/>
+          <w:lang w:val="de-DE" w:eastAsia="de-DE"/>
+          <w14:ligatures w14:val="none"/>
+        </w:rPr>
+        <w:t xml:space="preserve"> (</w:t>
+      </w:r>
+      <w:proofErr w:type="spellStart"/>
+      <w:r>
+        <w:rPr>
+          <w:rFonts w:ascii="Lucida Sans Unicode" w:eastAsia="Times New Roman" w:hAnsi="Lucida Sans Unicode" w:cs="Lucida Sans Unicode"/>
+          <w:noProof w:val="0"/>
+          <w:kern w:val="0"/>
+          <w:sz w:val="22"/>
+          <w:szCs w:val="22"/>
+          <w:lang w:val="de-DE" w:eastAsia="de-DE"/>
+          <w14:ligatures w14:val="none"/>
+        </w:rPr>
+        <w:t>correctly</w:t>
+      </w:r>
+      <w:proofErr w:type="spellEnd"/>
+      <w:r>
+        <w:rPr>
+          <w:rFonts w:ascii="Lucida Sans Unicode" w:eastAsia="Times New Roman" w:hAnsi="Lucida Sans Unicode" w:cs="Lucida Sans Unicode"/>
+          <w:noProof w:val="0"/>
+          <w:kern w:val="0"/>
+          <w:sz w:val="22"/>
+          <w:szCs w:val="22"/>
+          <w:lang w:val="de-DE" w:eastAsia="de-DE"/>
+          <w14:ligatures w14:val="none"/>
+        </w:rPr>
+        <w:t xml:space="preserve"> </w:t>
+      </w:r>
+      <w:proofErr w:type="spellStart"/>
+      <w:r>
+        <w:rPr>
+          <w:rFonts w:ascii="Lucida Sans Unicode" w:eastAsia="Times New Roman" w:hAnsi="Lucida Sans Unicode" w:cs="Lucida Sans Unicode"/>
+          <w:noProof w:val="0"/>
+          <w:kern w:val="0"/>
+          <w:sz w:val="22"/>
+          <w:szCs w:val="22"/>
+          <w:lang w:val="de-DE" w:eastAsia="de-DE"/>
+          <w14:ligatures w14:val="none"/>
+        </w:rPr>
+        <w:t>marked</w:t>
+      </w:r>
+      <w:proofErr w:type="spellEnd"/>
+      <w:r>
+        <w:rPr>
+          <w:rFonts w:ascii="Lucida Sans Unicode" w:eastAsia="Times New Roman" w:hAnsi="Lucida Sans Unicode" w:cs="Lucida Sans Unicode"/>
+          <w:noProof w:val="0"/>
+          <w:kern w:val="0"/>
+          <w:sz w:val="22"/>
+          <w:szCs w:val="22"/>
+          <w:lang w:val="de-DE" w:eastAsia="de-DE"/>
+          <w14:ligatures w14:val="none"/>
+        </w:rPr>
+        <w:t xml:space="preserve"> </w:t>
+      </w:r>
+      <w:proofErr w:type="spellStart"/>
+      <w:r>
+        <w:rPr>
+          <w:rFonts w:ascii="Lucida Sans Unicode" w:eastAsia="Times New Roman" w:hAnsi="Lucida Sans Unicode" w:cs="Lucida Sans Unicode"/>
+          <w:noProof w:val="0"/>
+          <w:kern w:val="0"/>
+          <w:sz w:val="22"/>
+          <w:szCs w:val="22"/>
+          <w:lang w:val="de-DE" w:eastAsia="de-DE"/>
+          <w14:ligatures w14:val="none"/>
+        </w:rPr>
+        <w:t>as</w:t>
+      </w:r>
+      <w:proofErr w:type="spellEnd"/>
+      <w:r>
+        <w:rPr>
+          <w:rFonts w:ascii="Lucida Sans Unicode" w:eastAsia="Times New Roman" w:hAnsi="Lucida Sans Unicode" w:cs="Lucida Sans Unicode"/>
+          <w:noProof w:val="0"/>
+          <w:kern w:val="0"/>
+          <w:sz w:val="22"/>
+          <w:szCs w:val="22"/>
+          <w:lang w:val="de-DE" w:eastAsia="de-DE"/>
+          <w14:ligatures w14:val="none"/>
+        </w:rPr>
+        <w:t xml:space="preserve"> such)</w:t>
+      </w:r>
+    </w:p>
+    <w:p>
+      <w:pPr>
+        <w:numPr>
+          <w:ilvl w:val="0"/>
+          <w:numId w:val="3"/>
+        </w:numPr>
+        <w:spacing w:before="100" w:beforeAutospacing="1" w:after="100" w:afterAutospacing="1" w:line="240" w:lineRule="auto"/>
+        <w:rPr>
+          <w:rFonts w:ascii="Lucida Sans Unicode" w:eastAsia="Times New Roman" w:hAnsi="Lucida Sans Unicode" w:cs="Lucida Sans Unicode"/>
+          <w:noProof w:val="0"/>
+          <w:kern w:val="0"/>
+          <w:sz w:val="22"/>
+          <w:szCs w:val="22"/>
+          <w:lang w:val="de-DE" w:eastAsia="de-DE"/>
+          <w14:ligatures w14:val="none"/>
+        </w:rPr>
+      </w:pPr>
+      <w:r>
+        <w:rPr>
+          <w:rFonts w:ascii="Lucida Sans Unicode" w:eastAsia="Times New Roman" w:hAnsi="Lucida Sans Unicode" w:cs="Lucida Sans Unicode"/>
+          <w:noProof w:val="0"/>
+          <w:kern w:val="0"/>
+          <w:sz w:val="22"/>
+          <w:szCs w:val="22"/>
+          <w:lang w:val="de-DE" w:eastAsia="de-DE"/>
+          <w14:ligatures w14:val="none"/>
+        </w:rPr>
+        <w:t xml:space="preserve">[ ] </w:t>
+      </w:r>
+      <w:proofErr w:type="spellStart"/>
+      <w:r>
+        <w:rPr>
+          <w:rFonts w:ascii="Lucida Sans Unicode" w:eastAsia="Times New Roman" w:hAnsi="Lucida Sans Unicode" w:cs="Lucida Sans Unicode"/>
+          <w:noProof w:val="0"/>
+          <w:kern w:val="0"/>
+          <w:sz w:val="22"/>
+          <w:szCs w:val="22"/>
+          <w:lang w:val="de-DE" w:eastAsia="de-DE"/>
+          <w14:ligatures w14:val="none"/>
+        </w:rPr>
+        <w:t>translation</w:t>
+      </w:r>
+      <w:proofErr w:type="spellEnd"/>
+      <w:r>
+        <w:rPr>
+          <w:rFonts w:ascii="Lucida Sans Unicode" w:eastAsia="Times New Roman" w:hAnsi="Lucida Sans Unicode" w:cs="Lucida Sans Unicode"/>
+          <w:noProof w:val="0"/>
+          <w:kern w:val="0"/>
+          <w:sz w:val="22"/>
+          <w:szCs w:val="22"/>
+          <w:lang w:val="de-DE" w:eastAsia="de-DE"/>
+          <w14:ligatures w14:val="none"/>
+        </w:rPr>
+        <w:t xml:space="preserve"> </w:t>
+      </w:r>
+      <w:proofErr w:type="spellStart"/>
+      <w:r>
+        <w:rPr>
+          <w:rFonts w:ascii="Lucida Sans Unicode" w:eastAsia="Times New Roman" w:hAnsi="Lucida Sans Unicode" w:cs="Lucida Sans Unicode"/>
+          <w:noProof w:val="0"/>
+          <w:kern w:val="0"/>
+          <w:sz w:val="22"/>
+          <w:szCs w:val="22"/>
+          <w:lang w:val="de-DE" w:eastAsia="de-DE"/>
+          <w14:ligatures w14:val="none"/>
+        </w:rPr>
+        <w:t>of</w:t>
+      </w:r>
+      <w:proofErr w:type="spellEnd"/>
+      <w:r>
+        <w:rPr>
+          <w:rFonts w:ascii="Lucida Sans Unicode" w:eastAsia="Times New Roman" w:hAnsi="Lucida Sans Unicode" w:cs="Lucida Sans Unicode"/>
+          <w:noProof w:val="0"/>
+          <w:kern w:val="0"/>
+          <w:sz w:val="22"/>
+          <w:szCs w:val="22"/>
+          <w:lang w:val="de-DE" w:eastAsia="de-DE"/>
+          <w14:ligatures w14:val="none"/>
+        </w:rPr>
+        <w:t xml:space="preserve"> </w:t>
+      </w:r>
+      <w:proofErr w:type="spellStart"/>
+      <w:r>
+        <w:rPr>
+          <w:rFonts w:ascii="Lucida Sans Unicode" w:eastAsia="Times New Roman" w:hAnsi="Lucida Sans Unicode" w:cs="Lucida Sans Unicode"/>
+          <w:noProof w:val="0"/>
+          <w:kern w:val="0"/>
+          <w:sz w:val="22"/>
+          <w:szCs w:val="22"/>
+          <w:lang w:val="de-DE" w:eastAsia="de-DE"/>
+          <w14:ligatures w14:val="none"/>
+        </w:rPr>
+        <w:t>citations</w:t>
+      </w:r>
+      <w:proofErr w:type="spellEnd"/>
+      <w:r>
+        <w:rPr>
+          <w:rFonts w:ascii="Lucida Sans Unicode" w:eastAsia="Times New Roman" w:hAnsi="Lucida Sans Unicode" w:cs="Lucida Sans Unicode"/>
+          <w:noProof w:val="0"/>
+          <w:kern w:val="0"/>
+          <w:sz w:val="22"/>
+          <w:szCs w:val="22"/>
+          <w:lang w:val="de-DE" w:eastAsia="de-DE"/>
+          <w14:ligatures w14:val="none"/>
+        </w:rPr>
+        <w:t xml:space="preserve"> </w:t>
+      </w:r>
+      <w:proofErr w:type="spellStart"/>
+      <w:r>
+        <w:rPr>
+          <w:rFonts w:ascii="Lucida Sans Unicode" w:eastAsia="Times New Roman" w:hAnsi="Lucida Sans Unicode" w:cs="Lucida Sans Unicode"/>
+          <w:noProof w:val="0"/>
+          <w:kern w:val="0"/>
+          <w:sz w:val="22"/>
+          <w:szCs w:val="22"/>
+          <w:lang w:val="de-DE" w:eastAsia="de-DE"/>
+          <w14:ligatures w14:val="none"/>
+        </w:rPr>
+        <w:t>or</w:t>
+      </w:r>
+      <w:proofErr w:type="spellEnd"/>
+      <w:r>
+        <w:rPr>
+          <w:rFonts w:ascii="Lucida Sans Unicode" w:eastAsia="Times New Roman" w:hAnsi="Lucida Sans Unicode" w:cs="Lucida Sans Unicode"/>
+          <w:noProof w:val="0"/>
+          <w:kern w:val="0"/>
+          <w:sz w:val="22"/>
+          <w:szCs w:val="22"/>
+          <w:lang w:val="de-DE" w:eastAsia="de-DE"/>
+          <w14:ligatures w14:val="none"/>
+        </w:rPr>
+        <w:t xml:space="preserve"> </w:t>
+      </w:r>
+      <w:proofErr w:type="spellStart"/>
+      <w:r>
+        <w:rPr>
+          <w:rFonts w:ascii="Lucida Sans Unicode" w:eastAsia="Times New Roman" w:hAnsi="Lucida Sans Unicode" w:cs="Lucida Sans Unicode"/>
+          <w:noProof w:val="0"/>
+          <w:kern w:val="0"/>
+          <w:sz w:val="22"/>
+          <w:szCs w:val="22"/>
+          <w:lang w:val="de-DE" w:eastAsia="de-DE"/>
+          <w14:ligatures w14:val="none"/>
+        </w:rPr>
+        <w:t>text</w:t>
+      </w:r>
+      <w:proofErr w:type="spellEnd"/>
+      <w:r>
+        <w:rPr>
+          <w:rFonts w:ascii="Lucida Sans Unicode" w:eastAsia="Times New Roman" w:hAnsi="Lucida Sans Unicode" w:cs="Lucida Sans Unicode"/>
+          <w:noProof w:val="0"/>
+          <w:kern w:val="0"/>
+          <w:sz w:val="22"/>
+          <w:szCs w:val="22"/>
+          <w:lang w:val="de-DE" w:eastAsia="de-DE"/>
+          <w14:ligatures w14:val="none"/>
+        </w:rPr>
+        <w:t xml:space="preserve"> </w:t>
+      </w:r>
+      <w:proofErr w:type="spellStart"/>
+      <w:r>
+        <w:rPr>
+          <w:rFonts w:ascii="Lucida Sans Unicode" w:eastAsia="Times New Roman" w:hAnsi="Lucida Sans Unicode" w:cs="Lucida Sans Unicode"/>
+          <w:noProof w:val="0"/>
+          <w:kern w:val="0"/>
+          <w:sz w:val="22"/>
+          <w:szCs w:val="22"/>
+          <w:lang w:val="de-DE" w:eastAsia="de-DE"/>
+          <w14:ligatures w14:val="none"/>
+        </w:rPr>
+        <w:t>passages</w:t>
+      </w:r>
+      <w:proofErr w:type="spellEnd"/>
+      <w:r>
+        <w:rPr>
+          <w:rFonts w:ascii="Lucida Sans Unicode" w:eastAsia="Times New Roman" w:hAnsi="Lucida Sans Unicode" w:cs="Lucida Sans Unicode"/>
+          <w:noProof w:val="0"/>
+          <w:kern w:val="0"/>
+          <w:sz w:val="22"/>
+          <w:szCs w:val="22"/>
+          <w:lang w:val="de-DE" w:eastAsia="de-DE"/>
+          <w14:ligatures w14:val="none"/>
+        </w:rPr>
+        <w:t xml:space="preserve"> (</w:t>
+      </w:r>
+      <w:proofErr w:type="spellStart"/>
+      <w:r>
+        <w:rPr>
+          <w:rFonts w:ascii="Lucida Sans Unicode" w:eastAsia="Times New Roman" w:hAnsi="Lucida Sans Unicode" w:cs="Lucida Sans Unicode"/>
+          <w:noProof w:val="0"/>
+          <w:kern w:val="0"/>
+          <w:sz w:val="22"/>
+          <w:szCs w:val="22"/>
+          <w:lang w:val="de-DE" w:eastAsia="de-DE"/>
+          <w14:ligatures w14:val="none"/>
+        </w:rPr>
+        <w:t>correctly</w:t>
+      </w:r>
+      <w:proofErr w:type="spellEnd"/>
+      <w:r>
+        <w:rPr>
+          <w:rFonts w:ascii="Lucida Sans Unicode" w:eastAsia="Times New Roman" w:hAnsi="Lucida Sans Unicode" w:cs="Lucida Sans Unicode"/>
+          <w:noProof w:val="0"/>
+          <w:kern w:val="0"/>
+          <w:sz w:val="22"/>
+          <w:szCs w:val="22"/>
+          <w:lang w:val="de-DE" w:eastAsia="de-DE"/>
+          <w14:ligatures w14:val="none"/>
+        </w:rPr>
+        <w:t xml:space="preserve"> </w:t>
+      </w:r>
+      <w:proofErr w:type="spellStart"/>
+      <w:r>
+        <w:rPr>
+          <w:rFonts w:ascii="Lucida Sans Unicode" w:eastAsia="Times New Roman" w:hAnsi="Lucida Sans Unicode" w:cs="Lucida Sans Unicode"/>
+          <w:noProof w:val="0"/>
+          <w:kern w:val="0"/>
+          <w:sz w:val="22"/>
+          <w:szCs w:val="22"/>
+          <w:lang w:val="de-DE" w:eastAsia="de-DE"/>
+          <w14:ligatures w14:val="none"/>
+        </w:rPr>
+        <w:t>marked</w:t>
+      </w:r>
+      <w:proofErr w:type="spellEnd"/>
+      <w:r>
+        <w:rPr>
+          <w:rFonts w:ascii="Lucida Sans Unicode" w:eastAsia="Times New Roman" w:hAnsi="Lucida Sans Unicode" w:cs="Lucida Sans Unicode"/>
+          <w:noProof w:val="0"/>
+          <w:kern w:val="0"/>
+          <w:sz w:val="22"/>
+          <w:szCs w:val="22"/>
+          <w:lang w:val="de-DE" w:eastAsia="de-DE"/>
+          <w14:ligatures w14:val="none"/>
+        </w:rPr>
+        <w:t xml:space="preserve"> </w:t>
+      </w:r>
+      <w:proofErr w:type="spellStart"/>
+      <w:r>
+        <w:rPr>
+          <w:rFonts w:ascii="Lucida Sans Unicode" w:eastAsia="Times New Roman" w:hAnsi="Lucida Sans Unicode" w:cs="Lucida Sans Unicode"/>
+          <w:noProof w:val="0"/>
+          <w:kern w:val="0"/>
+          <w:sz w:val="22"/>
+          <w:szCs w:val="22"/>
+          <w:lang w:val="de-DE" w:eastAsia="de-DE"/>
+          <w14:ligatures w14:val="none"/>
+        </w:rPr>
+        <w:t>as</w:t>
+      </w:r>
+      <w:proofErr w:type="spellEnd"/>
+      <w:r>
+        <w:rPr>
+          <w:rFonts w:ascii="Lucida Sans Unicode" w:eastAsia="Times New Roman" w:hAnsi="Lucida Sans Unicode" w:cs="Lucida Sans Unicode"/>
+          <w:noProof w:val="0"/>
+          <w:kern w:val="0"/>
+          <w:sz w:val="22"/>
+          <w:szCs w:val="22"/>
+          <w:lang w:val="de-DE" w:eastAsia="de-DE"/>
+          <w14:ligatures w14:val="none"/>
+        </w:rPr>
+        <w:t xml:space="preserve"> such, e.g. “</w:t>
+      </w:r>
+      <w:proofErr w:type="spellStart"/>
+      <w:r>
+        <w:rPr>
+          <w:rFonts w:ascii="Lucida Sans Unicode" w:eastAsia="Times New Roman" w:hAnsi="Lucida Sans Unicode" w:cs="Lucida Sans Unicode"/>
+          <w:noProof w:val="0"/>
+          <w:kern w:val="0"/>
+          <w:sz w:val="22"/>
+          <w:szCs w:val="22"/>
+          <w:lang w:val="de-DE" w:eastAsia="de-DE"/>
+          <w14:ligatures w14:val="none"/>
+        </w:rPr>
+        <w:t>translated</w:t>
+      </w:r>
+      <w:proofErr w:type="spellEnd"/>
+      <w:r>
+        <w:rPr>
+          <w:rFonts w:ascii="Lucida Sans Unicode" w:eastAsia="Times New Roman" w:hAnsi="Lucida Sans Unicode" w:cs="Lucida Sans Unicode"/>
+          <w:noProof w:val="0"/>
+          <w:kern w:val="0"/>
+          <w:sz w:val="22"/>
+          <w:szCs w:val="22"/>
+          <w:lang w:val="de-DE" w:eastAsia="de-DE"/>
+          <w14:ligatures w14:val="none"/>
+        </w:rPr>
+        <w:t xml:space="preserve"> </w:t>
+      </w:r>
+      <w:proofErr w:type="spellStart"/>
+      <w:r>
+        <w:rPr>
+          <w:rFonts w:ascii="Lucida Sans Unicode" w:eastAsia="Times New Roman" w:hAnsi="Lucida Sans Unicode" w:cs="Lucida Sans Unicode"/>
+          <w:noProof w:val="0"/>
+          <w:kern w:val="0"/>
+          <w:sz w:val="22"/>
+          <w:szCs w:val="22"/>
+          <w:lang w:val="de-DE" w:eastAsia="de-DE"/>
+          <w14:ligatures w14:val="none"/>
+        </w:rPr>
+        <w:t>with</w:t>
+      </w:r>
+      <w:proofErr w:type="spellEnd"/>
+      <w:r>
+        <w:rPr>
+          <w:rFonts w:ascii="Lucida Sans Unicode" w:eastAsia="Times New Roman" w:hAnsi="Lucida Sans Unicode" w:cs="Lucida Sans Unicode"/>
+          <w:noProof w:val="0"/>
+          <w:kern w:val="0"/>
+          <w:sz w:val="22"/>
+          <w:szCs w:val="22"/>
+          <w:lang w:val="de-DE" w:eastAsia="de-DE"/>
+          <w14:ligatures w14:val="none"/>
+        </w:rPr>
+        <w:t xml:space="preserve"> DeepL”)</w:t>
+      </w:r>
+    </w:p>
+    <w:p>
+      <w:pPr>
+        <w:numPr>
+          <w:ilvl w:val="0"/>
+          <w:numId w:val="3"/>
+        </w:numPr>
+        <w:spacing w:before="100" w:beforeAutospacing="1" w:after="100" w:afterAutospacing="1" w:line="240" w:lineRule="auto"/>
+        <w:rPr>
+          <w:rFonts w:ascii="Lucida Sans Unicode" w:eastAsia="Times New Roman" w:hAnsi="Lucida Sans Unicode" w:cs="Lucida Sans Unicode"/>
+          <w:noProof w:val="0"/>
+          <w:kern w:val="0"/>
+          <w:sz w:val="22"/>
+          <w:szCs w:val="22"/>
+          <w:lang w:val="de-DE" w:eastAsia="de-DE"/>
+          <w14:ligatures w14:val="none"/>
+        </w:rPr>
+      </w:pPr>
+      <w:r>
+        <w:rPr>
+          <w:rFonts w:ascii="Lucida Sans Unicode" w:eastAsia="Times New Roman" w:hAnsi="Lucida Sans Unicode" w:cs="Lucida Sans Unicode"/>
+          <w:noProof w:val="0"/>
+          <w:kern w:val="0"/>
+          <w:sz w:val="22"/>
+          <w:szCs w:val="22"/>
+          <w:lang w:val="de-DE" w:eastAsia="de-DE"/>
+          <w14:ligatures w14:val="none"/>
+        </w:rPr>
+        <w:t xml:space="preserve">[ ] </w:t>
+      </w:r>
+      <w:proofErr w:type="spellStart"/>
+      <w:r>
+        <w:rPr>
+          <w:rFonts w:ascii="Lucida Sans Unicode" w:eastAsia="Times New Roman" w:hAnsi="Lucida Sans Unicode" w:cs="Lucida Sans Unicode"/>
+          <w:noProof w:val="0"/>
+          <w:kern w:val="0"/>
+          <w:sz w:val="22"/>
+          <w:szCs w:val="22"/>
+          <w:lang w:val="de-DE" w:eastAsia="de-DE"/>
+          <w14:ligatures w14:val="none"/>
+        </w:rPr>
+        <w:t>summarizing</w:t>
+      </w:r>
+      <w:proofErr w:type="spellEnd"/>
+      <w:r>
+        <w:rPr>
+          <w:rFonts w:ascii="Lucida Sans Unicode" w:eastAsia="Times New Roman" w:hAnsi="Lucida Sans Unicode" w:cs="Lucida Sans Unicode"/>
+          <w:noProof w:val="0"/>
+          <w:kern w:val="0"/>
+          <w:sz w:val="22"/>
+          <w:szCs w:val="22"/>
+          <w:lang w:val="de-DE" w:eastAsia="de-DE"/>
+          <w14:ligatures w14:val="none"/>
+        </w:rPr>
+        <w:t xml:space="preserve"> </w:t>
+      </w:r>
+      <w:proofErr w:type="spellStart"/>
+      <w:r>
+        <w:rPr>
+          <w:rFonts w:ascii="Lucida Sans Unicode" w:eastAsia="Times New Roman" w:hAnsi="Lucida Sans Unicode" w:cs="Lucida Sans Unicode"/>
+          <w:noProof w:val="0"/>
+          <w:kern w:val="0"/>
+          <w:sz w:val="22"/>
+          <w:szCs w:val="22"/>
+          <w:lang w:val="de-DE" w:eastAsia="de-DE"/>
+          <w14:ligatures w14:val="none"/>
+        </w:rPr>
+        <w:t>information</w:t>
+      </w:r>
+      <w:proofErr w:type="spellEnd"/>
+    </w:p>
+    <w:p>
+      <w:pPr>
+        <w:numPr>
+          <w:ilvl w:val="0"/>
+          <w:numId w:val="3"/>
+        </w:numPr>
+        <w:spacing w:before="100" w:beforeAutospacing="1" w:after="100" w:afterAutospacing="1" w:line="240" w:lineRule="auto"/>
+        <w:rPr>
+          <w:rFonts w:ascii="Lucida Sans Unicode" w:eastAsia="Times New Roman" w:hAnsi="Lucida Sans Unicode" w:cs="Lucida Sans Unicode"/>
+          <w:noProof w:val="0"/>
+          <w:kern w:val="0"/>
+          <w:sz w:val="22"/>
+          <w:szCs w:val="22"/>
+          <w:lang w:val="de-DE" w:eastAsia="de-DE"/>
+          <w14:ligatures w14:val="none"/>
+        </w:rPr>
+      </w:pPr>
+      <w:r>
+        <w:rPr>
+          <w:rFonts w:ascii="Lucida Sans Unicode" w:eastAsia="Times New Roman" w:hAnsi="Lucida Sans Unicode" w:cs="Lucida Sans Unicode"/>
+          <w:noProof w:val="0"/>
+          <w:kern w:val="0"/>
+          <w:sz w:val="22"/>
+          <w:szCs w:val="22"/>
+          <w:lang w:val="de-DE" w:eastAsia="de-DE"/>
+          <w14:ligatures w14:val="none"/>
+        </w:rPr>
+        <w:t xml:space="preserve">[ ] </w:t>
+      </w:r>
+      <w:proofErr w:type="spellStart"/>
+      <w:r>
+        <w:rPr>
+          <w:rFonts w:ascii="Lucida Sans Unicode" w:eastAsia="Times New Roman" w:hAnsi="Lucida Sans Unicode" w:cs="Lucida Sans Unicode"/>
+          <w:noProof w:val="0"/>
+          <w:kern w:val="0"/>
+          <w:sz w:val="22"/>
+          <w:szCs w:val="22"/>
+          <w:lang w:val="de-DE" w:eastAsia="de-DE"/>
+          <w14:ligatures w14:val="none"/>
+        </w:rPr>
+        <w:t>transcribing</w:t>
+      </w:r>
+      <w:proofErr w:type="spellEnd"/>
+      <w:r>
+        <w:rPr>
+          <w:rFonts w:ascii="Lucida Sans Unicode" w:eastAsia="Times New Roman" w:hAnsi="Lucida Sans Unicode" w:cs="Lucida Sans Unicode"/>
+          <w:noProof w:val="0"/>
+          <w:kern w:val="0"/>
+          <w:sz w:val="22"/>
+          <w:szCs w:val="22"/>
+          <w:lang w:val="de-DE" w:eastAsia="de-DE"/>
+          <w14:ligatures w14:val="none"/>
+        </w:rPr>
+        <w:t xml:space="preserve"> </w:t>
+      </w:r>
+      <w:proofErr w:type="spellStart"/>
+      <w:r>
+        <w:rPr>
+          <w:rFonts w:ascii="Lucida Sans Unicode" w:eastAsia="Times New Roman" w:hAnsi="Lucida Sans Unicode" w:cs="Lucida Sans Unicode"/>
+          <w:noProof w:val="0"/>
+          <w:kern w:val="0"/>
+          <w:sz w:val="22"/>
+          <w:szCs w:val="22"/>
+          <w:lang w:val="de-DE" w:eastAsia="de-DE"/>
+          <w14:ligatures w14:val="none"/>
+        </w:rPr>
+        <w:t>assistance</w:t>
+      </w:r>
+      <w:proofErr w:type="spellEnd"/>
+      <w:r>
+        <w:rPr>
+          <w:rFonts w:ascii="Lucida Sans Unicode" w:eastAsia="Times New Roman" w:hAnsi="Lucida Sans Unicode" w:cs="Lucida Sans Unicode"/>
+          <w:noProof w:val="0"/>
+          <w:kern w:val="0"/>
+          <w:sz w:val="22"/>
+          <w:szCs w:val="22"/>
+          <w:lang w:val="de-DE" w:eastAsia="de-DE"/>
+          <w14:ligatures w14:val="none"/>
+        </w:rPr>
+        <w:t xml:space="preserve"> </w:t>
+      </w:r>
+      <w:proofErr w:type="spellStart"/>
+      <w:r>
+        <w:rPr>
+          <w:rFonts w:ascii="Lucida Sans Unicode" w:eastAsia="Times New Roman" w:hAnsi="Lucida Sans Unicode" w:cs="Lucida Sans Unicode"/>
+          <w:noProof w:val="0"/>
+          <w:kern w:val="0"/>
+          <w:sz w:val="22"/>
+          <w:szCs w:val="22"/>
+          <w:lang w:val="de-DE" w:eastAsia="de-DE"/>
+          <w14:ligatures w14:val="none"/>
+        </w:rPr>
+        <w:t>from</w:t>
+      </w:r>
+      <w:proofErr w:type="spellEnd"/>
+      <w:r>
+        <w:rPr>
+          <w:rFonts w:ascii="Lucida Sans Unicode" w:eastAsia="Times New Roman" w:hAnsi="Lucida Sans Unicode" w:cs="Lucida Sans Unicode"/>
+          <w:noProof w:val="0"/>
+          <w:kern w:val="0"/>
+          <w:sz w:val="22"/>
+          <w:szCs w:val="22"/>
+          <w:lang w:val="de-DE" w:eastAsia="de-DE"/>
+          <w14:ligatures w14:val="none"/>
+        </w:rPr>
+        <w:t xml:space="preserve"> </w:t>
+      </w:r>
+      <w:proofErr w:type="spellStart"/>
+      <w:r>
+        <w:rPr>
+          <w:rFonts w:ascii="Lucida Sans Unicode" w:eastAsia="Times New Roman" w:hAnsi="Lucida Sans Unicode" w:cs="Lucida Sans Unicode"/>
+          <w:noProof w:val="0"/>
+          <w:kern w:val="0"/>
+          <w:sz w:val="22"/>
+          <w:szCs w:val="22"/>
+          <w:lang w:val="de-DE" w:eastAsia="de-DE"/>
+          <w14:ligatures w14:val="none"/>
+        </w:rPr>
+        <w:t>audio</w:t>
+      </w:r>
+      <w:proofErr w:type="spellEnd"/>
+      <w:r>
+        <w:rPr>
+          <w:rFonts w:ascii="Lucida Sans Unicode" w:eastAsia="Times New Roman" w:hAnsi="Lucida Sans Unicode" w:cs="Lucida Sans Unicode"/>
+          <w:noProof w:val="0"/>
+          <w:kern w:val="0"/>
+          <w:sz w:val="22"/>
+          <w:szCs w:val="22"/>
+          <w:lang w:val="de-DE" w:eastAsia="de-DE"/>
+          <w14:ligatures w14:val="none"/>
+        </w:rPr>
+        <w:t xml:space="preserve"> </w:t>
+      </w:r>
+      <w:proofErr w:type="spellStart"/>
+      <w:r>
+        <w:rPr>
+          <w:rFonts w:ascii="Lucida Sans Unicode" w:eastAsia="Times New Roman" w:hAnsi="Lucida Sans Unicode" w:cs="Lucida Sans Unicode"/>
+          <w:noProof w:val="0"/>
+          <w:kern w:val="0"/>
+          <w:sz w:val="22"/>
+          <w:szCs w:val="22"/>
+          <w:lang w:val="de-DE" w:eastAsia="de-DE"/>
+          <w14:ligatures w14:val="none"/>
+        </w:rPr>
+        <w:t>or</w:t>
+      </w:r>
+      <w:proofErr w:type="spellEnd"/>
+      <w:r>
+        <w:rPr>
+          <w:rFonts w:ascii="Lucida Sans Unicode" w:eastAsia="Times New Roman" w:hAnsi="Lucida Sans Unicode" w:cs="Lucida Sans Unicode"/>
+          <w:noProof w:val="0"/>
+          <w:kern w:val="0"/>
+          <w:sz w:val="22"/>
+          <w:szCs w:val="22"/>
+          <w:lang w:val="de-DE" w:eastAsia="de-DE"/>
+          <w14:ligatures w14:val="none"/>
+        </w:rPr>
+        <w:t xml:space="preserve"> </w:t>
+      </w:r>
+      <w:proofErr w:type="spellStart"/>
+      <w:r>
+        <w:rPr>
+          <w:rFonts w:ascii="Lucida Sans Unicode" w:eastAsia="Times New Roman" w:hAnsi="Lucida Sans Unicode" w:cs="Lucida Sans Unicode"/>
+          <w:noProof w:val="0"/>
+          <w:kern w:val="0"/>
+          <w:sz w:val="22"/>
+          <w:szCs w:val="22"/>
+          <w:lang w:val="de-DE" w:eastAsia="de-DE"/>
+          <w14:ligatures w14:val="none"/>
+        </w:rPr>
+        <w:t>video</w:t>
+      </w:r>
+      <w:proofErr w:type="spellEnd"/>
+    </w:p>
+    <w:p>
+      <w:pPr>
+        <w:numPr>
+          <w:ilvl w:val="0"/>
+          <w:numId w:val="3"/>
+        </w:numPr>
+        <w:spacing w:before="100" w:beforeAutospacing="1" w:after="100" w:afterAutospacing="1" w:line="240" w:lineRule="auto"/>
+        <w:rPr>
+          <w:rFonts w:ascii="Lucida Sans Unicode" w:eastAsia="Times New Roman" w:hAnsi="Lucida Sans Unicode" w:cs="Lucida Sans Unicode"/>
+          <w:noProof w:val="0"/>
+          <w:kern w:val="0"/>
+          <w:sz w:val="22"/>
+          <w:szCs w:val="22"/>
+          <w:lang w:val="de-DE" w:eastAsia="de-DE"/>
+          <w14:ligatures w14:val="none"/>
+        </w:rPr>
+      </w:pPr>
+      <w:r>
+        <w:rPr>
+          <w:rFonts w:ascii="Lucida Sans Unicode" w:eastAsia="Times New Roman" w:hAnsi="Lucida Sans Unicode" w:cs="Lucida Sans Unicode"/>
+          <w:noProof w:val="0"/>
+          <w:kern w:val="0"/>
+          <w:sz w:val="22"/>
+          <w:szCs w:val="22"/>
+          <w:lang w:val="de-DE" w:eastAsia="de-DE"/>
+          <w14:ligatures w14:val="none"/>
+        </w:rPr>
+        <w:t xml:space="preserve">[ ] </w:t>
+      </w:r>
+      <w:proofErr w:type="spellStart"/>
+      <w:r>
+        <w:rPr>
+          <w:rFonts w:ascii="Lucida Sans Unicode" w:eastAsia="Times New Roman" w:hAnsi="Lucida Sans Unicode" w:cs="Lucida Sans Unicode"/>
+          <w:noProof w:val="0"/>
+          <w:kern w:val="0"/>
+          <w:sz w:val="22"/>
+          <w:szCs w:val="22"/>
+          <w:lang w:val="de-DE" w:eastAsia="de-DE"/>
+          <w14:ligatures w14:val="none"/>
+        </w:rPr>
+        <w:t>generating</w:t>
+      </w:r>
+      <w:proofErr w:type="spellEnd"/>
+      <w:r>
+        <w:rPr>
+          <w:rFonts w:ascii="Lucida Sans Unicode" w:eastAsia="Times New Roman" w:hAnsi="Lucida Sans Unicode" w:cs="Lucida Sans Unicode"/>
+          <w:noProof w:val="0"/>
+          <w:kern w:val="0"/>
+          <w:sz w:val="22"/>
+          <w:szCs w:val="22"/>
+          <w:lang w:val="de-DE" w:eastAsia="de-DE"/>
+          <w14:ligatures w14:val="none"/>
+        </w:rPr>
+        <w:t xml:space="preserve"> </w:t>
+      </w:r>
+      <w:proofErr w:type="spellStart"/>
+      <w:r>
+        <w:rPr>
+          <w:rFonts w:ascii="Lucida Sans Unicode" w:eastAsia="Times New Roman" w:hAnsi="Lucida Sans Unicode" w:cs="Lucida Sans Unicode"/>
+          <w:noProof w:val="0"/>
+          <w:kern w:val="0"/>
+          <w:sz w:val="22"/>
+          <w:szCs w:val="22"/>
+          <w:lang w:val="de-DE" w:eastAsia="de-DE"/>
+          <w14:ligatures w14:val="none"/>
+        </w:rPr>
+        <w:t>or</w:t>
+      </w:r>
+      <w:proofErr w:type="spellEnd"/>
+      <w:r>
+        <w:rPr>
+          <w:rFonts w:ascii="Lucida Sans Unicode" w:eastAsia="Times New Roman" w:hAnsi="Lucida Sans Unicode" w:cs="Lucida Sans Unicode"/>
+          <w:noProof w:val="0"/>
+          <w:kern w:val="0"/>
+          <w:sz w:val="22"/>
+          <w:szCs w:val="22"/>
+          <w:lang w:val="de-DE" w:eastAsia="de-DE"/>
+          <w14:ligatures w14:val="none"/>
+        </w:rPr>
+        <w:t xml:space="preserve"> </w:t>
+      </w:r>
+      <w:proofErr w:type="spellStart"/>
+      <w:r>
+        <w:rPr>
+          <w:rFonts w:ascii="Lucida Sans Unicode" w:eastAsia="Times New Roman" w:hAnsi="Lucida Sans Unicode" w:cs="Lucida Sans Unicode"/>
+          <w:noProof w:val="0"/>
+          <w:kern w:val="0"/>
+          <w:sz w:val="22"/>
+          <w:szCs w:val="22"/>
+          <w:lang w:val="de-DE" w:eastAsia="de-DE"/>
+          <w14:ligatures w14:val="none"/>
+        </w:rPr>
+        <w:t>optimizing</w:t>
+      </w:r>
+      <w:proofErr w:type="spellEnd"/>
+      <w:r>
+        <w:rPr>
+          <w:rFonts w:ascii="Lucida Sans Unicode" w:eastAsia="Times New Roman" w:hAnsi="Lucida Sans Unicode" w:cs="Lucida Sans Unicode"/>
+          <w:noProof w:val="0"/>
+          <w:kern w:val="0"/>
+          <w:sz w:val="22"/>
+          <w:szCs w:val="22"/>
+          <w:lang w:val="de-DE" w:eastAsia="de-DE"/>
+          <w14:ligatures w14:val="none"/>
+        </w:rPr>
+        <w:t xml:space="preserve"> </w:t>
+      </w:r>
+      <w:proofErr w:type="spellStart"/>
+      <w:r>
+        <w:rPr>
+          <w:rFonts w:ascii="Lucida Sans Unicode" w:eastAsia="Times New Roman" w:hAnsi="Lucida Sans Unicode" w:cs="Lucida Sans Unicode"/>
+          <w:noProof w:val="0"/>
+          <w:kern w:val="0"/>
+          <w:sz w:val="22"/>
+          <w:szCs w:val="22"/>
+          <w:lang w:val="de-DE" w:eastAsia="de-DE"/>
+          <w14:ligatures w14:val="none"/>
+        </w:rPr>
+        <w:t>programming</w:t>
+      </w:r>
+      <w:proofErr w:type="spellEnd"/>
+      <w:r>
+        <w:rPr>
+          <w:rFonts w:ascii="Lucida Sans Unicode" w:eastAsia="Times New Roman" w:hAnsi="Lucida Sans Unicode" w:cs="Lucida Sans Unicode"/>
+          <w:noProof w:val="0"/>
+          <w:kern w:val="0"/>
+          <w:sz w:val="22"/>
+          <w:szCs w:val="22"/>
+          <w:lang w:val="de-DE" w:eastAsia="de-DE"/>
+          <w14:ligatures w14:val="none"/>
+        </w:rPr>
+        <w:t xml:space="preserve"> code (e.g. R- </w:t>
+      </w:r>
+      <w:proofErr w:type="spellStart"/>
+      <w:r>
+        <w:rPr>
+          <w:rFonts w:ascii="Lucida Sans Unicode" w:eastAsia="Times New Roman" w:hAnsi="Lucida Sans Unicode" w:cs="Lucida Sans Unicode"/>
+          <w:noProof w:val="0"/>
+          <w:kern w:val="0"/>
+          <w:sz w:val="22"/>
+          <w:szCs w:val="22"/>
+          <w:lang w:val="de-DE" w:eastAsia="de-DE"/>
+          <w14:ligatures w14:val="none"/>
+        </w:rPr>
+        <w:t>or</w:t>
+      </w:r>
+      <w:proofErr w:type="spellEnd"/>
+      <w:r>
+        <w:rPr>
+          <w:rFonts w:ascii="Lucida Sans Unicode" w:eastAsia="Times New Roman" w:hAnsi="Lucida Sans Unicode" w:cs="Lucida Sans Unicode"/>
+          <w:noProof w:val="0"/>
+          <w:kern w:val="0"/>
+          <w:sz w:val="22"/>
+          <w:szCs w:val="22"/>
+          <w:lang w:val="de-DE" w:eastAsia="de-DE"/>
+          <w14:ligatures w14:val="none"/>
+        </w:rPr>
+        <w:t xml:space="preserve"> Python-Code)</w:t>
+      </w:r>
+    </w:p>
+    <w:p>
+      <w:pPr>
+        <w:numPr>
+          <w:ilvl w:val="0"/>
+          <w:numId w:val="3"/>
+        </w:numPr>
+        <w:spacing w:before="100" w:beforeAutospacing="1" w:after="100" w:afterAutospacing="1" w:line="240" w:lineRule="auto"/>
+        <w:rPr>
+          <w:rFonts w:ascii="Lucida Sans Unicode" w:eastAsia="Times New Roman" w:hAnsi="Lucida Sans Unicode" w:cs="Lucida Sans Unicode"/>
+          <w:noProof w:val="0"/>
+          <w:kern w:val="0"/>
+          <w:sz w:val="22"/>
+          <w:szCs w:val="22"/>
+          <w:lang w:val="de-DE" w:eastAsia="de-DE"/>
+          <w14:ligatures w14:val="none"/>
+        </w:rPr>
+      </w:pPr>
+      <w:r>
+        <w:rPr>
+          <w:rFonts w:ascii="Lucida Sans Unicode" w:eastAsia="Times New Roman" w:hAnsi="Lucida Sans Unicode" w:cs="Lucida Sans Unicode"/>
+          <w:noProof w:val="0"/>
+          <w:kern w:val="0"/>
+          <w:sz w:val="22"/>
+          <w:szCs w:val="22"/>
+          <w:lang w:val="de-DE" w:eastAsia="de-DE"/>
+          <w14:ligatures w14:val="none"/>
+        </w:rPr>
+        <w:t xml:space="preserve">[ ] </w:t>
+      </w:r>
+      <w:proofErr w:type="spellStart"/>
+      <w:r>
+        <w:rPr>
+          <w:rFonts w:ascii="Lucida Sans Unicode" w:eastAsia="Times New Roman" w:hAnsi="Lucida Sans Unicode" w:cs="Lucida Sans Unicode"/>
+          <w:noProof w:val="0"/>
+          <w:kern w:val="0"/>
+          <w:sz w:val="22"/>
+          <w:szCs w:val="22"/>
+          <w:lang w:val="de-DE" w:eastAsia="de-DE"/>
+          <w14:ligatures w14:val="none"/>
+        </w:rPr>
+        <w:t>researching</w:t>
+      </w:r>
+      <w:proofErr w:type="spellEnd"/>
+      <w:r>
+        <w:rPr>
+          <w:rFonts w:ascii="Lucida Sans Unicode" w:eastAsia="Times New Roman" w:hAnsi="Lucida Sans Unicode" w:cs="Lucida Sans Unicode"/>
+          <w:noProof w:val="0"/>
+          <w:kern w:val="0"/>
+          <w:sz w:val="22"/>
+          <w:szCs w:val="22"/>
+          <w:lang w:val="de-DE" w:eastAsia="de-DE"/>
+          <w14:ligatures w14:val="none"/>
+        </w:rPr>
+        <w:t xml:space="preserve"> </w:t>
+      </w:r>
+      <w:proofErr w:type="spellStart"/>
+      <w:r>
+        <w:rPr>
+          <w:rFonts w:ascii="Lucida Sans Unicode" w:eastAsia="Times New Roman" w:hAnsi="Lucida Sans Unicode" w:cs="Lucida Sans Unicode"/>
+          <w:noProof w:val="0"/>
+          <w:kern w:val="0"/>
+          <w:sz w:val="22"/>
+          <w:szCs w:val="22"/>
+          <w:lang w:val="de-DE" w:eastAsia="de-DE"/>
+          <w14:ligatures w14:val="none"/>
+        </w:rPr>
+        <w:t>terms</w:t>
+      </w:r>
+      <w:proofErr w:type="spellEnd"/>
+    </w:p>
+    <w:p>
+      <w:pPr>
+        <w:numPr>
+          <w:ilvl w:val="0"/>
+          <w:numId w:val="3"/>
+        </w:numPr>
+        <w:spacing w:before="100" w:beforeAutospacing="1" w:after="100" w:afterAutospacing="1" w:line="240" w:lineRule="auto"/>
+        <w:rPr>
+          <w:rFonts w:ascii="Lucida Sans Unicode" w:eastAsia="Times New Roman" w:hAnsi="Lucida Sans Unicode" w:cs="Lucida Sans Unicode"/>
+          <w:noProof w:val="0"/>
+          <w:kern w:val="0"/>
+          <w:sz w:val="22"/>
+          <w:szCs w:val="22"/>
+          <w:lang w:val="de-DE" w:eastAsia="de-DE"/>
+          <w14:ligatures w14:val="none"/>
+        </w:rPr>
+      </w:pPr>
+      <w:r>
+        <w:rPr>
+          <w:rFonts w:ascii="Lucida Sans Unicode" w:eastAsia="Times New Roman" w:hAnsi="Lucida Sans Unicode" w:cs="Lucida Sans Unicode"/>
+          <w:noProof w:val="0"/>
+          <w:kern w:val="0"/>
+          <w:sz w:val="22"/>
+          <w:szCs w:val="22"/>
+          <w:lang w:val="de-DE" w:eastAsia="de-DE"/>
+          <w14:ligatures w14:val="none"/>
+        </w:rPr>
+        <w:t xml:space="preserve">[ ] </w:t>
+      </w:r>
+      <w:proofErr w:type="spellStart"/>
+      <w:r>
+        <w:rPr>
+          <w:rFonts w:ascii="Lucida Sans Unicode" w:eastAsia="Times New Roman" w:hAnsi="Lucida Sans Unicode" w:cs="Lucida Sans Unicode"/>
+          <w:noProof w:val="0"/>
+          <w:kern w:val="0"/>
+          <w:sz w:val="22"/>
+          <w:szCs w:val="22"/>
+          <w:lang w:val="de-DE" w:eastAsia="de-DE"/>
+          <w14:ligatures w14:val="none"/>
+        </w:rPr>
+        <w:t>generating</w:t>
+      </w:r>
+      <w:proofErr w:type="spellEnd"/>
+      <w:r>
+        <w:rPr>
+          <w:rFonts w:ascii="Lucida Sans Unicode" w:eastAsia="Times New Roman" w:hAnsi="Lucida Sans Unicode" w:cs="Lucida Sans Unicode"/>
+          <w:noProof w:val="0"/>
+          <w:kern w:val="0"/>
+          <w:sz w:val="22"/>
+          <w:szCs w:val="22"/>
+          <w:lang w:val="de-DE" w:eastAsia="de-DE"/>
+          <w14:ligatures w14:val="none"/>
+        </w:rPr>
+        <w:t xml:space="preserve"> </w:t>
+      </w:r>
+      <w:proofErr w:type="spellStart"/>
+      <w:r>
+        <w:rPr>
+          <w:rFonts w:ascii="Lucida Sans Unicode" w:eastAsia="Times New Roman" w:hAnsi="Lucida Sans Unicode" w:cs="Lucida Sans Unicode"/>
+          <w:noProof w:val="0"/>
+          <w:kern w:val="0"/>
+          <w:sz w:val="22"/>
+          <w:szCs w:val="22"/>
+          <w:lang w:val="de-DE" w:eastAsia="de-DE"/>
+          <w14:ligatures w14:val="none"/>
+        </w:rPr>
+        <w:t>term</w:t>
+      </w:r>
+      <w:proofErr w:type="spellEnd"/>
+      <w:r>
+        <w:rPr>
+          <w:rFonts w:ascii="Lucida Sans Unicode" w:eastAsia="Times New Roman" w:hAnsi="Lucida Sans Unicode" w:cs="Lucida Sans Unicode"/>
+          <w:noProof w:val="0"/>
+          <w:kern w:val="0"/>
+          <w:sz w:val="22"/>
+          <w:szCs w:val="22"/>
+          <w:lang w:val="de-DE" w:eastAsia="de-DE"/>
+          <w14:ligatures w14:val="none"/>
+        </w:rPr>
+        <w:t xml:space="preserve"> </w:t>
+      </w:r>
+      <w:proofErr w:type="spellStart"/>
+      <w:r>
+        <w:rPr>
+          <w:rFonts w:ascii="Lucida Sans Unicode" w:eastAsia="Times New Roman" w:hAnsi="Lucida Sans Unicode" w:cs="Lucida Sans Unicode"/>
+          <w:noProof w:val="0"/>
+          <w:kern w:val="0"/>
+          <w:sz w:val="22"/>
+          <w:szCs w:val="22"/>
+          <w:lang w:val="de-DE" w:eastAsia="de-DE"/>
+          <w14:ligatures w14:val="none"/>
+        </w:rPr>
+        <w:t>definitions</w:t>
+      </w:r>
+      <w:proofErr w:type="spellEnd"/>
+    </w:p>
+    <w:p>
+      <w:pPr>
+        <w:numPr>
+          <w:ilvl w:val="0"/>
+          <w:numId w:val="3"/>
+        </w:numPr>
+        <w:spacing w:before="100" w:beforeAutospacing="1" w:after="100" w:afterAutospacing="1" w:line="240" w:lineRule="auto"/>
+        <w:rPr>
+          <w:rFonts w:ascii="Lucida Sans Unicode" w:eastAsia="Times New Roman" w:hAnsi="Lucida Sans Unicode" w:cs="Lucida Sans Unicode"/>
+          <w:noProof w:val="0"/>
+          <w:kern w:val="0"/>
+          <w:sz w:val="22"/>
+          <w:szCs w:val="22"/>
+          <w:lang w:val="de-DE" w:eastAsia="de-DE"/>
+          <w14:ligatures w14:val="none"/>
+        </w:rPr>
+      </w:pPr>
+      <w:r>
+        <w:rPr>
+          <w:rFonts w:ascii="Lucida Sans Unicode" w:eastAsia="Times New Roman" w:hAnsi="Lucida Sans Unicode" w:cs="Lucida Sans Unicode"/>
+          <w:noProof w:val="0"/>
+          <w:kern w:val="0"/>
+          <w:sz w:val="22"/>
+          <w:szCs w:val="22"/>
+          <w:lang w:val="de-DE" w:eastAsia="de-DE"/>
+          <w14:ligatures w14:val="none"/>
+        </w:rPr>
+        <w:t xml:space="preserve">[ ] </w:t>
+      </w:r>
+      <w:proofErr w:type="spellStart"/>
+      <w:r>
+        <w:rPr>
+          <w:rFonts w:ascii="Lucida Sans Unicode" w:eastAsia="Times New Roman" w:hAnsi="Lucida Sans Unicode" w:cs="Lucida Sans Unicode"/>
+          <w:noProof w:val="0"/>
+          <w:kern w:val="0"/>
+          <w:sz w:val="22"/>
+          <w:szCs w:val="22"/>
+          <w:lang w:val="de-DE" w:eastAsia="de-DE"/>
+          <w14:ligatures w14:val="none"/>
+        </w:rPr>
+        <w:t>other</w:t>
+      </w:r>
+      <w:proofErr w:type="spellEnd"/>
+      <w:r>
+        <w:rPr>
+          <w:rFonts w:ascii="Lucida Sans Unicode" w:eastAsia="Times New Roman" w:hAnsi="Lucida Sans Unicode" w:cs="Lucida Sans Unicode"/>
+          <w:noProof w:val="0"/>
+          <w:kern w:val="0"/>
+          <w:sz w:val="22"/>
+          <w:szCs w:val="22"/>
+          <w:lang w:val="de-DE" w:eastAsia="de-DE"/>
+          <w14:ligatures w14:val="none"/>
+        </w:rPr>
+        <w:t xml:space="preserve"> [</w:t>
+      </w:r>
+      <w:proofErr w:type="spellStart"/>
+      <w:r>
+        <w:rPr>
+          <w:rFonts w:ascii="Lucida Sans Unicode" w:eastAsia="Times New Roman" w:hAnsi="Lucida Sans Unicode" w:cs="Lucida Sans Unicode"/>
+          <w:noProof w:val="0"/>
+          <w:kern w:val="0"/>
+          <w:sz w:val="22"/>
+          <w:szCs w:val="22"/>
+          <w:lang w:val="de-DE" w:eastAsia="de-DE"/>
+          <w14:ligatures w14:val="none"/>
+        </w:rPr>
+        <w:t>please</w:t>
+      </w:r>
+      <w:proofErr w:type="spellEnd"/>
+      <w:r>
+        <w:rPr>
+          <w:rFonts w:ascii="Lucida Sans Unicode" w:eastAsia="Times New Roman" w:hAnsi="Lucida Sans Unicode" w:cs="Lucida Sans Unicode"/>
+          <w:noProof w:val="0"/>
+          <w:kern w:val="0"/>
+          <w:sz w:val="22"/>
+          <w:szCs w:val="22"/>
+          <w:lang w:val="de-DE" w:eastAsia="de-DE"/>
+          <w14:ligatures w14:val="none"/>
+        </w:rPr>
+        <w:t xml:space="preserve"> </w:t>
+      </w:r>
+      <w:proofErr w:type="spellStart"/>
+      <w:r>
+        <w:rPr>
+          <w:rFonts w:ascii="Lucida Sans Unicode" w:eastAsia="Times New Roman" w:hAnsi="Lucida Sans Unicode" w:cs="Lucida Sans Unicode"/>
+          <w:noProof w:val="0"/>
+          <w:kern w:val="0"/>
+          <w:sz w:val="22"/>
+          <w:szCs w:val="22"/>
+          <w:lang w:val="de-DE" w:eastAsia="de-DE"/>
+          <w14:ligatures w14:val="none"/>
+        </w:rPr>
+        <w:t>specify</w:t>
+      </w:r>
+      <w:proofErr w:type="spellEnd"/>
+      <w:r>
+        <w:rPr>
+          <w:rFonts w:ascii="Lucida Sans Unicode" w:eastAsia="Times New Roman" w:hAnsi="Lucida Sans Unicode" w:cs="Lucida Sans Unicode"/>
+          <w:noProof w:val="0"/>
+          <w:kern w:val="0"/>
+          <w:sz w:val="22"/>
+          <w:szCs w:val="22"/>
+          <w:lang w:val="de-DE" w:eastAsia="de-DE"/>
+          <w14:ligatures w14:val="none"/>
+        </w:rPr>
+        <w:t>]:</w:t>
+      </w:r>
+    </w:p>
+    <w:p>
+      <w:pPr>
+        <w:spacing w:before="100" w:beforeAutospacing="1" w:after="100" w:afterAutospacing="1" w:line="240" w:lineRule="auto"/>
+        <w:rPr>
+          <w:rFonts w:ascii="Lucida Sans Unicode" w:eastAsia="Times New Roman" w:hAnsi="Lucida Sans Unicode" w:cs="Lucida Sans Unicode"/>
+          <w:noProof w:val="0"/>
+          <w:kern w:val="0"/>
+          <w:sz w:val="22"/>
+          <w:szCs w:val="22"/>
+          <w:lang w:val="de-DE" w:eastAsia="de-DE"/>
+          <w14:ligatures w14:val="none"/>
+        </w:rPr>
+      </w:pPr>
+      <w:r>
+        <w:rPr>
+          <w:rFonts w:ascii="Lucida Sans Unicode" w:eastAsia="Times New Roman" w:hAnsi="Lucida Sans Unicode" w:cs="Lucida Sans Unicode"/>
+          <w:noProof w:val="0"/>
+          <w:kern w:val="0"/>
+          <w:sz w:val="22"/>
+          <w:szCs w:val="22"/>
+          <w:lang w:val="de-DE" w:eastAsia="de-DE"/>
+          <w14:ligatures w14:val="none"/>
+        </w:rPr>
+        <w:t xml:space="preserve">After </w:t>
+      </w:r>
+      <w:proofErr w:type="spellStart"/>
+      <w:r>
+        <w:rPr>
+          <w:rFonts w:ascii="Lucida Sans Unicode" w:eastAsia="Times New Roman" w:hAnsi="Lucida Sans Unicode" w:cs="Lucida Sans Unicode"/>
+          <w:noProof w:val="0"/>
+          <w:kern w:val="0"/>
+          <w:sz w:val="22"/>
+          <w:szCs w:val="22"/>
+          <w:lang w:val="de-DE" w:eastAsia="de-DE"/>
+          <w14:ligatures w14:val="none"/>
+        </w:rPr>
+        <w:t>using</w:t>
+      </w:r>
+      <w:proofErr w:type="spellEnd"/>
+      <w:r>
+        <w:rPr>
+          <w:rFonts w:ascii="Lucida Sans Unicode" w:eastAsia="Times New Roman" w:hAnsi="Lucida Sans Unicode" w:cs="Lucida Sans Unicode"/>
+          <w:noProof w:val="0"/>
+          <w:kern w:val="0"/>
+          <w:sz w:val="22"/>
+          <w:szCs w:val="22"/>
+          <w:lang w:val="de-DE" w:eastAsia="de-DE"/>
+          <w14:ligatures w14:val="none"/>
+        </w:rPr>
+        <w:t xml:space="preserve"> </w:t>
+      </w:r>
+      <w:proofErr w:type="spellStart"/>
+      <w:r>
+        <w:rPr>
+          <w:rFonts w:ascii="Lucida Sans Unicode" w:eastAsia="Times New Roman" w:hAnsi="Lucida Sans Unicode" w:cs="Lucida Sans Unicode"/>
+          <w:noProof w:val="0"/>
+          <w:kern w:val="0"/>
+          <w:sz w:val="22"/>
+          <w:szCs w:val="22"/>
+          <w:lang w:val="de-DE" w:eastAsia="de-DE"/>
+          <w14:ligatures w14:val="none"/>
+        </w:rPr>
+        <w:t>this</w:t>
+      </w:r>
+      <w:proofErr w:type="spellEnd"/>
+      <w:r>
+        <w:rPr>
+          <w:rFonts w:ascii="Lucida Sans Unicode" w:eastAsia="Times New Roman" w:hAnsi="Lucida Sans Unicode" w:cs="Lucida Sans Unicode"/>
+          <w:noProof w:val="0"/>
+          <w:kern w:val="0"/>
+          <w:sz w:val="22"/>
+          <w:szCs w:val="22"/>
+          <w:lang w:val="de-DE" w:eastAsia="de-DE"/>
+          <w14:ligatures w14:val="none"/>
+        </w:rPr>
+        <w:t xml:space="preserve"> </w:t>
+      </w:r>
+      <w:proofErr w:type="spellStart"/>
+      <w:r>
+        <w:rPr>
+          <w:rFonts w:ascii="Lucida Sans Unicode" w:eastAsia="Times New Roman" w:hAnsi="Lucida Sans Unicode" w:cs="Lucida Sans Unicode"/>
+          <w:noProof w:val="0"/>
+          <w:kern w:val="0"/>
+          <w:sz w:val="22"/>
+          <w:szCs w:val="22"/>
+          <w:lang w:val="de-DE" w:eastAsia="de-DE"/>
+          <w14:ligatures w14:val="none"/>
+        </w:rPr>
+        <w:t>tool</w:t>
+      </w:r>
+      <w:proofErr w:type="spellEnd"/>
+      <w:r>
+        <w:rPr>
+          <w:rFonts w:ascii="Lucida Sans Unicode" w:eastAsia="Times New Roman" w:hAnsi="Lucida Sans Unicode" w:cs="Lucida Sans Unicode"/>
+          <w:noProof w:val="0"/>
+          <w:kern w:val="0"/>
+          <w:sz w:val="22"/>
+          <w:szCs w:val="22"/>
+          <w:lang w:val="de-DE" w:eastAsia="de-DE"/>
+          <w14:ligatures w14:val="none"/>
+        </w:rPr>
+        <w:t xml:space="preserve"> </w:t>
+      </w:r>
+      <w:proofErr w:type="spellStart"/>
+      <w:r>
+        <w:rPr>
+          <w:rFonts w:ascii="Lucida Sans Unicode" w:eastAsia="Times New Roman" w:hAnsi="Lucida Sans Unicode" w:cs="Lucida Sans Unicode"/>
+          <w:noProof w:val="0"/>
+          <w:kern w:val="0"/>
+          <w:sz w:val="22"/>
+          <w:szCs w:val="22"/>
+          <w:lang w:val="de-DE" w:eastAsia="de-DE"/>
+          <w14:ligatures w14:val="none"/>
+        </w:rPr>
+        <w:t>or</w:t>
+      </w:r>
+      <w:proofErr w:type="spellEnd"/>
+      <w:r>
+        <w:rPr>
+          <w:rFonts w:ascii="Lucida Sans Unicode" w:eastAsia="Times New Roman" w:hAnsi="Lucida Sans Unicode" w:cs="Lucida Sans Unicode"/>
+          <w:noProof w:val="0"/>
+          <w:kern w:val="0"/>
+          <w:sz w:val="22"/>
+          <w:szCs w:val="22"/>
+          <w:lang w:val="de-DE" w:eastAsia="de-DE"/>
+          <w14:ligatures w14:val="none"/>
+        </w:rPr>
+        <w:t xml:space="preserve"> </w:t>
+      </w:r>
+      <w:proofErr w:type="spellStart"/>
+      <w:r>
+        <w:rPr>
+          <w:rFonts w:ascii="Lucida Sans Unicode" w:eastAsia="Times New Roman" w:hAnsi="Lucida Sans Unicode" w:cs="Lucida Sans Unicode"/>
+          <w:noProof w:val="0"/>
+          <w:kern w:val="0"/>
+          <w:sz w:val="22"/>
+          <w:szCs w:val="22"/>
+          <w:lang w:val="de-DE" w:eastAsia="de-DE"/>
+          <w14:ligatures w14:val="none"/>
+        </w:rPr>
+        <w:t>service</w:t>
+      </w:r>
+      <w:proofErr w:type="spellEnd"/>
+      <w:r>
+        <w:rPr>
+          <w:rFonts w:ascii="Lucida Sans Unicode" w:eastAsia="Times New Roman" w:hAnsi="Lucida Sans Unicode" w:cs="Lucida Sans Unicode"/>
+          <w:noProof w:val="0"/>
+          <w:kern w:val="0"/>
+          <w:sz w:val="22"/>
+          <w:szCs w:val="22"/>
+          <w:lang w:val="de-DE" w:eastAsia="de-DE"/>
+          <w14:ligatures w14:val="none"/>
+        </w:rPr>
+        <w:t xml:space="preserve">, I </w:t>
+      </w:r>
+      <w:proofErr w:type="spellStart"/>
+      <w:r>
+        <w:rPr>
+          <w:rFonts w:ascii="Lucida Sans Unicode" w:eastAsia="Times New Roman" w:hAnsi="Lucida Sans Unicode" w:cs="Lucida Sans Unicode"/>
+          <w:noProof w:val="0"/>
+          <w:kern w:val="0"/>
+          <w:sz w:val="22"/>
+          <w:szCs w:val="22"/>
+          <w:lang w:val="de-DE" w:eastAsia="de-DE"/>
+          <w14:ligatures w14:val="none"/>
+        </w:rPr>
+        <w:t>reviewed</w:t>
+      </w:r>
+      <w:proofErr w:type="spellEnd"/>
+      <w:r>
+        <w:rPr>
+          <w:rFonts w:ascii="Lucida Sans Unicode" w:eastAsia="Times New Roman" w:hAnsi="Lucida Sans Unicode" w:cs="Lucida Sans Unicode"/>
+          <w:noProof w:val="0"/>
+          <w:kern w:val="0"/>
+          <w:sz w:val="22"/>
+          <w:szCs w:val="22"/>
+          <w:lang w:val="de-DE" w:eastAsia="de-DE"/>
+          <w14:ligatures w14:val="none"/>
+        </w:rPr>
+        <w:t xml:space="preserve"> and </w:t>
+      </w:r>
+      <w:proofErr w:type="spellStart"/>
+      <w:r>
+        <w:rPr>
+          <w:rFonts w:ascii="Lucida Sans Unicode" w:eastAsia="Times New Roman" w:hAnsi="Lucida Sans Unicode" w:cs="Lucida Sans Unicode"/>
+          <w:noProof w:val="0"/>
+          <w:kern w:val="0"/>
+          <w:sz w:val="22"/>
+          <w:szCs w:val="22"/>
+          <w:lang w:val="de-DE" w:eastAsia="de-DE"/>
+          <w14:ligatures w14:val="none"/>
+        </w:rPr>
+        <w:t>edited</w:t>
+      </w:r>
+      <w:proofErr w:type="spellEnd"/>
+      <w:r>
+        <w:rPr>
+          <w:rFonts w:ascii="Lucida Sans Unicode" w:eastAsia="Times New Roman" w:hAnsi="Lucida Sans Unicode" w:cs="Lucida Sans Unicode"/>
+          <w:noProof w:val="0"/>
+          <w:kern w:val="0"/>
+          <w:sz w:val="22"/>
+          <w:szCs w:val="22"/>
+          <w:lang w:val="de-DE" w:eastAsia="de-DE"/>
+          <w14:ligatures w14:val="none"/>
+        </w:rPr>
+        <w:t xml:space="preserve"> </w:t>
+      </w:r>
+      <w:proofErr w:type="spellStart"/>
+      <w:r>
+        <w:rPr>
+          <w:rFonts w:ascii="Lucida Sans Unicode" w:eastAsia="Times New Roman" w:hAnsi="Lucida Sans Unicode" w:cs="Lucida Sans Unicode"/>
+          <w:noProof w:val="0"/>
+          <w:kern w:val="0"/>
+          <w:sz w:val="22"/>
+          <w:szCs w:val="22"/>
+          <w:lang w:val="de-DE" w:eastAsia="de-DE"/>
+          <w14:ligatures w14:val="none"/>
+        </w:rPr>
+        <w:t>the</w:t>
+      </w:r>
+      <w:proofErr w:type="spellEnd"/>
+      <w:r>
+        <w:rPr>
+          <w:rFonts w:ascii="Lucida Sans Unicode" w:eastAsia="Times New Roman" w:hAnsi="Lucida Sans Unicode" w:cs="Lucida Sans Unicode"/>
+          <w:noProof w:val="0"/>
+          <w:kern w:val="0"/>
+          <w:sz w:val="22"/>
+          <w:szCs w:val="22"/>
+          <w:lang w:val="de-DE" w:eastAsia="de-DE"/>
+          <w14:ligatures w14:val="none"/>
+        </w:rPr>
+        <w:t xml:space="preserve"> </w:t>
+      </w:r>
+      <w:proofErr w:type="spellStart"/>
+      <w:r>
+        <w:rPr>
+          <w:rFonts w:ascii="Lucida Sans Unicode" w:eastAsia="Times New Roman" w:hAnsi="Lucida Sans Unicode" w:cs="Lucida Sans Unicode"/>
+          <w:noProof w:val="0"/>
+          <w:kern w:val="0"/>
+          <w:sz w:val="22"/>
+          <w:szCs w:val="22"/>
+          <w:lang w:val="de-DE" w:eastAsia="de-DE"/>
+          <w14:ligatures w14:val="none"/>
+        </w:rPr>
+        <w:t>content</w:t>
+      </w:r>
+      <w:proofErr w:type="spellEnd"/>
+      <w:r>
+        <w:rPr>
+          <w:rFonts w:ascii="Lucida Sans Unicode" w:eastAsia="Times New Roman" w:hAnsi="Lucida Sans Unicode" w:cs="Lucida Sans Unicode"/>
+          <w:noProof w:val="0"/>
+          <w:kern w:val="0"/>
+          <w:sz w:val="22"/>
+          <w:szCs w:val="22"/>
+          <w:lang w:val="de-DE" w:eastAsia="de-DE"/>
+          <w14:ligatures w14:val="none"/>
+        </w:rPr>
+        <w:t xml:space="preserve"> </w:t>
+      </w:r>
+      <w:proofErr w:type="spellStart"/>
+      <w:r>
+        <w:rPr>
+          <w:rFonts w:ascii="Lucida Sans Unicode" w:eastAsia="Times New Roman" w:hAnsi="Lucida Sans Unicode" w:cs="Lucida Sans Unicode"/>
+          <w:noProof w:val="0"/>
+          <w:kern w:val="0"/>
+          <w:sz w:val="22"/>
+          <w:szCs w:val="22"/>
+          <w:lang w:val="de-DE" w:eastAsia="de-DE"/>
+          <w14:ligatures w14:val="none"/>
+        </w:rPr>
+        <w:t>as</w:t>
+      </w:r>
+      <w:proofErr w:type="spellEnd"/>
+      <w:r>
+        <w:rPr>
+          <w:rFonts w:ascii="Lucida Sans Unicode" w:eastAsia="Times New Roman" w:hAnsi="Lucida Sans Unicode" w:cs="Lucida Sans Unicode"/>
+          <w:noProof w:val="0"/>
+          <w:kern w:val="0"/>
+          <w:sz w:val="22"/>
+          <w:szCs w:val="22"/>
+          <w:lang w:val="de-DE" w:eastAsia="de-DE"/>
+          <w14:ligatures w14:val="none"/>
+        </w:rPr>
+        <w:t xml:space="preserve"> </w:t>
+      </w:r>
+      <w:proofErr w:type="spellStart"/>
+      <w:r>
+        <w:rPr>
+          <w:rFonts w:ascii="Lucida Sans Unicode" w:eastAsia="Times New Roman" w:hAnsi="Lucida Sans Unicode" w:cs="Lucida Sans Unicode"/>
+          <w:noProof w:val="0"/>
+          <w:kern w:val="0"/>
+          <w:sz w:val="22"/>
+          <w:szCs w:val="22"/>
+          <w:lang w:val="de-DE" w:eastAsia="de-DE"/>
+          <w14:ligatures w14:val="none"/>
+        </w:rPr>
+        <w:t>needed</w:t>
+      </w:r>
+      <w:proofErr w:type="spellEnd"/>
+      <w:r>
+        <w:rPr>
+          <w:rFonts w:ascii="Lucida Sans Unicode" w:eastAsia="Times New Roman" w:hAnsi="Lucida Sans Unicode" w:cs="Lucida Sans Unicode"/>
+          <w:noProof w:val="0"/>
+          <w:kern w:val="0"/>
+          <w:sz w:val="22"/>
+          <w:szCs w:val="22"/>
+          <w:lang w:val="de-DE" w:eastAsia="de-DE"/>
+          <w14:ligatures w14:val="none"/>
+        </w:rPr>
+        <w:t xml:space="preserve"> and I </w:t>
+      </w:r>
+      <w:proofErr w:type="spellStart"/>
+      <w:r>
+        <w:rPr>
+          <w:rFonts w:ascii="Lucida Sans Unicode" w:eastAsia="Times New Roman" w:hAnsi="Lucida Sans Unicode" w:cs="Lucida Sans Unicode"/>
+          <w:noProof w:val="0"/>
+          <w:kern w:val="0"/>
+          <w:sz w:val="22"/>
+          <w:szCs w:val="22"/>
+          <w:lang w:val="de-DE" w:eastAsia="de-DE"/>
+          <w14:ligatures w14:val="none"/>
+        </w:rPr>
+        <w:t>take</w:t>
+      </w:r>
+      <w:proofErr w:type="spellEnd"/>
+      <w:r>
+        <w:rPr>
+          <w:rFonts w:ascii="Lucida Sans Unicode" w:eastAsia="Times New Roman" w:hAnsi="Lucida Sans Unicode" w:cs="Lucida Sans Unicode"/>
+          <w:noProof w:val="0"/>
+          <w:kern w:val="0"/>
+          <w:sz w:val="22"/>
+          <w:szCs w:val="22"/>
+          <w:lang w:val="de-DE" w:eastAsia="de-DE"/>
+          <w14:ligatures w14:val="none"/>
+        </w:rPr>
+        <w:t xml:space="preserve"> </w:t>
+      </w:r>
+      <w:proofErr w:type="spellStart"/>
+      <w:r>
+        <w:rPr>
+          <w:rFonts w:ascii="Lucida Sans Unicode" w:eastAsia="Times New Roman" w:hAnsi="Lucida Sans Unicode" w:cs="Lucida Sans Unicode"/>
+          <w:noProof w:val="0"/>
+          <w:kern w:val="0"/>
+          <w:sz w:val="22"/>
+          <w:szCs w:val="22"/>
+          <w:lang w:val="de-DE" w:eastAsia="de-DE"/>
+          <w14:ligatures w14:val="none"/>
+        </w:rPr>
+        <w:t>full</w:t>
+      </w:r>
+      <w:proofErr w:type="spellEnd"/>
+      <w:r>
+        <w:rPr>
+          <w:rFonts w:ascii="Lucida Sans Unicode" w:eastAsia="Times New Roman" w:hAnsi="Lucida Sans Unicode" w:cs="Lucida Sans Unicode"/>
+          <w:noProof w:val="0"/>
+          <w:kern w:val="0"/>
+          <w:sz w:val="22"/>
+          <w:szCs w:val="22"/>
+          <w:lang w:val="de-DE" w:eastAsia="de-DE"/>
+          <w14:ligatures w14:val="none"/>
+        </w:rPr>
+        <w:t xml:space="preserve"> </w:t>
+      </w:r>
+      <w:proofErr w:type="spellStart"/>
+      <w:r>
+        <w:rPr>
+          <w:rFonts w:ascii="Lucida Sans Unicode" w:eastAsia="Times New Roman" w:hAnsi="Lucida Sans Unicode" w:cs="Lucida Sans Unicode"/>
+          <w:noProof w:val="0"/>
+          <w:kern w:val="0"/>
+          <w:sz w:val="22"/>
+          <w:szCs w:val="22"/>
+          <w:lang w:val="de-DE" w:eastAsia="de-DE"/>
+          <w14:ligatures w14:val="none"/>
+        </w:rPr>
+        <w:t>responsibility</w:t>
+      </w:r>
+      <w:proofErr w:type="spellEnd"/>
+      <w:r>
+        <w:rPr>
+          <w:rFonts w:ascii="Lucida Sans Unicode" w:eastAsia="Times New Roman" w:hAnsi="Lucida Sans Unicode" w:cs="Lucida Sans Unicode"/>
+          <w:noProof w:val="0"/>
+          <w:kern w:val="0"/>
+          <w:sz w:val="22"/>
+          <w:szCs w:val="22"/>
+          <w:lang w:val="de-DE" w:eastAsia="de-DE"/>
+          <w14:ligatures w14:val="none"/>
+        </w:rPr>
+        <w:t xml:space="preserve"> </w:t>
+      </w:r>
+      <w:proofErr w:type="spellStart"/>
+      <w:r>
+        <w:rPr>
+          <w:rFonts w:ascii="Lucida Sans Unicode" w:eastAsia="Times New Roman" w:hAnsi="Lucida Sans Unicode" w:cs="Lucida Sans Unicode"/>
+          <w:noProof w:val="0"/>
+          <w:kern w:val="0"/>
+          <w:sz w:val="22"/>
+          <w:szCs w:val="22"/>
+          <w:lang w:val="de-DE" w:eastAsia="de-DE"/>
+          <w14:ligatures w14:val="none"/>
+        </w:rPr>
+        <w:t>for</w:t>
+      </w:r>
+      <w:proofErr w:type="spellEnd"/>
+      <w:r>
+        <w:rPr>
+          <w:rFonts w:ascii="Lucida Sans Unicode" w:eastAsia="Times New Roman" w:hAnsi="Lucida Sans Unicode" w:cs="Lucida Sans Unicode"/>
+          <w:noProof w:val="0"/>
+          <w:kern w:val="0"/>
+          <w:sz w:val="22"/>
+          <w:szCs w:val="22"/>
+          <w:lang w:val="de-DE" w:eastAsia="de-DE"/>
+          <w14:ligatures w14:val="none"/>
+        </w:rPr>
+        <w:t xml:space="preserve"> </w:t>
+      </w:r>
+      <w:proofErr w:type="spellStart"/>
+      <w:r>
+        <w:rPr>
+          <w:rFonts w:ascii="Lucida Sans Unicode" w:eastAsia="Times New Roman" w:hAnsi="Lucida Sans Unicode" w:cs="Lucida Sans Unicode"/>
+          <w:noProof w:val="0"/>
+          <w:kern w:val="0"/>
+          <w:sz w:val="22"/>
+          <w:szCs w:val="22"/>
+          <w:lang w:val="de-DE" w:eastAsia="de-DE"/>
+          <w14:ligatures w14:val="none"/>
+        </w:rPr>
+        <w:t>the</w:t>
+      </w:r>
+      <w:proofErr w:type="spellEnd"/>
+      <w:r>
+        <w:rPr>
+          <w:rFonts w:ascii="Lucida Sans Unicode" w:eastAsia="Times New Roman" w:hAnsi="Lucida Sans Unicode" w:cs="Lucida Sans Unicode"/>
+          <w:noProof w:val="0"/>
+          <w:kern w:val="0"/>
+          <w:sz w:val="22"/>
+          <w:szCs w:val="22"/>
+          <w:lang w:val="de-DE" w:eastAsia="de-DE"/>
+          <w14:ligatures w14:val="none"/>
+        </w:rPr>
+        <w:t xml:space="preserve"> </w:t>
+      </w:r>
+      <w:proofErr w:type="spellStart"/>
+      <w:r>
+        <w:rPr>
+          <w:rFonts w:ascii="Lucida Sans Unicode" w:eastAsia="Times New Roman" w:hAnsi="Lucida Sans Unicode" w:cs="Lucida Sans Unicode"/>
+          <w:noProof w:val="0"/>
+          <w:kern w:val="0"/>
+          <w:sz w:val="22"/>
+          <w:szCs w:val="22"/>
+          <w:lang w:val="de-DE" w:eastAsia="de-DE"/>
+          <w14:ligatures w14:val="none"/>
+        </w:rPr>
+        <w:t>content</w:t>
+      </w:r>
+      <w:proofErr w:type="spellEnd"/>
+      <w:r>
+        <w:rPr>
+          <w:rFonts w:ascii="Lucida Sans Unicode" w:eastAsia="Times New Roman" w:hAnsi="Lucida Sans Unicode" w:cs="Lucida Sans Unicode"/>
+          <w:noProof w:val="0"/>
+          <w:kern w:val="0"/>
+          <w:sz w:val="22"/>
+          <w:szCs w:val="22"/>
+          <w:lang w:val="de-DE" w:eastAsia="de-DE"/>
+          <w14:ligatures w14:val="none"/>
+        </w:rPr>
+        <w:t xml:space="preserve"> </w:t>
+      </w:r>
+      <w:proofErr w:type="spellStart"/>
+      <w:r>
+        <w:rPr>
+          <w:rFonts w:ascii="Lucida Sans Unicode" w:eastAsia="Times New Roman" w:hAnsi="Lucida Sans Unicode" w:cs="Lucida Sans Unicode"/>
+          <w:noProof w:val="0"/>
+          <w:kern w:val="0"/>
+          <w:sz w:val="22"/>
+          <w:szCs w:val="22"/>
+          <w:lang w:val="de-DE" w:eastAsia="de-DE"/>
+          <w14:ligatures w14:val="none"/>
+        </w:rPr>
+        <w:t>of</w:t>
+      </w:r>
+      <w:proofErr w:type="spellEnd"/>
+      <w:r>
+        <w:rPr>
+          <w:rFonts w:ascii="Lucida Sans Unicode" w:eastAsia="Times New Roman" w:hAnsi="Lucida Sans Unicode" w:cs="Lucida Sans Unicode"/>
+          <w:noProof w:val="0"/>
+          <w:kern w:val="0"/>
+          <w:sz w:val="22"/>
+          <w:szCs w:val="22"/>
+          <w:lang w:val="de-DE" w:eastAsia="de-DE"/>
+          <w14:ligatures w14:val="none"/>
+        </w:rPr>
+        <w:t xml:space="preserve"> </w:t>
+      </w:r>
+      <w:proofErr w:type="spellStart"/>
+      <w:r>
+        <w:rPr>
+          <w:rFonts w:ascii="Lucida Sans Unicode" w:eastAsia="Times New Roman" w:hAnsi="Lucida Sans Unicode" w:cs="Lucida Sans Unicode"/>
+          <w:noProof w:val="0"/>
+          <w:kern w:val="0"/>
+          <w:sz w:val="22"/>
+          <w:szCs w:val="22"/>
+          <w:lang w:val="de-DE" w:eastAsia="de-DE"/>
+          <w14:ligatures w14:val="none"/>
+        </w:rPr>
+        <w:t>this</w:t>
+      </w:r>
+      <w:proofErr w:type="spellEnd"/>
+      <w:r>
+        <w:rPr>
+          <w:rFonts w:ascii="Lucida Sans Unicode" w:eastAsia="Times New Roman" w:hAnsi="Lucida Sans Unicode" w:cs="Lucida Sans Unicode"/>
+          <w:noProof w:val="0"/>
+          <w:kern w:val="0"/>
+          <w:sz w:val="22"/>
+          <w:szCs w:val="22"/>
+          <w:lang w:val="de-DE" w:eastAsia="de-DE"/>
+          <w14:ligatures w14:val="none"/>
+        </w:rPr>
+        <w:t xml:space="preserve"> </w:t>
+      </w:r>
+      <w:proofErr w:type="spellStart"/>
+      <w:r>
+        <w:rPr>
+          <w:rFonts w:ascii="Lucida Sans Unicode" w:eastAsia="Times New Roman" w:hAnsi="Lucida Sans Unicode" w:cs="Lucida Sans Unicode"/>
+          <w:noProof w:val="0"/>
+          <w:kern w:val="0"/>
+          <w:sz w:val="22"/>
+          <w:szCs w:val="22"/>
+          <w:lang w:val="de-DE" w:eastAsia="de-DE"/>
+          <w14:ligatures w14:val="none"/>
+        </w:rPr>
+        <w:t>paper</w:t>
+      </w:r>
+      <w:proofErr w:type="spellEnd"/>
+      <w:r>
+        <w:rPr>
+          <w:rFonts w:ascii="Lucida Sans Unicode" w:eastAsia="Times New Roman" w:hAnsi="Lucida Sans Unicode" w:cs="Lucida Sans Unicode"/>
+          <w:noProof w:val="0"/>
+          <w:kern w:val="0"/>
+          <w:sz w:val="22"/>
+          <w:szCs w:val="22"/>
+          <w:lang w:val="de-DE" w:eastAsia="de-DE"/>
+          <w14:ligatures w14:val="none"/>
+        </w:rPr>
+        <w:t xml:space="preserve">. I </w:t>
+      </w:r>
+      <w:proofErr w:type="spellStart"/>
+      <w:r>
+        <w:rPr>
+          <w:rFonts w:ascii="Lucida Sans Unicode" w:eastAsia="Times New Roman" w:hAnsi="Lucida Sans Unicode" w:cs="Lucida Sans Unicode"/>
+          <w:noProof w:val="0"/>
+          <w:kern w:val="0"/>
+          <w:sz w:val="22"/>
+          <w:szCs w:val="22"/>
+          <w:lang w:val="de-DE" w:eastAsia="de-DE"/>
+          <w14:ligatures w14:val="none"/>
+        </w:rPr>
+        <w:t>certify</w:t>
+      </w:r>
+      <w:proofErr w:type="spellEnd"/>
+      <w:r>
+        <w:rPr>
+          <w:rFonts w:ascii="Lucida Sans Unicode" w:eastAsia="Times New Roman" w:hAnsi="Lucida Sans Unicode" w:cs="Lucida Sans Unicode"/>
+          <w:noProof w:val="0"/>
+          <w:kern w:val="0"/>
+          <w:sz w:val="22"/>
+          <w:szCs w:val="22"/>
+          <w:lang w:val="de-DE" w:eastAsia="de-DE"/>
+          <w14:ligatures w14:val="none"/>
+        </w:rPr>
+        <w:t xml:space="preserve"> </w:t>
+      </w:r>
+      <w:proofErr w:type="spellStart"/>
+      <w:r>
+        <w:rPr>
+          <w:rFonts w:ascii="Lucida Sans Unicode" w:eastAsia="Times New Roman" w:hAnsi="Lucida Sans Unicode" w:cs="Lucida Sans Unicode"/>
+          <w:noProof w:val="0"/>
+          <w:kern w:val="0"/>
+          <w:sz w:val="22"/>
+          <w:szCs w:val="22"/>
+          <w:lang w:val="de-DE" w:eastAsia="de-DE"/>
+          <w14:ligatures w14:val="none"/>
+        </w:rPr>
+        <w:t>that</w:t>
+      </w:r>
+      <w:proofErr w:type="spellEnd"/>
+      <w:r>
+        <w:rPr>
+          <w:rFonts w:ascii="Lucida Sans Unicode" w:eastAsia="Times New Roman" w:hAnsi="Lucida Sans Unicode" w:cs="Lucida Sans Unicode"/>
+          <w:noProof w:val="0"/>
+          <w:kern w:val="0"/>
+          <w:sz w:val="22"/>
+          <w:szCs w:val="22"/>
+          <w:lang w:val="de-DE" w:eastAsia="de-DE"/>
+          <w14:ligatures w14:val="none"/>
+        </w:rPr>
+        <w:t xml:space="preserve"> </w:t>
+      </w:r>
+      <w:proofErr w:type="spellStart"/>
+      <w:r>
+        <w:rPr>
+          <w:rFonts w:ascii="Lucida Sans Unicode" w:eastAsia="Times New Roman" w:hAnsi="Lucida Sans Unicode" w:cs="Lucida Sans Unicode"/>
+          <w:noProof w:val="0"/>
+          <w:kern w:val="0"/>
+          <w:sz w:val="22"/>
+          <w:szCs w:val="22"/>
+          <w:lang w:val="de-DE" w:eastAsia="de-DE"/>
+          <w14:ligatures w14:val="none"/>
+        </w:rPr>
+        <w:t>this</w:t>
+      </w:r>
+      <w:proofErr w:type="spellEnd"/>
+      <w:r>
+        <w:rPr>
+          <w:rFonts w:ascii="Lucida Sans Unicode" w:eastAsia="Times New Roman" w:hAnsi="Lucida Sans Unicode" w:cs="Lucida Sans Unicode"/>
+          <w:noProof w:val="0"/>
+          <w:kern w:val="0"/>
+          <w:sz w:val="22"/>
+          <w:szCs w:val="22"/>
+          <w:lang w:val="de-DE" w:eastAsia="de-DE"/>
+          <w14:ligatures w14:val="none"/>
+        </w:rPr>
+        <w:t xml:space="preserve"> </w:t>
+      </w:r>
+      <w:proofErr w:type="spellStart"/>
+      <w:r>
+        <w:rPr>
+          <w:rFonts w:ascii="Lucida Sans Unicode" w:eastAsia="Times New Roman" w:hAnsi="Lucida Sans Unicode" w:cs="Lucida Sans Unicode"/>
+          <w:noProof w:val="0"/>
+          <w:kern w:val="0"/>
+          <w:sz w:val="22"/>
+          <w:szCs w:val="22"/>
+          <w:lang w:val="de-DE" w:eastAsia="de-DE"/>
+          <w14:ligatures w14:val="none"/>
+        </w:rPr>
+        <w:t>paper</w:t>
+      </w:r>
+      <w:proofErr w:type="spellEnd"/>
+      <w:r>
+        <w:rPr>
+          <w:rFonts w:ascii="Lucida Sans Unicode" w:eastAsia="Times New Roman" w:hAnsi="Lucida Sans Unicode" w:cs="Lucida Sans Unicode"/>
+          <w:noProof w:val="0"/>
+          <w:kern w:val="0"/>
+          <w:sz w:val="22"/>
+          <w:szCs w:val="22"/>
+          <w:lang w:val="de-DE" w:eastAsia="de-DE"/>
+          <w14:ligatures w14:val="none"/>
+        </w:rPr>
+        <w:t xml:space="preserve"> </w:t>
+      </w:r>
+      <w:proofErr w:type="spellStart"/>
+      <w:r>
+        <w:rPr>
+          <w:rFonts w:ascii="Lucida Sans Unicode" w:eastAsia="Times New Roman" w:hAnsi="Lucida Sans Unicode" w:cs="Lucida Sans Unicode"/>
+          <w:noProof w:val="0"/>
+          <w:kern w:val="0"/>
+          <w:sz w:val="22"/>
+          <w:szCs w:val="22"/>
+          <w:lang w:val="de-DE" w:eastAsia="de-DE"/>
+          <w14:ligatures w14:val="none"/>
+        </w:rPr>
+        <w:t>does</w:t>
+      </w:r>
+      <w:proofErr w:type="spellEnd"/>
+      <w:r>
+        <w:rPr>
+          <w:rFonts w:ascii="Lucida Sans Unicode" w:eastAsia="Times New Roman" w:hAnsi="Lucida Sans Unicode" w:cs="Lucida Sans Unicode"/>
+          <w:noProof w:val="0"/>
+          <w:kern w:val="0"/>
+          <w:sz w:val="22"/>
+          <w:szCs w:val="22"/>
+          <w:lang w:val="de-DE" w:eastAsia="de-DE"/>
+          <w14:ligatures w14:val="none"/>
+        </w:rPr>
+        <w:t xml:space="preserve"> not </w:t>
+      </w:r>
+      <w:proofErr w:type="spellStart"/>
+      <w:r>
+        <w:rPr>
+          <w:rFonts w:ascii="Lucida Sans Unicode" w:eastAsia="Times New Roman" w:hAnsi="Lucida Sans Unicode" w:cs="Lucida Sans Unicode"/>
+          <w:noProof w:val="0"/>
+          <w:kern w:val="0"/>
+          <w:sz w:val="22"/>
+          <w:szCs w:val="22"/>
+          <w:lang w:val="de-DE" w:eastAsia="de-DE"/>
+          <w14:ligatures w14:val="none"/>
+        </w:rPr>
+        <w:t>contain</w:t>
+      </w:r>
+      <w:proofErr w:type="spellEnd"/>
+      <w:r>
+        <w:rPr>
+          <w:rFonts w:ascii="Lucida Sans Unicode" w:eastAsia="Times New Roman" w:hAnsi="Lucida Sans Unicode" w:cs="Lucida Sans Unicode"/>
+          <w:noProof w:val="0"/>
+          <w:kern w:val="0"/>
+          <w:sz w:val="22"/>
+          <w:szCs w:val="22"/>
+          <w:lang w:val="de-DE" w:eastAsia="de-DE"/>
+          <w14:ligatures w14:val="none"/>
+        </w:rPr>
+        <w:t xml:space="preserve"> </w:t>
+      </w:r>
+      <w:proofErr w:type="spellStart"/>
+      <w:r>
+        <w:rPr>
+          <w:rFonts w:ascii="Lucida Sans Unicode" w:eastAsia="Times New Roman" w:hAnsi="Lucida Sans Unicode" w:cs="Lucida Sans Unicode"/>
+          <w:noProof w:val="0"/>
+          <w:kern w:val="0"/>
+          <w:sz w:val="22"/>
+          <w:szCs w:val="22"/>
+          <w:lang w:val="de-DE" w:eastAsia="de-DE"/>
+          <w14:ligatures w14:val="none"/>
+        </w:rPr>
+        <w:t>lengthy</w:t>
+      </w:r>
+      <w:proofErr w:type="spellEnd"/>
+      <w:r>
+        <w:rPr>
+          <w:rFonts w:ascii="Lucida Sans Unicode" w:eastAsia="Times New Roman" w:hAnsi="Lucida Sans Unicode" w:cs="Lucida Sans Unicode"/>
+          <w:noProof w:val="0"/>
+          <w:kern w:val="0"/>
+          <w:sz w:val="22"/>
+          <w:szCs w:val="22"/>
+          <w:lang w:val="de-DE" w:eastAsia="de-DE"/>
+          <w14:ligatures w14:val="none"/>
+        </w:rPr>
+        <w:t xml:space="preserve"> </w:t>
+      </w:r>
+      <w:proofErr w:type="spellStart"/>
+      <w:r>
+        <w:rPr>
+          <w:rFonts w:ascii="Lucida Sans Unicode" w:eastAsia="Times New Roman" w:hAnsi="Lucida Sans Unicode" w:cs="Lucida Sans Unicode"/>
+          <w:noProof w:val="0"/>
+          <w:kern w:val="0"/>
+          <w:sz w:val="22"/>
+          <w:szCs w:val="22"/>
+          <w:lang w:val="de-DE" w:eastAsia="de-DE"/>
+          <w14:ligatures w14:val="none"/>
+        </w:rPr>
+        <w:t>passages</w:t>
+      </w:r>
+      <w:proofErr w:type="spellEnd"/>
+      <w:r>
+        <w:rPr>
+          <w:rFonts w:ascii="Lucida Sans Unicode" w:eastAsia="Times New Roman" w:hAnsi="Lucida Sans Unicode" w:cs="Lucida Sans Unicode"/>
+          <w:noProof w:val="0"/>
+          <w:kern w:val="0"/>
+          <w:sz w:val="22"/>
+          <w:szCs w:val="22"/>
+          <w:lang w:val="de-DE" w:eastAsia="de-DE"/>
+          <w14:ligatures w14:val="none"/>
+        </w:rPr>
+        <w:t xml:space="preserve"> (e.g. </w:t>
+      </w:r>
+      <w:proofErr w:type="spellStart"/>
+      <w:r>
+        <w:rPr>
+          <w:rFonts w:ascii="Lucida Sans Unicode" w:eastAsia="Times New Roman" w:hAnsi="Lucida Sans Unicode" w:cs="Lucida Sans Unicode"/>
+          <w:noProof w:val="0"/>
+          <w:kern w:val="0"/>
+          <w:sz w:val="22"/>
+          <w:szCs w:val="22"/>
+          <w:lang w:val="de-DE" w:eastAsia="de-DE"/>
+          <w14:ligatures w14:val="none"/>
+        </w:rPr>
+        <w:t>summary</w:t>
+      </w:r>
+      <w:proofErr w:type="spellEnd"/>
+      <w:r>
+        <w:rPr>
+          <w:rFonts w:ascii="Lucida Sans Unicode" w:eastAsia="Times New Roman" w:hAnsi="Lucida Sans Unicode" w:cs="Lucida Sans Unicode"/>
+          <w:noProof w:val="0"/>
+          <w:kern w:val="0"/>
+          <w:sz w:val="22"/>
+          <w:szCs w:val="22"/>
+          <w:lang w:val="de-DE" w:eastAsia="de-DE"/>
+          <w14:ligatures w14:val="none"/>
+        </w:rPr>
+        <w:t>/</w:t>
+      </w:r>
+      <w:proofErr w:type="spellStart"/>
+      <w:r>
+        <w:rPr>
+          <w:rFonts w:ascii="Lucida Sans Unicode" w:eastAsia="Times New Roman" w:hAnsi="Lucida Sans Unicode" w:cs="Lucida Sans Unicode"/>
+          <w:noProof w:val="0"/>
+          <w:kern w:val="0"/>
+          <w:sz w:val="22"/>
+          <w:szCs w:val="22"/>
+          <w:lang w:val="de-DE" w:eastAsia="de-DE"/>
+          <w14:ligatures w14:val="none"/>
+        </w:rPr>
+        <w:t>abstract</w:t>
+      </w:r>
+      <w:proofErr w:type="spellEnd"/>
+      <w:r>
+        <w:rPr>
+          <w:rFonts w:ascii="Lucida Sans Unicode" w:eastAsia="Times New Roman" w:hAnsi="Lucida Sans Unicode" w:cs="Lucida Sans Unicode"/>
+          <w:noProof w:val="0"/>
+          <w:kern w:val="0"/>
+          <w:sz w:val="22"/>
+          <w:szCs w:val="22"/>
+          <w:lang w:val="de-DE" w:eastAsia="de-DE"/>
+          <w14:ligatures w14:val="none"/>
+        </w:rPr>
+        <w:t xml:space="preserve">, </w:t>
+      </w:r>
+      <w:proofErr w:type="spellStart"/>
+      <w:r>
+        <w:rPr>
+          <w:rFonts w:ascii="Lucida Sans Unicode" w:eastAsia="Times New Roman" w:hAnsi="Lucida Sans Unicode" w:cs="Lucida Sans Unicode"/>
+          <w:noProof w:val="0"/>
+          <w:kern w:val="0"/>
+          <w:sz w:val="22"/>
+          <w:szCs w:val="22"/>
+          <w:lang w:val="de-DE" w:eastAsia="de-DE"/>
+          <w14:ligatures w14:val="none"/>
+        </w:rPr>
+        <w:t>or</w:t>
+      </w:r>
+      <w:proofErr w:type="spellEnd"/>
+      <w:r>
+        <w:rPr>
+          <w:rFonts w:ascii="Lucida Sans Unicode" w:eastAsia="Times New Roman" w:hAnsi="Lucida Sans Unicode" w:cs="Lucida Sans Unicode"/>
+          <w:noProof w:val="0"/>
+          <w:kern w:val="0"/>
+          <w:sz w:val="22"/>
+          <w:szCs w:val="22"/>
+          <w:lang w:val="de-DE" w:eastAsia="de-DE"/>
+          <w14:ligatures w14:val="none"/>
+        </w:rPr>
+        <w:t xml:space="preserve"> </w:t>
+      </w:r>
+      <w:proofErr w:type="spellStart"/>
+      <w:r>
+        <w:rPr>
+          <w:rFonts w:ascii="Lucida Sans Unicode" w:eastAsia="Times New Roman" w:hAnsi="Lucida Sans Unicode" w:cs="Lucida Sans Unicode"/>
+          <w:noProof w:val="0"/>
+          <w:kern w:val="0"/>
+          <w:sz w:val="22"/>
+          <w:szCs w:val="22"/>
+          <w:lang w:val="de-DE" w:eastAsia="de-DE"/>
+          <w14:ligatures w14:val="none"/>
+        </w:rPr>
+        <w:t>full</w:t>
+      </w:r>
+      <w:proofErr w:type="spellEnd"/>
+      <w:r>
+        <w:rPr>
+          <w:rFonts w:ascii="Lucida Sans Unicode" w:eastAsia="Times New Roman" w:hAnsi="Lucida Sans Unicode" w:cs="Lucida Sans Unicode"/>
+          <w:noProof w:val="0"/>
+          <w:kern w:val="0"/>
+          <w:sz w:val="22"/>
+          <w:szCs w:val="22"/>
+          <w:lang w:val="de-DE" w:eastAsia="de-DE"/>
+          <w14:ligatures w14:val="none"/>
+        </w:rPr>
+        <w:t xml:space="preserve"> </w:t>
+      </w:r>
+      <w:proofErr w:type="spellStart"/>
+      <w:r>
+        <w:rPr>
+          <w:rFonts w:ascii="Lucida Sans Unicode" w:eastAsia="Times New Roman" w:hAnsi="Lucida Sans Unicode" w:cs="Lucida Sans Unicode"/>
+          <w:noProof w:val="0"/>
+          <w:kern w:val="0"/>
+          <w:sz w:val="22"/>
+          <w:szCs w:val="22"/>
+          <w:lang w:val="de-DE" w:eastAsia="de-DE"/>
+          <w14:ligatures w14:val="none"/>
+        </w:rPr>
+        <w:t>paragraphs</w:t>
+      </w:r>
+      <w:proofErr w:type="spellEnd"/>
+      <w:r>
+        <w:rPr>
+          <w:rFonts w:ascii="Lucida Sans Unicode" w:eastAsia="Times New Roman" w:hAnsi="Lucida Sans Unicode" w:cs="Lucida Sans Unicode"/>
+          <w:noProof w:val="0"/>
+          <w:kern w:val="0"/>
+          <w:sz w:val="22"/>
+          <w:szCs w:val="22"/>
+          <w:lang w:val="de-DE" w:eastAsia="de-DE"/>
+          <w14:ligatures w14:val="none"/>
+        </w:rPr>
+        <w:t xml:space="preserve">) </w:t>
+      </w:r>
+      <w:proofErr w:type="spellStart"/>
+      <w:r>
+        <w:rPr>
+          <w:rFonts w:ascii="Lucida Sans Unicode" w:eastAsia="Times New Roman" w:hAnsi="Lucida Sans Unicode" w:cs="Lucida Sans Unicode"/>
+          <w:noProof w:val="0"/>
+          <w:kern w:val="0"/>
+          <w:sz w:val="22"/>
+          <w:szCs w:val="22"/>
+          <w:lang w:val="de-DE" w:eastAsia="de-DE"/>
+          <w14:ligatures w14:val="none"/>
+        </w:rPr>
+        <w:t>of</w:t>
+      </w:r>
+      <w:proofErr w:type="spellEnd"/>
+      <w:r>
+        <w:rPr>
+          <w:rFonts w:ascii="Lucida Sans Unicode" w:eastAsia="Times New Roman" w:hAnsi="Lucida Sans Unicode" w:cs="Lucida Sans Unicode"/>
+          <w:noProof w:val="0"/>
+          <w:kern w:val="0"/>
+          <w:sz w:val="22"/>
+          <w:szCs w:val="22"/>
+          <w:lang w:val="de-DE" w:eastAsia="de-DE"/>
+          <w14:ligatures w14:val="none"/>
+        </w:rPr>
+        <w:t xml:space="preserve"> </w:t>
+      </w:r>
+      <w:proofErr w:type="spellStart"/>
+      <w:r>
+        <w:rPr>
+          <w:rFonts w:ascii="Lucida Sans Unicode" w:eastAsia="Times New Roman" w:hAnsi="Lucida Sans Unicode" w:cs="Lucida Sans Unicode"/>
+          <w:noProof w:val="0"/>
+          <w:kern w:val="0"/>
+          <w:sz w:val="22"/>
+          <w:szCs w:val="22"/>
+          <w:lang w:val="de-DE" w:eastAsia="de-DE"/>
+          <w14:ligatures w14:val="none"/>
+        </w:rPr>
+        <w:t>purely</w:t>
+      </w:r>
+      <w:proofErr w:type="spellEnd"/>
+      <w:r>
+        <w:rPr>
+          <w:rFonts w:ascii="Lucida Sans Unicode" w:eastAsia="Times New Roman" w:hAnsi="Lucida Sans Unicode" w:cs="Lucida Sans Unicode"/>
+          <w:noProof w:val="0"/>
+          <w:kern w:val="0"/>
+          <w:sz w:val="22"/>
+          <w:szCs w:val="22"/>
+          <w:lang w:val="de-DE" w:eastAsia="de-DE"/>
+          <w14:ligatures w14:val="none"/>
+        </w:rPr>
+        <w:t xml:space="preserve"> AI-</w:t>
+      </w:r>
+      <w:proofErr w:type="spellStart"/>
+      <w:r>
+        <w:rPr>
+          <w:rFonts w:ascii="Lucida Sans Unicode" w:eastAsia="Times New Roman" w:hAnsi="Lucida Sans Unicode" w:cs="Lucida Sans Unicode"/>
+          <w:noProof w:val="0"/>
+          <w:kern w:val="0"/>
+          <w:sz w:val="22"/>
+          <w:szCs w:val="22"/>
+          <w:lang w:val="de-DE" w:eastAsia="de-DE"/>
+          <w14:ligatures w14:val="none"/>
+        </w:rPr>
+        <w:t>generated</w:t>
+      </w:r>
+      <w:proofErr w:type="spellEnd"/>
+      <w:r>
+        <w:rPr>
+          <w:rFonts w:ascii="Lucida Sans Unicode" w:eastAsia="Times New Roman" w:hAnsi="Lucida Sans Unicode" w:cs="Lucida Sans Unicode"/>
+          <w:noProof w:val="0"/>
+          <w:kern w:val="0"/>
+          <w:sz w:val="22"/>
+          <w:szCs w:val="22"/>
+          <w:lang w:val="de-DE" w:eastAsia="de-DE"/>
+          <w14:ligatures w14:val="none"/>
+        </w:rPr>
+        <w:t xml:space="preserve"> </w:t>
+      </w:r>
+      <w:proofErr w:type="spellStart"/>
+      <w:r>
+        <w:rPr>
+          <w:rFonts w:ascii="Lucida Sans Unicode" w:eastAsia="Times New Roman" w:hAnsi="Lucida Sans Unicode" w:cs="Lucida Sans Unicode"/>
+          <w:noProof w:val="0"/>
+          <w:kern w:val="0"/>
+          <w:sz w:val="22"/>
+          <w:szCs w:val="22"/>
+          <w:lang w:val="de-DE" w:eastAsia="de-DE"/>
+          <w14:ligatures w14:val="none"/>
+        </w:rPr>
+        <w:t>text</w:t>
+      </w:r>
+      <w:proofErr w:type="spellEnd"/>
+      <w:r>
+        <w:rPr>
+          <w:rFonts w:ascii="Lucida Sans Unicode" w:eastAsia="Times New Roman" w:hAnsi="Lucida Sans Unicode" w:cs="Lucida Sans Unicode"/>
+          <w:noProof w:val="0"/>
+          <w:kern w:val="0"/>
+          <w:sz w:val="22"/>
+          <w:szCs w:val="22"/>
+          <w:lang w:val="de-DE" w:eastAsia="de-DE"/>
+          <w14:ligatures w14:val="none"/>
+        </w:rPr>
+        <w:t>.</w:t>
+      </w:r>
+    </w:p>
+    <w:p>
+      <w:pPr>
+        <w:spacing w:before="100" w:beforeAutospacing="1" w:after="100" w:afterAutospacing="1" w:line="240" w:lineRule="auto"/>
+        <w:rPr>
+          <w:rFonts w:ascii="Lucida Sans Unicode" w:eastAsia="Times New Roman" w:hAnsi="Lucida Sans Unicode" w:cs="Lucida Sans Unicode"/>
+          <w:noProof w:val="0"/>
+          <w:kern w:val="0"/>
+          <w:sz w:val="22"/>
+          <w:szCs w:val="22"/>
+          <w:lang w:val="de-DE" w:eastAsia="de-DE"/>
+          <w14:ligatures w14:val="none"/>
+        </w:rPr>
+      </w:pPr>
+    </w:p>
+    <w:p>
+      <w:pPr>
+        <w:spacing w:line="360" w:lineRule="auto"/>
+        <w:rPr>
+          <w:rFonts w:ascii="Lucida Sans Unicode" w:hAnsi="Lucida Sans Unicode" w:cs="Lucida Sans Unicode"/>
+          <w:b/>
+          <w:bCs/>
+          <w:color w:val="000000" w:themeColor="text1"/>
+          <w:sz w:val="22"/>
+          <w:szCs w:val="22"/>
+        </w:rPr>
+      </w:pPr>
+      <w:r>
+        <w:rPr>
+          <w:rFonts w:ascii="Lucida Sans Unicode" w:hAnsi="Lucida Sans Unicode" w:cs="Lucida Sans Unicode"/>
+          <w:b/>
+          <w:bCs/>
+          <w:color w:val="000000" w:themeColor="text1"/>
+          <w:sz w:val="22"/>
+          <w:szCs w:val="22"/>
+        </w:rPr>
+        <w:t xml:space="preserve">Appendix </w:t>
+      </w:r>
+      <w:r>
+        <w:rPr>
+          <w:rFonts w:ascii="Lucida Sans Unicode" w:hAnsi="Lucida Sans Unicode" w:cs="Lucida Sans Unicode"/>
+          <w:b/>
+          <w:bCs/>
+          <w:color w:val="000000" w:themeColor="text1"/>
+          <w:sz w:val="22"/>
+          <w:szCs w:val="22"/>
+        </w:rPr>
+        <w:t>C</w:t>
+      </w:r>
+      <w:r>
+        <w:rPr>
+          <w:rFonts w:ascii="Lucida Sans Unicode" w:hAnsi="Lucida Sans Unicode" w:cs="Lucida Sans Unicode"/>
+          <w:b/>
+          <w:bCs/>
+          <w:color w:val="000000" w:themeColor="text1"/>
+          <w:sz w:val="22"/>
+          <w:szCs w:val="22"/>
+        </w:rPr>
+        <w:t xml:space="preserve">: Declaration of Originality </w:t>
+      </w:r>
+    </w:p>
+    <w:p>
+      <w:pPr>
+        <w:spacing w:before="100" w:beforeAutospacing="1" w:after="100" w:afterAutospacing="1" w:line="240" w:lineRule="auto"/>
+        <w:rPr>
+          <w:rFonts w:ascii="Lucida Sans Unicode" w:eastAsia="Times New Roman" w:hAnsi="Lucida Sans Unicode" w:cs="Lucida Sans Unicode"/>
+          <w:noProof w:val="0"/>
+          <w:kern w:val="0"/>
+          <w:sz w:val="22"/>
+          <w:szCs w:val="22"/>
+          <w:lang w:val="de-DE" w:eastAsia="de-DE"/>
+          <w14:ligatures w14:val="none"/>
+        </w:rPr>
+      </w:pPr>
+      <w:r>
+        <w:rPr>
+          <w:rFonts w:ascii="Lucida Sans Unicode" w:eastAsia="Times New Roman" w:hAnsi="Lucida Sans Unicode" w:cs="Lucida Sans Unicode"/>
+          <w:noProof w:val="0"/>
+          <w:kern w:val="0"/>
+          <w:sz w:val="22"/>
+          <w:szCs w:val="22"/>
+          <w:lang w:val="de-DE" w:eastAsia="de-DE"/>
+          <w14:ligatures w14:val="none"/>
+        </w:rPr>
+        <w:t>Hiermit erkläre ich, dass ich die vorliegende Arbeit selbstständig und ohne fremde Hilfe verfasst habe. Ich habe keine anderen als die angegebenen Quellen und Hilfsmittel benutzt und alle wörtlich oder sinngemäß übernommenen Stellen als solche kenntlich gemacht.</w:t>
+      </w:r>
+    </w:p>
+    <w:p>
+      <w:pPr>
+        <w:spacing w:before="100" w:beforeAutospacing="1" w:after="100" w:afterAutospacing="1" w:line="240" w:lineRule="auto"/>
+        <w:rPr>
+          <w:rFonts w:ascii="Lucida Sans Unicode" w:eastAsia="Times New Roman" w:hAnsi="Lucida Sans Unicode" w:cs="Lucida Sans Unicode"/>
+          <w:noProof w:val="0"/>
+          <w:kern w:val="0"/>
+          <w:sz w:val="22"/>
+          <w:szCs w:val="22"/>
+          <w:lang w:val="de-DE" w:eastAsia="de-DE"/>
+          <w14:ligatures w14:val="none"/>
+        </w:rPr>
+      </w:pPr>
+    </w:p>
+    <w:p>
+      <w:pPr>
+        <w:spacing w:before="100" w:beforeAutospacing="1" w:after="100" w:afterAutospacing="1" w:line="240" w:lineRule="auto"/>
+        <w:rPr>
+          <w:rFonts w:ascii="Lucida Sans Unicode" w:eastAsia="Times New Roman" w:hAnsi="Lucida Sans Unicode" w:cs="Lucida Sans Unicode"/>
+          <w:noProof w:val="0"/>
+          <w:kern w:val="0"/>
+          <w:sz w:val="22"/>
+          <w:szCs w:val="22"/>
+          <w:lang w:val="de-DE" w:eastAsia="de-DE"/>
+          <w14:ligatures w14:val="none"/>
+        </w:rPr>
+      </w:pPr>
+      <w:r>
+        <w:rPr>
+          <w:rFonts w:ascii="Lucida Sans Unicode" w:eastAsia="Times New Roman" w:hAnsi="Lucida Sans Unicode" w:cs="Lucida Sans Unicode"/>
+          <w:noProof w:val="0"/>
+          <w:kern w:val="0"/>
+          <w:sz w:val="22"/>
+          <w:szCs w:val="22"/>
+          <w:lang w:val="de-DE" w:eastAsia="de-DE"/>
+          <w14:ligatures w14:val="none"/>
+        </w:rPr>
+        <w:t>Ort, Datum, Unterschrift</w:t>
+      </w:r>
+    </w:p>
+    <w:p>
+      <w:pPr>
+        <w:spacing w:line="360" w:lineRule="auto"/>
+        <w:rPr>
+          <w:rFonts w:ascii="Lucida Sans Unicode" w:hAnsi="Lucida Sans Unicode" w:cs="Lucida Sans Unicode"/>
+          <w:sz w:val="22"/>
+          <w:szCs w:val="22"/>
+        </w:rPr>
+      </w:pPr>
+    </w:p>
+    <w:p>
+      <w:pPr>
+        <w:spacing w:before="100" w:beforeAutospacing="1" w:after="100" w:afterAutospacing="1" w:line="240" w:lineRule="auto"/>
+        <w:rPr>
+          <w:rFonts w:ascii="Lucida Sans Unicode" w:eastAsia="Times New Roman" w:hAnsi="Lucida Sans Unicode" w:cs="Lucida Sans Unicode"/>
+          <w:noProof w:val="0"/>
+          <w:kern w:val="0"/>
+          <w:sz w:val="22"/>
+          <w:szCs w:val="22"/>
+          <w:lang w:val="de-DE" w:eastAsia="de-DE"/>
+          <w14:ligatures w14:val="none"/>
+        </w:rPr>
+      </w:pPr>
+    </w:p>
+    <w:p>
+      <w:pPr>
+        <w:spacing w:line="360" w:lineRule="auto"/>
+        <w:rPr>
+          <w:rFonts w:ascii="Lucida Sans Unicode" w:hAnsi="Lucida Sans Unicode" w:cs="Lucida Sans Unicode"/>
+          <w:b/>
+          <w:bCs/>
+          <w:sz w:val="22"/>
+          <w:szCs w:val="22"/>
+        </w:rPr>
+      </w:pPr>
+    </w:p>
+    <w:p>
+      <w:pPr>
+        <w:spacing w:line="360" w:lineRule="auto"/>
+        <w:rPr>
+          <w:rFonts w:ascii="Lucida Sans Unicode" w:hAnsi="Lucida Sans Unicode" w:cs="Lucida Sans Unicode"/>
+          <w:sz w:val="22"/>
+          <w:szCs w:val="22"/>
+        </w:rPr>
+      </w:pPr>
+    </w:p>
+    <w:p>
+      <w:pPr>
+        <w:spacing w:line="360" w:lineRule="auto"/>
+        <w:rPr>
+          <w:rFonts w:ascii="Lucida Sans Unicode" w:hAnsi="Lucida Sans Unicode" w:cs="Lucida Sans Unicode"/>
+          <w:sz w:val="22"/>
+          <w:szCs w:val="22"/>
+        </w:rPr>
+      </w:pPr>
+    </w:p>
     <w:sectPr>
-      <w:pgSz w:w="16838" w:h="11906" w:orient="landscape"/>
+      <w:pgSz w:w="11906" w:h="16838"/>
       <w:pgMar w:top="1418" w:right="1418" w:bottom="1418" w:left="1418" w:header="708" w:footer="708" w:gutter="0"/>
       <w:cols w:space="708"/>
       <w:docGrid w:linePitch="360"/>
@@ -12514,11 +16009,163 @@
       </w:rPr>
     </w:lvl>
   </w:abstractNum>
+  <w:abstractNum w:abstractNumId="2" w15:restartNumberingAfterBreak="0">
+    <w:nsid w:val="6B8D4642"/>
+    <w:multiLevelType w:val="multilevel"/>
+    <w:tmpl w:val="49B66106"/>
+    <w:lvl w:ilvl="0">
+      <w:start w:val="1"/>
+      <w:numFmt w:val="bullet"/>
+      <w:lvlText w:val=""/>
+      <w:lvlJc w:val="left"/>
+      <w:pPr>
+        <w:tabs>
+          <w:tab w:val="num" w:pos="720"/>
+        </w:tabs>
+        <w:ind w:left="720" w:hanging="360"/>
+      </w:pPr>
+      <w:rPr>
+        <w:rFonts w:ascii="Symbol" w:hAnsi="Symbol" w:hint="default"/>
+        <w:sz w:val="20"/>
+      </w:rPr>
+    </w:lvl>
+    <w:lvl w:ilvl="1" w:tentative="1">
+      <w:start w:val="1"/>
+      <w:numFmt w:val="bullet"/>
+      <w:lvlText w:val="o"/>
+      <w:lvlJc w:val="left"/>
+      <w:pPr>
+        <w:tabs>
+          <w:tab w:val="num" w:pos="1440"/>
+        </w:tabs>
+        <w:ind w:left="1440" w:hanging="360"/>
+      </w:pPr>
+      <w:rPr>
+        <w:rFonts w:ascii="Courier New" w:hAnsi="Courier New" w:hint="default"/>
+        <w:sz w:val="20"/>
+      </w:rPr>
+    </w:lvl>
+    <w:lvl w:ilvl="2" w:tentative="1">
+      <w:start w:val="1"/>
+      <w:numFmt w:val="bullet"/>
+      <w:lvlText w:val=""/>
+      <w:lvlJc w:val="left"/>
+      <w:pPr>
+        <w:tabs>
+          <w:tab w:val="num" w:pos="2160"/>
+        </w:tabs>
+        <w:ind w:left="2160" w:hanging="360"/>
+      </w:pPr>
+      <w:rPr>
+        <w:rFonts w:ascii="Wingdings" w:hAnsi="Wingdings" w:hint="default"/>
+        <w:sz w:val="20"/>
+      </w:rPr>
+    </w:lvl>
+    <w:lvl w:ilvl="3" w:tentative="1">
+      <w:start w:val="1"/>
+      <w:numFmt w:val="bullet"/>
+      <w:lvlText w:val=""/>
+      <w:lvlJc w:val="left"/>
+      <w:pPr>
+        <w:tabs>
+          <w:tab w:val="num" w:pos="2880"/>
+        </w:tabs>
+        <w:ind w:left="2880" w:hanging="360"/>
+      </w:pPr>
+      <w:rPr>
+        <w:rFonts w:ascii="Wingdings" w:hAnsi="Wingdings" w:hint="default"/>
+        <w:sz w:val="20"/>
+      </w:rPr>
+    </w:lvl>
+    <w:lvl w:ilvl="4" w:tentative="1">
+      <w:start w:val="1"/>
+      <w:numFmt w:val="bullet"/>
+      <w:lvlText w:val=""/>
+      <w:lvlJc w:val="left"/>
+      <w:pPr>
+        <w:tabs>
+          <w:tab w:val="num" w:pos="3600"/>
+        </w:tabs>
+        <w:ind w:left="3600" w:hanging="360"/>
+      </w:pPr>
+      <w:rPr>
+        <w:rFonts w:ascii="Wingdings" w:hAnsi="Wingdings" w:hint="default"/>
+        <w:sz w:val="20"/>
+      </w:rPr>
+    </w:lvl>
+    <w:lvl w:ilvl="5" w:tentative="1">
+      <w:start w:val="1"/>
+      <w:numFmt w:val="bullet"/>
+      <w:lvlText w:val=""/>
+      <w:lvlJc w:val="left"/>
+      <w:pPr>
+        <w:tabs>
+          <w:tab w:val="num" w:pos="4320"/>
+        </w:tabs>
+        <w:ind w:left="4320" w:hanging="360"/>
+      </w:pPr>
+      <w:rPr>
+        <w:rFonts w:ascii="Wingdings" w:hAnsi="Wingdings" w:hint="default"/>
+        <w:sz w:val="20"/>
+      </w:rPr>
+    </w:lvl>
+    <w:lvl w:ilvl="6" w:tentative="1">
+      <w:start w:val="1"/>
+      <w:numFmt w:val="bullet"/>
+      <w:lvlText w:val=""/>
+      <w:lvlJc w:val="left"/>
+      <w:pPr>
+        <w:tabs>
+          <w:tab w:val="num" w:pos="5040"/>
+        </w:tabs>
+        <w:ind w:left="5040" w:hanging="360"/>
+      </w:pPr>
+      <w:rPr>
+        <w:rFonts w:ascii="Wingdings" w:hAnsi="Wingdings" w:hint="default"/>
+        <w:sz w:val="20"/>
+      </w:rPr>
+    </w:lvl>
+    <w:lvl w:ilvl="7" w:tentative="1">
+      <w:start w:val="1"/>
+      <w:numFmt w:val="bullet"/>
+      <w:lvlText w:val=""/>
+      <w:lvlJc w:val="left"/>
+      <w:pPr>
+        <w:tabs>
+          <w:tab w:val="num" w:pos="5760"/>
+        </w:tabs>
+        <w:ind w:left="5760" w:hanging="360"/>
+      </w:pPr>
+      <w:rPr>
+        <w:rFonts w:ascii="Wingdings" w:hAnsi="Wingdings" w:hint="default"/>
+        <w:sz w:val="20"/>
+      </w:rPr>
+    </w:lvl>
+    <w:lvl w:ilvl="8" w:tentative="1">
+      <w:start w:val="1"/>
+      <w:numFmt w:val="bullet"/>
+      <w:lvlText w:val=""/>
+      <w:lvlJc w:val="left"/>
+      <w:pPr>
+        <w:tabs>
+          <w:tab w:val="num" w:pos="6480"/>
+        </w:tabs>
+        <w:ind w:left="6480" w:hanging="360"/>
+      </w:pPr>
+      <w:rPr>
+        <w:rFonts w:ascii="Wingdings" w:hAnsi="Wingdings" w:hint="default"/>
+        <w:sz w:val="20"/>
+      </w:rPr>
+    </w:lvl>
+  </w:abstractNum>
   <w:num w:numId="1" w16cid:durableId="379594019">
     <w:abstractNumId w:val="0"/>
   </w:num>
   <w:num w:numId="2" w16cid:durableId="1692612397">
     <w:abstractNumId w:val="1"/>
+  </w:num>
+  <w:num w:numId="3" w16cid:durableId="1413429551">
+    <w:abstractNumId w:val="2"/>
   </w:num>
 </w:numbering>
 </file>
@@ -12955,7 +16602,6 @@
     <w:next w:val="Standard"/>
     <w:link w:val="berschrift2Zchn"/>
     <w:uiPriority w:val="9"/>
-    <w:semiHidden/>
     <w:unhideWhenUsed/>
     <w:qFormat/>
     <w:rsid w:val="00153F99"/>
@@ -13172,7 +16818,6 @@
     <w:basedOn w:val="Absatz-Standardschriftart"/>
     <w:link w:val="berschrift2"/>
     <w:uiPriority w:val="9"/>
-    <w:semiHidden/>
     <w:rsid w:val="00153F99"/>
     <w:rPr>
       <w:rFonts w:asciiTheme="majorHAnsi" w:eastAsiaTheme="majorEastAsia" w:hAnsiTheme="majorHAnsi" w:cstheme="majorBidi"/>

</xml_diff>